<commit_message>
LCSC part number added
</commit_message>
<xml_diff>
--- a/Measurements/Lab equipments.docx
+++ b/Measurements/Lab equipments.docx
@@ -1,6 +1,6 @@
 
 <file path=word/document.xml><?xml version="1.0" encoding="utf-8"?>
-<w:document xmlns:wpc="http://schemas.microsoft.com/office/word/2010/wordprocessingCanvas" xmlns:cx="http://schemas.microsoft.com/office/drawing/2014/chartex" xmlns:cx1="http://schemas.microsoft.com/office/drawing/2015/9/8/chartex" xmlns:cx2="http://schemas.microsoft.com/office/drawing/2015/10/21/chartex" xmlns:cx3="http://schemas.microsoft.com/office/drawing/2016/5/9/chartex" xmlns:cx4="http://schemas.microsoft.com/office/drawing/2016/5/10/chartex" xmlns:cx5="http://schemas.microsoft.com/office/drawing/2016/5/11/chartex" xmlns:cx6="http://schemas.microsoft.com/office/drawing/2016/5/12/chartex" xmlns:cx7="http://schemas.microsoft.com/office/drawing/2016/5/13/chartex" xmlns:cx8="http://schemas.microsoft.com/office/drawing/2016/5/14/chartex" xmlns:mc="http://schemas.openxmlformats.org/markup-compatibility/2006" xmlns:aink="http://schemas.microsoft.com/office/drawing/2016/ink" xmlns:am3d="http://schemas.microsoft.com/office/drawing/2017/model3d" xmlns:o="urn:schemas-microsoft-com:office:office" xmlns:oel="http://schemas.microsoft.com/office/2019/extlst" xmlns:r="http://schemas.openxmlformats.org/officeDocument/2006/relationships" xmlns:m="http://schemas.openxmlformats.org/officeDocument/2006/math" xmlns:v="urn:schemas-microsoft-com:vml" xmlns:wp14="http://schemas.microsoft.com/office/word/2010/wordprocessingDrawing" xmlns:wp="http://schemas.openxmlformats.org/drawingml/2006/wordprocessingDrawing" xmlns:w10="urn:schemas-microsoft-com:office:word" xmlns:w="http://schemas.openxmlformats.org/wordprocessingml/2006/main" xmlns:w14="http://schemas.microsoft.com/office/word/2010/wordml" xmlns:w15="http://schemas.microsoft.com/office/word/2012/wordml" xmlns:w16cex="http://schemas.microsoft.com/office/word/2018/wordml/cex" xmlns:w16cid="http://schemas.microsoft.com/office/word/2016/wordml/cid" xmlns:w16="http://schemas.microsoft.com/office/word/2018/wordml" xmlns:w16du="http://schemas.microsoft.com/office/word/2023/wordml/word16du" xmlns:w16sdtdh="http://schemas.microsoft.com/office/word/2020/wordml/sdtdatahash" xmlns:w16se="http://schemas.microsoft.com/office/word/2015/wordml/symex" xmlns:wpg="http://schemas.microsoft.com/office/word/2010/wordprocessingGroup" xmlns:wpi="http://schemas.microsoft.com/office/word/2010/wordprocessingInk" xmlns:wne="http://schemas.microsoft.com/office/word/2006/wordml" xmlns:wps="http://schemas.microsoft.com/office/word/2010/wordprocessingShape" mc:Ignorable="w14 w15 w16se w16cid w16 w16cex w16sdtdh w16du wp14">
+<w:document xmlns:wpc="http://schemas.microsoft.com/office/word/2010/wordprocessingCanvas" xmlns:cx="http://schemas.microsoft.com/office/drawing/2014/chartex" xmlns:cx1="http://schemas.microsoft.com/office/drawing/2015/9/8/chartex" xmlns:cx2="http://schemas.microsoft.com/office/drawing/2015/10/21/chartex" xmlns:cx3="http://schemas.microsoft.com/office/drawing/2016/5/9/chartex" xmlns:cx4="http://schemas.microsoft.com/office/drawing/2016/5/10/chartex" xmlns:cx5="http://schemas.microsoft.com/office/drawing/2016/5/11/chartex" xmlns:cx6="http://schemas.microsoft.com/office/drawing/2016/5/12/chartex" xmlns:cx7="http://schemas.microsoft.com/office/drawing/2016/5/13/chartex" xmlns:cx8="http://schemas.microsoft.com/office/drawing/2016/5/14/chartex" xmlns:mc="http://schemas.openxmlformats.org/markup-compatibility/2006" xmlns:aink="http://schemas.microsoft.com/office/drawing/2016/ink" xmlns:am3d="http://schemas.microsoft.com/office/drawing/2017/model3d" xmlns:o="urn:schemas-microsoft-com:office:office" xmlns:oel="http://schemas.microsoft.com/office/2019/extlst" xmlns:r="http://schemas.openxmlformats.org/officeDocument/2006/relationships" xmlns:m="http://schemas.openxmlformats.org/officeDocument/2006/math" xmlns:v="urn:schemas-microsoft-com:vml" xmlns:wp14="http://schemas.microsoft.com/office/word/2010/wordprocessingDrawing" xmlns:wp="http://schemas.openxmlformats.org/drawingml/2006/wordprocessingDrawing" xmlns:w10="urn:schemas-microsoft-com:office:word" xmlns:w="http://schemas.openxmlformats.org/wordprocessingml/2006/main" xmlns:w14="http://schemas.microsoft.com/office/word/2010/wordml" xmlns:w15="http://schemas.microsoft.com/office/word/2012/wordml" xmlns:w16cex="http://schemas.microsoft.com/office/word/2018/wordml/cex" xmlns:w16cid="http://schemas.microsoft.com/office/word/2016/wordml/cid" xmlns:w16="http://schemas.microsoft.com/office/word/2018/wordml" xmlns:w16du="http://schemas.microsoft.com/office/word/2023/wordml/word16du" xmlns:w16sdtdh="http://schemas.microsoft.com/office/word/2020/wordml/sdtdatahash" xmlns:w16sdtfl="http://schemas.microsoft.com/office/word/2024/wordml/sdtformatlock" xmlns:w16se="http://schemas.microsoft.com/office/word/2015/wordml/symex" xmlns:wpg="http://schemas.microsoft.com/office/word/2010/wordprocessingGroup" xmlns:wpi="http://schemas.microsoft.com/office/word/2010/wordprocessingInk" xmlns:wne="http://schemas.microsoft.com/office/word/2006/wordml" xmlns:wps="http://schemas.microsoft.com/office/word/2010/wordprocessingShape" mc:Ignorable="w14 w15 w16se w16cid w16 w16cex w16sdtdh w16sdtfl w16du wp14">
   <w:body>
     <w:p>
       <w:pPr>
@@ -418,7 +418,21 @@
         <w:rPr>
           <w:rFonts w:ascii="Source Sans Pro" w:hAnsi="Source Sans Pro"/>
         </w:rPr>
-        <w:t xml:space="preserve"> injects differential-mode noise to test the diff. </w:t>
+        <w:t xml:space="preserve"> injects differential-mode noise to test the </w:t>
+      </w:r>
+      <w:proofErr w:type="gramStart"/>
+      <w:r>
+        <w:rPr>
+          <w:rFonts w:ascii="Source Sans Pro" w:hAnsi="Source Sans Pro"/>
+        </w:rPr>
+        <w:t>diff</w:t>
+      </w:r>
+      <w:proofErr w:type="gramEnd"/>
+      <w:r>
+        <w:rPr>
+          <w:rFonts w:ascii="Source Sans Pro" w:hAnsi="Source Sans Pro"/>
+        </w:rPr>
+        <w:t xml:space="preserve">. </w:t>
       </w:r>
       <w:proofErr w:type="spellStart"/>
       <w:r>
@@ -518,21 +532,7 @@
         <w:rPr>
           <w:rFonts w:ascii="Source Sans Pro" w:hAnsi="Source Sans Pro"/>
         </w:rPr>
-        <w:t xml:space="preserve">, provides isolation from high voltage transients, ground loops. </w:t>
-      </w:r>
-      <w:proofErr w:type="spellStart"/>
-      <w:r>
-        <w:rPr>
-          <w:rFonts w:ascii="Source Sans Pro" w:hAnsi="Source Sans Pro"/>
-        </w:rPr>
-        <w:t>Maintins</w:t>
-      </w:r>
-      <w:proofErr w:type="spellEnd"/>
-      <w:r>
-        <w:rPr>
-          <w:rFonts w:ascii="Source Sans Pro" w:hAnsi="Source Sans Pro"/>
-        </w:rPr>
-        <w:t xml:space="preserve"> signal integrity by minimizing common mode noise.</w:t>
+        <w:t>, provides isolation from high voltage transients, ground loops. Maintins signal integrity by minimizing common mode noise.</w:t>
       </w:r>
       <w:r>
         <w:rPr>
@@ -1321,7 +1321,21 @@
         <w:rPr>
           <w:rFonts w:ascii="Source Sans Pro" w:hAnsi="Source Sans Pro"/>
         </w:rPr>
-        <w:t xml:space="preserve"> R2 and R5 resistors. Upon comparison, decided to remove them (replaced with 0 ohm resistors</w:t>
+        <w:t xml:space="preserve"> R2 and R5 resistors. Upon comparison, </w:t>
+      </w:r>
+      <w:proofErr w:type="gramStart"/>
+      <w:r>
+        <w:rPr>
+          <w:rFonts w:ascii="Source Sans Pro" w:hAnsi="Source Sans Pro"/>
+        </w:rPr>
+        <w:t>decided</w:t>
+      </w:r>
+      <w:proofErr w:type="gramEnd"/>
+      <w:r>
+        <w:rPr>
+          <w:rFonts w:ascii="Source Sans Pro" w:hAnsi="Source Sans Pro"/>
+        </w:rPr>
+        <w:t xml:space="preserve"> to remove them (replaced with 0 ohm resistors</w:t>
       </w:r>
       <w:proofErr w:type="gramStart"/>
       <w:r>
@@ -3123,6 +3137,36 @@
         </w:rPr>
         <w:t xml:space="preserve"> replaced by THS4521 -&gt; has lower BW, around 100 MHz</w:t>
       </w:r>
+      <w:r>
+        <w:rPr>
+          <w:rFonts w:ascii="Source Sans Pro" w:hAnsi="Source Sans Pro"/>
+        </w:rPr>
+        <w:t xml:space="preserve"> -&gt; no difference with gain impedance compared to other phases. </w:t>
+      </w:r>
+      <w:r>
+        <w:rPr>
+          <w:rFonts w:ascii="Source Sans Pro" w:hAnsi="Source Sans Pro"/>
+        </w:rPr>
+        <w:t xml:space="preserve">Internal </w:t>
+      </w:r>
+      <w:r>
+        <w:rPr>
+          <w:rFonts w:ascii="Source Sans Pro" w:hAnsi="Source Sans Pro"/>
+        </w:rPr>
+        <w:t>V</w:t>
+      </w:r>
+      <w:r>
+        <w:rPr>
+          <w:rFonts w:ascii="Source Sans Pro" w:hAnsi="Source Sans Pro"/>
+        </w:rPr>
+        <w:t>_</w:t>
+      </w:r>
+      <w:r>
+        <w:rPr>
+          <w:rFonts w:ascii="Source Sans Pro" w:hAnsi="Source Sans Pro"/>
+        </w:rPr>
+        <w:t>OCM was still measured to be 2.46V, not 2.5V.</w:t>
+      </w:r>
     </w:p>
     <w:p>
       <w:pPr>
@@ -3136,6 +3180,213 @@
           <w:rFonts w:ascii="Source Sans Pro" w:hAnsi="Source Sans Pro"/>
         </w:rPr>
         <w:t>Phase C: untouched</w:t>
+      </w:r>
+    </w:p>
+    <w:p>
+      <w:pPr>
+        <w:jc w:val="both"/>
+        <w:rPr>
+          <w:rFonts w:ascii="Source Sans Pro" w:hAnsi="Source Sans Pro"/>
+        </w:rPr>
+      </w:pPr>
+    </w:p>
+    <w:p>
+      <w:pPr>
+        <w:jc w:val="both"/>
+        <w:rPr>
+          <w:rFonts w:ascii="Source Sans Pro" w:hAnsi="Source Sans Pro"/>
+        </w:rPr>
+      </w:pPr>
+      <w:r>
+        <w:rPr>
+          <w:rFonts w:ascii="Source Sans Pro" w:hAnsi="Source Sans Pro"/>
+        </w:rPr>
+        <w:t xml:space="preserve">After measuring the impedance of the current sensor alone, an unexpected behavior is observed. The input current </w:t>
+      </w:r>
+      <w:proofErr w:type="spellStart"/>
+      <w:r>
+        <w:rPr>
+          <w:rFonts w:ascii="Source Sans Pro" w:hAnsi="Source Sans Pro"/>
+        </w:rPr>
+        <w:t>I_rms</w:t>
+      </w:r>
+      <w:proofErr w:type="spellEnd"/>
+      <w:r>
+        <w:rPr>
+          <w:rFonts w:ascii="Source Sans Pro" w:hAnsi="Source Sans Pro"/>
+        </w:rPr>
+        <w:t xml:space="preserve"> is around 7A, which is sufficient. Until 500 Hz, the impedance is quite stable around 25 </w:t>
+      </w:r>
+      <w:proofErr w:type="spellStart"/>
+      <w:r>
+        <w:rPr>
+          <w:rFonts w:ascii="Source Sans Pro" w:hAnsi="Source Sans Pro"/>
+        </w:rPr>
+        <w:t>mOhm</w:t>
+      </w:r>
+      <w:proofErr w:type="spellEnd"/>
+      <w:r>
+        <w:rPr>
+          <w:rFonts w:ascii="Source Sans Pro" w:hAnsi="Source Sans Pro"/>
+        </w:rPr>
+        <w:t>, which is expected. Beyond this, the impedance drops significantly. The reason is not clear and therefore the manufacturer (</w:t>
+      </w:r>
+      <w:proofErr w:type="spellStart"/>
+      <w:r>
+        <w:rPr>
+          <w:rFonts w:ascii="Source Sans Pro" w:hAnsi="Source Sans Pro"/>
+        </w:rPr>
+        <w:t>Sensitec</w:t>
+      </w:r>
+      <w:proofErr w:type="spellEnd"/>
+      <w:r>
+        <w:rPr>
+          <w:rFonts w:ascii="Source Sans Pro" w:hAnsi="Source Sans Pro"/>
+        </w:rPr>
+        <w:t xml:space="preserve">) is contacted. Since maximum of 30 Amperes is targeted, we might go with </w:t>
+      </w:r>
+      <w:proofErr w:type="gramStart"/>
+      <w:r>
+        <w:rPr>
+          <w:rFonts w:ascii="Source Sans Pro" w:hAnsi="Source Sans Pro"/>
+        </w:rPr>
+        <w:t>lower</w:t>
+      </w:r>
+      <w:proofErr w:type="gramEnd"/>
+      <w:r>
+        <w:rPr>
+          <w:rFonts w:ascii="Source Sans Pro" w:hAnsi="Source Sans Pro"/>
+        </w:rPr>
+        <w:t xml:space="preserve"> rated current sensor, LEM.</w:t>
+      </w:r>
+    </w:p>
+    <w:p>
+      <w:pPr>
+        <w:jc w:val="both"/>
+        <w:rPr>
+          <w:rFonts w:ascii="Source Sans Pro" w:hAnsi="Source Sans Pro"/>
+        </w:rPr>
+      </w:pPr>
+      <w:r>
+        <w:rPr>
+          <w:rFonts w:ascii="Source Sans Pro" w:hAnsi="Source Sans Pro"/>
+        </w:rPr>
+        <w:t xml:space="preserve">As a result, new </w:t>
+      </w:r>
+      <w:proofErr w:type="spellStart"/>
+      <w:r>
+        <w:rPr>
+          <w:rFonts w:ascii="Source Sans Pro" w:hAnsi="Source Sans Pro"/>
+        </w:rPr>
+        <w:t>pcb</w:t>
+      </w:r>
+      <w:proofErr w:type="spellEnd"/>
+      <w:r>
+        <w:rPr>
+          <w:rFonts w:ascii="Source Sans Pro" w:hAnsi="Source Sans Pro"/>
+        </w:rPr>
+        <w:t xml:space="preserve"> is designed to improve things. </w:t>
+      </w:r>
+    </w:p>
+    <w:p>
+      <w:pPr>
+        <w:pStyle w:val="ListParagraph"/>
+        <w:numPr>
+          <w:ilvl w:val="0"/>
+          <w:numId w:val="8"/>
+        </w:numPr>
+        <w:jc w:val="both"/>
+        <w:rPr>
+          <w:rFonts w:ascii="Source Sans Pro" w:hAnsi="Source Sans Pro"/>
+        </w:rPr>
+      </w:pPr>
+      <w:r>
+        <w:rPr>
+          <w:rFonts w:ascii="Source Sans Pro" w:hAnsi="Source Sans Pro"/>
+        </w:rPr>
+        <w:t xml:space="preserve">LDO 24V-&gt;5V is removed. The voltage is step down from 24V to 6.5V, then to 5.2V. As a result, VCC of 5.2V is used for current </w:t>
+      </w:r>
+      <w:proofErr w:type="gramStart"/>
+      <w:r>
+        <w:rPr>
+          <w:rFonts w:ascii="Source Sans Pro" w:hAnsi="Source Sans Pro"/>
+        </w:rPr>
+        <w:t>sensor</w:t>
+      </w:r>
+      <w:proofErr w:type="gramEnd"/>
+      <w:r>
+        <w:rPr>
+          <w:rFonts w:ascii="Source Sans Pro" w:hAnsi="Source Sans Pro"/>
+        </w:rPr>
+        <w:t xml:space="preserve"> and diff. </w:t>
+      </w:r>
+      <w:proofErr w:type="spellStart"/>
+      <w:r>
+        <w:rPr>
+          <w:rFonts w:ascii="Source Sans Pro" w:hAnsi="Source Sans Pro"/>
+        </w:rPr>
+        <w:t>OpAmp</w:t>
+      </w:r>
+      <w:proofErr w:type="spellEnd"/>
+      <w:r>
+        <w:rPr>
+          <w:rFonts w:ascii="Source Sans Pro" w:hAnsi="Source Sans Pro"/>
+        </w:rPr>
+        <w:t xml:space="preserve"> supply voltage. </w:t>
+      </w:r>
+      <w:proofErr w:type="gramStart"/>
+      <w:r>
+        <w:rPr>
+          <w:rFonts w:ascii="Source Sans Pro" w:hAnsi="Source Sans Pro"/>
+        </w:rPr>
+        <w:t>Reason</w:t>
+      </w:r>
+      <w:proofErr w:type="gramEnd"/>
+      <w:r>
+        <w:rPr>
+          <w:rFonts w:ascii="Source Sans Pro" w:hAnsi="Source Sans Pro"/>
+        </w:rPr>
+        <w:t xml:space="preserve"> is that we have fully rail-to-rail signal</w:t>
+      </w:r>
+      <w:r>
+        <w:rPr>
+          <w:rFonts w:ascii="Source Sans Pro" w:hAnsi="Source Sans Pro"/>
+        </w:rPr>
+        <w:t>, to achieve fully the -+ 5V range at the output.</w:t>
+      </w:r>
+      <w:r>
+        <w:rPr>
+          <w:rFonts w:ascii="Source Sans Pro" w:hAnsi="Source Sans Pro"/>
+        </w:rPr>
+        <w:t xml:space="preserve"> Additionally, 2.5V voltage reference is implemented. </w:t>
+      </w:r>
+      <w:proofErr w:type="spellStart"/>
+      <w:r>
+        <w:rPr>
+          <w:rFonts w:ascii="Source Sans Pro" w:hAnsi="Source Sans Pro"/>
+        </w:rPr>
+        <w:t>Ultra high</w:t>
+      </w:r>
+      <w:proofErr w:type="spellEnd"/>
+      <w:r>
+        <w:rPr>
+          <w:rFonts w:ascii="Source Sans Pro" w:hAnsi="Source Sans Pro"/>
+        </w:rPr>
+        <w:t xml:space="preserve"> precision fixed 2.5V is used for Common mode voltage of the </w:t>
+      </w:r>
+      <w:proofErr w:type="spellStart"/>
+      <w:r>
+        <w:rPr>
+          <w:rFonts w:ascii="Source Sans Pro" w:hAnsi="Source Sans Pro"/>
+        </w:rPr>
+        <w:t>opamp</w:t>
+      </w:r>
+      <w:proofErr w:type="spellEnd"/>
+      <w:r>
+        <w:rPr>
+          <w:rFonts w:ascii="Source Sans Pro" w:hAnsi="Source Sans Pro"/>
+        </w:rPr>
+        <w:t xml:space="preserve">.  </w:t>
       </w:r>
     </w:p>
     <w:sectPr>
@@ -3149,7 +3400,7 @@
 </file>
 
 <file path=word/numbering.xml><?xml version="1.0" encoding="utf-8"?>
-<w:numbering xmlns:wpc="http://schemas.microsoft.com/office/word/2010/wordprocessingCanvas" xmlns:cx="http://schemas.microsoft.com/office/drawing/2014/chartex" xmlns:cx1="http://schemas.microsoft.com/office/drawing/2015/9/8/chartex" xmlns:cx2="http://schemas.microsoft.com/office/drawing/2015/10/21/chartex" xmlns:cx3="http://schemas.microsoft.com/office/drawing/2016/5/9/chartex" xmlns:cx4="http://schemas.microsoft.com/office/drawing/2016/5/10/chartex" xmlns:cx5="http://schemas.microsoft.com/office/drawing/2016/5/11/chartex" xmlns:cx6="http://schemas.microsoft.com/office/drawing/2016/5/12/chartex" xmlns:cx7="http://schemas.microsoft.com/office/drawing/2016/5/13/chartex" xmlns:cx8="http://schemas.microsoft.com/office/drawing/2016/5/14/chartex" xmlns:mc="http://schemas.openxmlformats.org/markup-compatibility/2006" xmlns:aink="http://schemas.microsoft.com/office/drawing/2016/ink" xmlns:am3d="http://schemas.microsoft.com/office/drawing/2017/model3d" xmlns:o="urn:schemas-microsoft-com:office:office" xmlns:oel="http://schemas.microsoft.com/office/2019/extlst" xmlns:r="http://schemas.openxmlformats.org/officeDocument/2006/relationships" xmlns:m="http://schemas.openxmlformats.org/officeDocument/2006/math" xmlns:v="urn:schemas-microsoft-com:vml" xmlns:wp14="http://schemas.microsoft.com/office/word/2010/wordprocessingDrawing" xmlns:wp="http://schemas.openxmlformats.org/drawingml/2006/wordprocessingDrawing" xmlns:w10="urn:schemas-microsoft-com:office:word" xmlns:w="http://schemas.openxmlformats.org/wordprocessingml/2006/main" xmlns:w14="http://schemas.microsoft.com/office/word/2010/wordml" xmlns:w15="http://schemas.microsoft.com/office/word/2012/wordml" xmlns:w16cex="http://schemas.microsoft.com/office/word/2018/wordml/cex" xmlns:w16cid="http://schemas.microsoft.com/office/word/2016/wordml/cid" xmlns:w16="http://schemas.microsoft.com/office/word/2018/wordml" xmlns:w16du="http://schemas.microsoft.com/office/word/2023/wordml/word16du" xmlns:w16sdtdh="http://schemas.microsoft.com/office/word/2020/wordml/sdtdatahash" xmlns:w16se="http://schemas.microsoft.com/office/word/2015/wordml/symex" xmlns:wpg="http://schemas.microsoft.com/office/word/2010/wordprocessingGroup" xmlns:wpi="http://schemas.microsoft.com/office/word/2010/wordprocessingInk" xmlns:wne="http://schemas.microsoft.com/office/word/2006/wordml" xmlns:wps="http://schemas.microsoft.com/office/word/2010/wordprocessingShape" mc:Ignorable="w14 w15 w16se w16cid w16 w16cex w16sdtdh w16du wp14">
+<w:numbering xmlns:wpc="http://schemas.microsoft.com/office/word/2010/wordprocessingCanvas" xmlns:cx="http://schemas.microsoft.com/office/drawing/2014/chartex" xmlns:cx1="http://schemas.microsoft.com/office/drawing/2015/9/8/chartex" xmlns:cx2="http://schemas.microsoft.com/office/drawing/2015/10/21/chartex" xmlns:cx3="http://schemas.microsoft.com/office/drawing/2016/5/9/chartex" xmlns:cx4="http://schemas.microsoft.com/office/drawing/2016/5/10/chartex" xmlns:cx5="http://schemas.microsoft.com/office/drawing/2016/5/11/chartex" xmlns:cx6="http://schemas.microsoft.com/office/drawing/2016/5/12/chartex" xmlns:cx7="http://schemas.microsoft.com/office/drawing/2016/5/13/chartex" xmlns:cx8="http://schemas.microsoft.com/office/drawing/2016/5/14/chartex" xmlns:mc="http://schemas.openxmlformats.org/markup-compatibility/2006" xmlns:aink="http://schemas.microsoft.com/office/drawing/2016/ink" xmlns:am3d="http://schemas.microsoft.com/office/drawing/2017/model3d" xmlns:o="urn:schemas-microsoft-com:office:office" xmlns:oel="http://schemas.microsoft.com/office/2019/extlst" xmlns:r="http://schemas.openxmlformats.org/officeDocument/2006/relationships" xmlns:m="http://schemas.openxmlformats.org/officeDocument/2006/math" xmlns:v="urn:schemas-microsoft-com:vml" xmlns:wp14="http://schemas.microsoft.com/office/word/2010/wordprocessingDrawing" xmlns:wp="http://schemas.openxmlformats.org/drawingml/2006/wordprocessingDrawing" xmlns:w10="urn:schemas-microsoft-com:office:word" xmlns:w="http://schemas.openxmlformats.org/wordprocessingml/2006/main" xmlns:w14="http://schemas.microsoft.com/office/word/2010/wordml" xmlns:w15="http://schemas.microsoft.com/office/word/2012/wordml" xmlns:w16cex="http://schemas.microsoft.com/office/word/2018/wordml/cex" xmlns:w16cid="http://schemas.microsoft.com/office/word/2016/wordml/cid" xmlns:w16="http://schemas.microsoft.com/office/word/2018/wordml" xmlns:w16du="http://schemas.microsoft.com/office/word/2023/wordml/word16du" xmlns:w16sdtdh="http://schemas.microsoft.com/office/word/2020/wordml/sdtdatahash" xmlns:w16sdtfl="http://schemas.microsoft.com/office/word/2024/wordml/sdtformatlock" xmlns:w16se="http://schemas.microsoft.com/office/word/2015/wordml/symex" xmlns:wpg="http://schemas.microsoft.com/office/word/2010/wordprocessingGroup" xmlns:wpi="http://schemas.microsoft.com/office/word/2010/wordprocessingInk" xmlns:wne="http://schemas.microsoft.com/office/word/2006/wordml" xmlns:wps="http://schemas.microsoft.com/office/word/2010/wordprocessingShape" mc:Ignorable="w14 w15 w16se w16cid w16 w16cex w16sdtdh w16sdtfl w16du wp14">
   <w:abstractNum w:abstractNumId="0" w15:restartNumberingAfterBreak="0">
     <w:nsid w:val="12241A38"/>
     <w:multiLevelType w:val="multilevel"/>
@@ -3710,6 +3961,95 @@
     </w:lvl>
   </w:abstractNum>
   <w:abstractNum w:abstractNumId="5" w15:restartNumberingAfterBreak="0">
+    <w:nsid w:val="3B0D12F0"/>
+    <w:multiLevelType w:val="hybridMultilevel"/>
+    <w:tmpl w:val="03E83238"/>
+    <w:lvl w:ilvl="0" w:tplc="20000011">
+      <w:start w:val="1"/>
+      <w:numFmt w:val="decimal"/>
+      <w:lvlText w:val="%1)"/>
+      <w:lvlJc w:val="left"/>
+      <w:pPr>
+        <w:ind w:left="720" w:hanging="360"/>
+      </w:pPr>
+      <w:rPr>
+        <w:rFonts w:hint="default"/>
+      </w:rPr>
+    </w:lvl>
+    <w:lvl w:ilvl="1" w:tplc="20000019" w:tentative="1">
+      <w:start w:val="1"/>
+      <w:numFmt w:val="lowerLetter"/>
+      <w:lvlText w:val="%2."/>
+      <w:lvlJc w:val="left"/>
+      <w:pPr>
+        <w:ind w:left="1440" w:hanging="360"/>
+      </w:pPr>
+    </w:lvl>
+    <w:lvl w:ilvl="2" w:tplc="2000001B" w:tentative="1">
+      <w:start w:val="1"/>
+      <w:numFmt w:val="lowerRoman"/>
+      <w:lvlText w:val="%3."/>
+      <w:lvlJc w:val="right"/>
+      <w:pPr>
+        <w:ind w:left="2160" w:hanging="180"/>
+      </w:pPr>
+    </w:lvl>
+    <w:lvl w:ilvl="3" w:tplc="2000000F" w:tentative="1">
+      <w:start w:val="1"/>
+      <w:numFmt w:val="decimal"/>
+      <w:lvlText w:val="%4."/>
+      <w:lvlJc w:val="left"/>
+      <w:pPr>
+        <w:ind w:left="2880" w:hanging="360"/>
+      </w:pPr>
+    </w:lvl>
+    <w:lvl w:ilvl="4" w:tplc="20000019" w:tentative="1">
+      <w:start w:val="1"/>
+      <w:numFmt w:val="lowerLetter"/>
+      <w:lvlText w:val="%5."/>
+      <w:lvlJc w:val="left"/>
+      <w:pPr>
+        <w:ind w:left="3600" w:hanging="360"/>
+      </w:pPr>
+    </w:lvl>
+    <w:lvl w:ilvl="5" w:tplc="2000001B" w:tentative="1">
+      <w:start w:val="1"/>
+      <w:numFmt w:val="lowerRoman"/>
+      <w:lvlText w:val="%6."/>
+      <w:lvlJc w:val="right"/>
+      <w:pPr>
+        <w:ind w:left="4320" w:hanging="180"/>
+      </w:pPr>
+    </w:lvl>
+    <w:lvl w:ilvl="6" w:tplc="2000000F" w:tentative="1">
+      <w:start w:val="1"/>
+      <w:numFmt w:val="decimal"/>
+      <w:lvlText w:val="%7."/>
+      <w:lvlJc w:val="left"/>
+      <w:pPr>
+        <w:ind w:left="5040" w:hanging="360"/>
+      </w:pPr>
+    </w:lvl>
+    <w:lvl w:ilvl="7" w:tplc="20000019" w:tentative="1">
+      <w:start w:val="1"/>
+      <w:numFmt w:val="lowerLetter"/>
+      <w:lvlText w:val="%8."/>
+      <w:lvlJc w:val="left"/>
+      <w:pPr>
+        <w:ind w:left="5760" w:hanging="360"/>
+      </w:pPr>
+    </w:lvl>
+    <w:lvl w:ilvl="8" w:tplc="2000001B" w:tentative="1">
+      <w:start w:val="1"/>
+      <w:numFmt w:val="lowerRoman"/>
+      <w:lvlText w:val="%9."/>
+      <w:lvlJc w:val="right"/>
+      <w:pPr>
+        <w:ind w:left="6480" w:hanging="180"/>
+      </w:pPr>
+    </w:lvl>
+  </w:abstractNum>
+  <w:abstractNum w:abstractNumId="6" w15:restartNumberingAfterBreak="0">
     <w:nsid w:val="50191653"/>
     <w:multiLevelType w:val="hybridMultilevel"/>
     <w:tmpl w:val="99B0A558"/>
@@ -3804,7 +4144,7 @@
       </w:pPr>
     </w:lvl>
   </w:abstractNum>
-  <w:abstractNum w:abstractNumId="6" w15:restartNumberingAfterBreak="0">
+  <w:abstractNum w:abstractNumId="7" w15:restartNumberingAfterBreak="0">
     <w:nsid w:val="68A26582"/>
     <w:multiLevelType w:val="hybridMultilevel"/>
     <w:tmpl w:val="BBCAB19E"/>
@@ -3924,7 +4264,7 @@
     <w:abstractNumId w:val="2"/>
   </w:num>
   <w:num w:numId="3" w16cid:durableId="558785050">
-    <w:abstractNumId w:val="6"/>
+    <w:abstractNumId w:val="7"/>
   </w:num>
   <w:num w:numId="4" w16cid:durableId="1888836547">
     <w:abstractNumId w:val="4"/>
@@ -3933,16 +4273,19 @@
     <w:abstractNumId w:val="0"/>
   </w:num>
   <w:num w:numId="6" w16cid:durableId="673150175">
-    <w:abstractNumId w:val="5"/>
+    <w:abstractNumId w:val="6"/>
   </w:num>
   <w:num w:numId="7" w16cid:durableId="395400798">
     <w:abstractNumId w:val="3"/>
+  </w:num>
+  <w:num w:numId="8" w16cid:durableId="2016761621">
+    <w:abstractNumId w:val="5"/>
   </w:num>
 </w:numbering>
 </file>
 
 <file path=word/styles.xml><?xml version="1.0" encoding="utf-8"?>
-<w:styles xmlns:mc="http://schemas.openxmlformats.org/markup-compatibility/2006" xmlns:r="http://schemas.openxmlformats.org/officeDocument/2006/relationships" xmlns:w="http://schemas.openxmlformats.org/wordprocessingml/2006/main" xmlns:w14="http://schemas.microsoft.com/office/word/2010/wordml" xmlns:w15="http://schemas.microsoft.com/office/word/2012/wordml" xmlns:w16cex="http://schemas.microsoft.com/office/word/2018/wordml/cex" xmlns:w16cid="http://schemas.microsoft.com/office/word/2016/wordml/cid" xmlns:w16="http://schemas.microsoft.com/office/word/2018/wordml" xmlns:w16du="http://schemas.microsoft.com/office/word/2023/wordml/word16du" xmlns:w16sdtdh="http://schemas.microsoft.com/office/word/2020/wordml/sdtdatahash" xmlns:w16se="http://schemas.microsoft.com/office/word/2015/wordml/symex" mc:Ignorable="w14 w15 w16se w16cid w16 w16cex w16sdtdh w16du">
+<w:styles xmlns:mc="http://schemas.openxmlformats.org/markup-compatibility/2006" xmlns:r="http://schemas.openxmlformats.org/officeDocument/2006/relationships" xmlns:w="http://schemas.openxmlformats.org/wordprocessingml/2006/main" xmlns:w14="http://schemas.microsoft.com/office/word/2010/wordml" xmlns:w15="http://schemas.microsoft.com/office/word/2012/wordml" xmlns:w16cex="http://schemas.microsoft.com/office/word/2018/wordml/cex" xmlns:w16cid="http://schemas.microsoft.com/office/word/2016/wordml/cid" xmlns:w16="http://schemas.microsoft.com/office/word/2018/wordml" xmlns:w16du="http://schemas.microsoft.com/office/word/2023/wordml/word16du" xmlns:w16sdtdh="http://schemas.microsoft.com/office/word/2020/wordml/sdtdatahash" xmlns:w16sdtfl="http://schemas.microsoft.com/office/word/2024/wordml/sdtformatlock" xmlns:w16se="http://schemas.microsoft.com/office/word/2015/wordml/symex" mc:Ignorable="w14 w15 w16se w16cid w16 w16cex w16sdtdh w16sdtfl w16du">
   <w:docDefaults>
     <w:rPrDefault>
       <w:rPr>

</xml_diff>

<commit_message>
pcb wider (110mm x 97mm) adjusted polygons carrying the current mainted symmetry
</commit_message>
<xml_diff>
--- a/Measurements/Lab equipments.docx
+++ b/Measurements/Lab equipments.docx
@@ -3386,8 +3386,208 @@
         <w:rPr>
           <w:rFonts w:ascii="Source Sans Pro" w:hAnsi="Source Sans Pro"/>
         </w:rPr>
-        <w:t xml:space="preserve">.  </w:t>
-      </w:r>
+        <w:t xml:space="preserve">. </w:t>
+      </w:r>
+    </w:p>
+    <w:p>
+      <w:pPr>
+        <w:pStyle w:val="ListParagraph"/>
+        <w:numPr>
+          <w:ilvl w:val="0"/>
+          <w:numId w:val="8"/>
+        </w:numPr>
+        <w:jc w:val="both"/>
+        <w:rPr>
+          <w:rFonts w:ascii="Source Sans Pro" w:hAnsi="Source Sans Pro"/>
+        </w:rPr>
+      </w:pPr>
+      <w:r>
+        <w:rPr>
+          <w:rFonts w:ascii="Source Sans Pro" w:hAnsi="Source Sans Pro"/>
+        </w:rPr>
+        <w:t xml:space="preserve">With 2 oz copper weight, minimum track width is 0.16 mm, according to JLCPCB capabilities. -&gt; Differential route width </w:t>
+      </w:r>
+      <w:proofErr w:type="gramStart"/>
+      <w:r>
+        <w:rPr>
+          <w:rFonts w:ascii="Source Sans Pro" w:hAnsi="Source Sans Pro"/>
+        </w:rPr>
+        <w:t>are</w:t>
+      </w:r>
+      <w:proofErr w:type="gramEnd"/>
+      <w:r>
+        <w:rPr>
+          <w:rFonts w:ascii="Source Sans Pro" w:hAnsi="Source Sans Pro"/>
+        </w:rPr>
+        <w:t xml:space="preserve"> adjusted.</w:t>
+      </w:r>
+    </w:p>
+    <w:p>
+      <w:pPr>
+        <w:pStyle w:val="ListParagraph"/>
+        <w:numPr>
+          <w:ilvl w:val="0"/>
+          <w:numId w:val="8"/>
+        </w:numPr>
+        <w:jc w:val="both"/>
+        <w:rPr>
+          <w:rFonts w:ascii="Source Sans Pro" w:hAnsi="Source Sans Pro"/>
+        </w:rPr>
+      </w:pPr>
+      <w:r>
+        <w:rPr>
+          <w:rFonts w:ascii="Source Sans Pro" w:hAnsi="Source Sans Pro"/>
+        </w:rPr>
+        <w:t xml:space="preserve">Increased layer number to 4 layers -&gt; more copper area for better current carrying </w:t>
+      </w:r>
+      <w:proofErr w:type="spellStart"/>
+      <w:r>
+        <w:rPr>
+          <w:rFonts w:ascii="Source Sans Pro" w:hAnsi="Source Sans Pro"/>
+        </w:rPr>
+        <w:t>capabillty</w:t>
+      </w:r>
+      <w:proofErr w:type="spellEnd"/>
+      <w:r>
+        <w:rPr>
+          <w:rFonts w:ascii="Source Sans Pro" w:hAnsi="Source Sans Pro"/>
+        </w:rPr>
+        <w:t xml:space="preserve"> with more </w:t>
+      </w:r>
+      <w:proofErr w:type="gramStart"/>
+      <w:r>
+        <w:rPr>
+          <w:rFonts w:ascii="Source Sans Pro" w:hAnsi="Source Sans Pro"/>
+        </w:rPr>
+        <w:t>cross section</w:t>
+      </w:r>
+      <w:proofErr w:type="gramEnd"/>
+      <w:r>
+        <w:rPr>
+          <w:rFonts w:ascii="Source Sans Pro" w:hAnsi="Source Sans Pro"/>
+        </w:rPr>
+        <w:t xml:space="preserve"> area, better cooling, lower thermal resistance and better thermal performance</w:t>
+      </w:r>
+    </w:p>
+    <w:p>
+      <w:pPr>
+        <w:pStyle w:val="ListParagraph"/>
+        <w:numPr>
+          <w:ilvl w:val="0"/>
+          <w:numId w:val="8"/>
+        </w:numPr>
+        <w:jc w:val="both"/>
+        <w:rPr>
+          <w:rFonts w:ascii="Source Sans Pro" w:hAnsi="Source Sans Pro"/>
+        </w:rPr>
+      </w:pPr>
+      <w:r>
+        <w:rPr>
+          <w:rFonts w:ascii="Source Sans Pro" w:hAnsi="Source Sans Pro"/>
+        </w:rPr>
+        <w:t xml:space="preserve">For input current carrying polygons between screw terminals and current transducer, the width is increased by also making the </w:t>
+      </w:r>
+      <w:proofErr w:type="spellStart"/>
+      <w:r>
+        <w:rPr>
+          <w:rFonts w:ascii="Source Sans Pro" w:hAnsi="Source Sans Pro"/>
+        </w:rPr>
+        <w:t>pcb</w:t>
+      </w:r>
+      <w:proofErr w:type="spellEnd"/>
+      <w:r>
+        <w:rPr>
+          <w:rFonts w:ascii="Source Sans Pro" w:hAnsi="Source Sans Pro"/>
+        </w:rPr>
+        <w:t xml:space="preserve"> wider to 11mm. Channels are spread evenly for symmetry and maximum trace width is achieved to be around 12mm for each trace here. For worst case, Input current can be up to 75A. </w:t>
+      </w:r>
+      <w:proofErr w:type="gramStart"/>
+      <w:r>
+        <w:rPr>
+          <w:rFonts w:ascii="Source Sans Pro" w:hAnsi="Source Sans Pro"/>
+        </w:rPr>
+        <w:t>there</w:t>
+      </w:r>
+      <w:proofErr w:type="gramEnd"/>
+      <w:r>
+        <w:rPr>
+          <w:rFonts w:ascii="Source Sans Pro" w:hAnsi="Source Sans Pro"/>
+        </w:rPr>
+        <w:t xml:space="preserve"> are 4 layers stacked on top of each other, with each copper thickness being 2, this result in a thickness of 8 oz/ft^2 for each trace. This </w:t>
+      </w:r>
+      <w:proofErr w:type="gramStart"/>
+      <w:r>
+        <w:rPr>
+          <w:rFonts w:ascii="Source Sans Pro" w:hAnsi="Source Sans Pro"/>
+        </w:rPr>
+        <w:t>result</w:t>
+      </w:r>
+      <w:proofErr w:type="gramEnd"/>
+      <w:r>
+        <w:rPr>
+          <w:rFonts w:ascii="Source Sans Pro" w:hAnsi="Source Sans Pro"/>
+        </w:rPr>
+        <w:t xml:space="preserve"> in an expected temperature rise of 35 °C when 75A passes through, using IPC-2221 curve fitting</w:t>
+      </w:r>
+    </w:p>
+    <w:p>
+      <w:pPr>
+        <w:pStyle w:val="ListParagraph"/>
+        <w:jc w:val="both"/>
+        <w:rPr>
+          <w:rFonts w:ascii="Source Sans Pro" w:hAnsi="Source Sans Pro"/>
+        </w:rPr>
+      </w:pPr>
+      <w:r>
+        <w:rPr>
+          <w:rFonts w:ascii="Source Sans Pro" w:hAnsi="Source Sans Pro"/>
+        </w:rPr>
+        <w:lastRenderedPageBreak/>
+        <w:drawing>
+          <wp:inline distT="0" distB="0" distL="0" distR="0" wp14:anchorId="560288A9" wp14:editId="3A418CC4">
+            <wp:extent cx="3150563" cy="3391411"/>
+            <wp:effectExtent l="0" t="0" r="0" b="0"/>
+            <wp:docPr id="1013336346" name="Picture 1" descr="A screenshot of a computer&#10;&#10;AI-generated content may be incorrect."/>
+            <wp:cNvGraphicFramePr>
+              <a:graphicFrameLocks xmlns:a="http://schemas.openxmlformats.org/drawingml/2006/main" noChangeAspect="1"/>
+            </wp:cNvGraphicFramePr>
+            <a:graphic xmlns:a="http://schemas.openxmlformats.org/drawingml/2006/main">
+              <a:graphicData uri="http://schemas.openxmlformats.org/drawingml/2006/picture">
+                <pic:pic xmlns:pic="http://schemas.openxmlformats.org/drawingml/2006/picture">
+                  <pic:nvPicPr>
+                    <pic:cNvPr id="1013336346" name="Picture 1" descr="A screenshot of a computer&#10;&#10;AI-generated content may be incorrect."/>
+                    <pic:cNvPicPr/>
+                  </pic:nvPicPr>
+                  <pic:blipFill>
+                    <a:blip r:embed="rId9"/>
+                    <a:stretch>
+                      <a:fillRect/>
+                    </a:stretch>
+                  </pic:blipFill>
+                  <pic:spPr>
+                    <a:xfrm>
+                      <a:off x="0" y="0"/>
+                      <a:ext cx="3158045" cy="3399465"/>
+                    </a:xfrm>
+                    <a:prstGeom prst="rect">
+                      <a:avLst/>
+                    </a:prstGeom>
+                  </pic:spPr>
+                </pic:pic>
+              </a:graphicData>
+            </a:graphic>
+          </wp:inline>
+        </w:drawing>
+      </w:r>
+    </w:p>
+    <w:p>
+      <w:pPr>
+        <w:ind w:left="360"/>
+        <w:jc w:val="both"/>
+        <w:rPr>
+          <w:rFonts w:ascii="Source Sans Pro" w:hAnsi="Source Sans Pro"/>
+        </w:rPr>
+      </w:pPr>
     </w:p>
     <w:sectPr>
       <w:pgSz w:w="11906" w:h="16838" w:code="9"/>
@@ -5229,6 +5429,20 @@
       </w:tblBorders>
     </w:tblPr>
   </w:style>
+  <w:style w:type="character" w:styleId="BookTitle">
+    <w:name w:val="Book Title"/>
+    <w:basedOn w:val="DefaultParagraphFont"/>
+    <w:uiPriority w:val="33"/>
+    <w:qFormat/>
+    <w:rsid w:val="00A82388"/>
+    <w:rPr>
+      <w:b/>
+      <w:bCs/>
+      <w:i/>
+      <w:iCs/>
+      <w:spacing w:val="5"/>
+    </w:rPr>
+  </w:style>
 </w:styles>
 </file>
 

</xml_diff>

<commit_message>
added dc measurements to newpcb excel sheet added some notes on lab equpments word doc
</commit_message>
<xml_diff>
--- a/Measurements/Lab equipments.docx
+++ b/Measurements/Lab equipments.docx
@@ -202,21 +202,7 @@
         <w:rPr>
           <w:rFonts w:ascii="Source Sans Pro" w:hAnsi="Source Sans Pro"/>
         </w:rPr>
-        <w:t xml:space="preserve"> voltages on the PCB by hand </w:t>
-      </w:r>
-      <w:proofErr w:type="gramStart"/>
-      <w:r>
-        <w:rPr>
-          <w:rFonts w:ascii="Source Sans Pro" w:hAnsi="Source Sans Pro"/>
-        </w:rPr>
-        <w:t>( yellow</w:t>
-      </w:r>
-      <w:proofErr w:type="gramEnd"/>
-      <w:r>
-        <w:rPr>
-          <w:rFonts w:ascii="Source Sans Pro" w:hAnsi="Source Sans Pro"/>
-        </w:rPr>
-        <w:t xml:space="preserve"> points)</w:t>
+        <w:t xml:space="preserve"> voltages on the PCB by hand ( yellow points)</w:t>
       </w:r>
     </w:p>
     <w:p>
@@ -310,16 +296,7 @@
           <w:b/>
           <w:bCs/>
         </w:rPr>
-        <w:t xml:space="preserve">Spitzenberger APS 1000 – CC </w:t>
-      </w:r>
-      <w:proofErr w:type="gramStart"/>
-      <w:r>
-        <w:rPr>
-          <w:rFonts w:ascii="Source Sans Pro" w:hAnsi="Source Sans Pro"/>
-          <w:b/>
-          <w:bCs/>
-        </w:rPr>
-        <w:t>mode</w:t>
+        <w:t>Spitzenberger APS 1000 – CC mode</w:t>
       </w:r>
       <w:r>
         <w:rPr>
@@ -331,14 +308,7 @@
         <w:rPr>
           <w:rFonts w:ascii="Source Sans Pro" w:hAnsi="Source Sans Pro"/>
         </w:rPr>
-        <w:t>:</w:t>
-      </w:r>
-      <w:proofErr w:type="gramEnd"/>
-      <w:r>
-        <w:rPr>
-          <w:rFonts w:ascii="Source Sans Pro" w:hAnsi="Source Sans Pro"/>
-        </w:rPr>
-        <w:t xml:space="preserve"> to a</w:t>
+        <w:t>: to a</w:t>
       </w:r>
       <w:r>
         <w:rPr>
@@ -362,21 +332,7 @@
         <w:rPr>
           <w:rFonts w:ascii="Source Sans Pro" w:hAnsi="Source Sans Pro"/>
         </w:rPr>
-        <w:t xml:space="preserve">. </w:t>
-      </w:r>
-      <w:proofErr w:type="gramStart"/>
-      <w:r>
-        <w:rPr>
-          <w:rFonts w:ascii="Source Sans Pro" w:hAnsi="Source Sans Pro"/>
-        </w:rPr>
-        <w:t>Therefore</w:t>
-      </w:r>
-      <w:proofErr w:type="gramEnd"/>
-      <w:r>
-        <w:rPr>
-          <w:rFonts w:ascii="Source Sans Pro" w:hAnsi="Source Sans Pro"/>
-        </w:rPr>
-        <w:t xml:space="preserve"> we achieve AC ripple current with varying frequencies and amplitudes in addition to DC current.</w:t>
+        <w:t>. Therefore we achieve AC ripple current with varying frequencies and amplitudes in addition to DC current.</w:t>
       </w:r>
     </w:p>
     <w:p>
@@ -396,43 +352,13 @@
           <w:b/>
           <w:bCs/>
         </w:rPr>
-        <w:t xml:space="preserve">Wideband Injection Transformer B-WIT </w:t>
-      </w:r>
-      <w:proofErr w:type="gramStart"/>
-      <w:r>
-        <w:rPr>
-          <w:rFonts w:ascii="Source Sans Pro" w:hAnsi="Source Sans Pro"/>
-          <w:b/>
-          <w:bCs/>
-        </w:rPr>
-        <w:t>100</w:t>
-      </w:r>
-      <w:r>
-        <w:rPr>
-          <w:rFonts w:ascii="Source Sans Pro" w:hAnsi="Source Sans Pro"/>
-        </w:rPr>
-        <w:t xml:space="preserve"> :</w:t>
-      </w:r>
-      <w:proofErr w:type="gramEnd"/>
-      <w:r>
-        <w:rPr>
-          <w:rFonts w:ascii="Source Sans Pro" w:hAnsi="Source Sans Pro"/>
-        </w:rPr>
-        <w:t xml:space="preserve"> injects differential-mode noise to test the </w:t>
-      </w:r>
-      <w:proofErr w:type="gramStart"/>
-      <w:r>
-        <w:rPr>
-          <w:rFonts w:ascii="Source Sans Pro" w:hAnsi="Source Sans Pro"/>
-        </w:rPr>
-        <w:t>diff</w:t>
-      </w:r>
-      <w:proofErr w:type="gramEnd"/>
-      <w:r>
-        <w:rPr>
-          <w:rFonts w:ascii="Source Sans Pro" w:hAnsi="Source Sans Pro"/>
-        </w:rPr>
-        <w:t xml:space="preserve">. </w:t>
+        <w:t>Wideband Injection Transformer B-WIT 100</w:t>
+      </w:r>
+      <w:r>
+        <w:rPr>
+          <w:rFonts w:ascii="Source Sans Pro" w:hAnsi="Source Sans Pro"/>
+        </w:rPr>
+        <w:t xml:space="preserve"> : injects differential-mode noise to test the diff. </w:t>
       </w:r>
       <w:proofErr w:type="spellStart"/>
       <w:r>
@@ -861,21 +787,7 @@
         <w:rPr>
           <w:rFonts w:ascii="Source Sans Pro" w:hAnsi="Source Sans Pro"/>
         </w:rPr>
-        <w:t xml:space="preserve">Vector Network Analyzer – Bode </w:t>
-      </w:r>
-      <w:proofErr w:type="gramStart"/>
-      <w:r>
-        <w:rPr>
-          <w:rFonts w:ascii="Source Sans Pro" w:hAnsi="Source Sans Pro"/>
-        </w:rPr>
-        <w:t>100 :</w:t>
-      </w:r>
-      <w:proofErr w:type="gramEnd"/>
-      <w:r>
-        <w:rPr>
-          <w:rFonts w:ascii="Source Sans Pro" w:hAnsi="Source Sans Pro"/>
-        </w:rPr>
-        <w:t xml:space="preserve"> </w:t>
+        <w:t xml:space="preserve">Vector Network Analyzer – Bode 100 : </w:t>
       </w:r>
       <w:r>
         <w:rPr>
@@ -1089,21 +1001,7 @@
         <w:rPr>
           <w:rFonts w:ascii="Source Sans Pro" w:hAnsi="Source Sans Pro"/>
         </w:rPr>
-        <w:t xml:space="preserve">Tektronix TBS 2000 Digital </w:t>
-      </w:r>
-      <w:proofErr w:type="gramStart"/>
-      <w:r>
-        <w:rPr>
-          <w:rFonts w:ascii="Source Sans Pro" w:hAnsi="Source Sans Pro"/>
-        </w:rPr>
-        <w:t>Oscilloscope :</w:t>
-      </w:r>
-      <w:proofErr w:type="gramEnd"/>
-      <w:r>
-        <w:rPr>
-          <w:rFonts w:ascii="Source Sans Pro" w:hAnsi="Source Sans Pro"/>
-        </w:rPr>
-        <w:t xml:space="preserve"> </w:t>
+        <w:t xml:space="preserve">Tektronix TBS 2000 Digital Oscilloscope : </w:t>
       </w:r>
     </w:p>
     <w:p>
@@ -1321,35 +1219,7 @@
         <w:rPr>
           <w:rFonts w:ascii="Source Sans Pro" w:hAnsi="Source Sans Pro"/>
         </w:rPr>
-        <w:t xml:space="preserve"> R2 and R5 resistors. Upon comparison, </w:t>
-      </w:r>
-      <w:proofErr w:type="gramStart"/>
-      <w:r>
-        <w:rPr>
-          <w:rFonts w:ascii="Source Sans Pro" w:hAnsi="Source Sans Pro"/>
-        </w:rPr>
-        <w:t>decided</w:t>
-      </w:r>
-      <w:proofErr w:type="gramEnd"/>
-      <w:r>
-        <w:rPr>
-          <w:rFonts w:ascii="Source Sans Pro" w:hAnsi="Source Sans Pro"/>
-        </w:rPr>
-        <w:t xml:space="preserve"> to remove them (replaced with 0 ohm resistors</w:t>
-      </w:r>
-      <w:proofErr w:type="gramStart"/>
-      <w:r>
-        <w:rPr>
-          <w:rFonts w:ascii="Source Sans Pro" w:hAnsi="Source Sans Pro"/>
-        </w:rPr>
-        <w:t>) .</w:t>
-      </w:r>
-      <w:proofErr w:type="gramEnd"/>
-      <w:r>
-        <w:rPr>
-          <w:rFonts w:ascii="Source Sans Pro" w:hAnsi="Source Sans Pro"/>
-        </w:rPr>
-        <w:t xml:space="preserve"> </w:t>
+        <w:t xml:space="preserve"> R2 and R5 resistors. Upon comparison, decided to remove them (replaced with 0 ohm resistors) . </w:t>
       </w:r>
       <w:r>
         <w:rPr>
@@ -1406,21 +1276,7 @@
         <w:rPr>
           <w:rFonts w:ascii="Source Sans Pro" w:hAnsi="Source Sans Pro"/>
         </w:rPr>
-        <w:t xml:space="preserve">- voltage rails to be -0.2V (LMM05) and +5.2V using switched regulator and </w:t>
-      </w:r>
-      <w:proofErr w:type="gramStart"/>
-      <w:r>
-        <w:rPr>
-          <w:rFonts w:ascii="Source Sans Pro" w:hAnsi="Source Sans Pro"/>
-        </w:rPr>
-        <w:t>a</w:t>
-      </w:r>
-      <w:proofErr w:type="gramEnd"/>
-      <w:r>
-        <w:rPr>
-          <w:rFonts w:ascii="Source Sans Pro" w:hAnsi="Source Sans Pro"/>
-        </w:rPr>
-        <w:t xml:space="preserve"> LDO </w:t>
+        <w:t xml:space="preserve">- voltage rails to be -0.2V (LMM05) and +5.2V using switched regulator and a LDO </w:t>
       </w:r>
     </w:p>
     <w:p>
@@ -2138,19 +1994,11 @@
         </w:rPr>
         <w:t xml:space="preserve"> Since the current probe outputs 1V for every 1A, a 1:1 ratio is appropriate. </w:t>
       </w:r>
-      <w:proofErr w:type="gramStart"/>
-      <w:r>
-        <w:rPr>
-          <w:rFonts w:ascii="Source Sans Pro" w:hAnsi="Source Sans Pro"/>
-        </w:rPr>
-        <w:t>So</w:t>
-      </w:r>
-      <w:proofErr w:type="gramEnd"/>
-      <w:r>
-        <w:rPr>
-          <w:rFonts w:ascii="Source Sans Pro" w:hAnsi="Source Sans Pro"/>
-        </w:rPr>
-        <w:t xml:space="preserve"> </w:t>
+      <w:r>
+        <w:rPr>
+          <w:rFonts w:ascii="Source Sans Pro" w:hAnsi="Source Sans Pro"/>
+        </w:rPr>
+        <w:t xml:space="preserve">So </w:t>
       </w:r>
       <w:r>
         <w:rPr>
@@ -3095,19 +2943,11 @@
           <w:rFonts w:ascii="Source Sans Pro" w:hAnsi="Source Sans Pro"/>
         </w:rPr>
       </w:pPr>
-      <w:proofErr w:type="gramStart"/>
-      <w:r>
-        <w:rPr>
-          <w:rFonts w:ascii="Source Sans Pro" w:hAnsi="Source Sans Pro"/>
-        </w:rPr>
-        <w:t>Therefore</w:t>
-      </w:r>
-      <w:proofErr w:type="gramEnd"/>
-      <w:r>
-        <w:rPr>
-          <w:rFonts w:ascii="Source Sans Pro" w:hAnsi="Source Sans Pro"/>
-        </w:rPr>
-        <w:t xml:space="preserve"> we can obtain the impedance of the current sensor alone</w:t>
+      <w:r>
+        <w:rPr>
+          <w:rFonts w:ascii="Source Sans Pro" w:hAnsi="Source Sans Pro"/>
+        </w:rPr>
+        <w:t>Therefore we can obtain the impedance of the current sensor alone</w:t>
       </w:r>
     </w:p>
     <w:p>
@@ -3243,21 +3083,7 @@
         <w:rPr>
           <w:rFonts w:ascii="Source Sans Pro" w:hAnsi="Source Sans Pro"/>
         </w:rPr>
-        <w:t xml:space="preserve">) is contacted. Since maximum of 30 Amperes is targeted, we might go with </w:t>
-      </w:r>
-      <w:proofErr w:type="gramStart"/>
-      <w:r>
-        <w:rPr>
-          <w:rFonts w:ascii="Source Sans Pro" w:hAnsi="Source Sans Pro"/>
-        </w:rPr>
-        <w:t>lower</w:t>
-      </w:r>
-      <w:proofErr w:type="gramEnd"/>
-      <w:r>
-        <w:rPr>
-          <w:rFonts w:ascii="Source Sans Pro" w:hAnsi="Source Sans Pro"/>
-        </w:rPr>
-        <w:t xml:space="preserve"> rated current sensor, LEM.</w:t>
+        <w:t>) is contacted. Since maximum of 30 Amperes is targeted, we might go with lower rated current sensor, LEM.</w:t>
       </w:r>
     </w:p>
     <w:p>
@@ -3304,21 +3130,7 @@
         <w:rPr>
           <w:rFonts w:ascii="Source Sans Pro" w:hAnsi="Source Sans Pro"/>
         </w:rPr>
-        <w:t xml:space="preserve">LDO 24V-&gt;5V is removed. The voltage is step down from 24V to 6.5V, then to 5.2V. As a result, VCC of 5.2V is used for current </w:t>
-      </w:r>
-      <w:proofErr w:type="gramStart"/>
-      <w:r>
-        <w:rPr>
-          <w:rFonts w:ascii="Source Sans Pro" w:hAnsi="Source Sans Pro"/>
-        </w:rPr>
-        <w:t>sensor</w:t>
-      </w:r>
-      <w:proofErr w:type="gramEnd"/>
-      <w:r>
-        <w:rPr>
-          <w:rFonts w:ascii="Source Sans Pro" w:hAnsi="Source Sans Pro"/>
-        </w:rPr>
-        <w:t xml:space="preserve"> and diff. </w:t>
+        <w:t xml:space="preserve">LDO 24V-&gt;5V is removed. The voltage is step down from 24V to 6.5V, then to 5.2V. As a result, VCC of 5.2V is used for current sensor and diff. </w:t>
       </w:r>
       <w:proofErr w:type="spellStart"/>
       <w:r>
@@ -3334,19 +3146,11 @@
         </w:rPr>
         <w:t xml:space="preserve"> supply voltage. </w:t>
       </w:r>
-      <w:proofErr w:type="gramStart"/>
-      <w:r>
-        <w:rPr>
-          <w:rFonts w:ascii="Source Sans Pro" w:hAnsi="Source Sans Pro"/>
-        </w:rPr>
-        <w:t>Reason</w:t>
-      </w:r>
-      <w:proofErr w:type="gramEnd"/>
-      <w:r>
-        <w:rPr>
-          <w:rFonts w:ascii="Source Sans Pro" w:hAnsi="Source Sans Pro"/>
-        </w:rPr>
-        <w:t xml:space="preserve"> is that we have fully rail-to-rail signal</w:t>
+      <w:r>
+        <w:rPr>
+          <w:rFonts w:ascii="Source Sans Pro" w:hAnsi="Source Sans Pro"/>
+        </w:rPr>
+        <w:t>Reason is that we have fully rail-to-rail signal</w:t>
       </w:r>
       <w:r>
         <w:rPr>
@@ -3405,21 +3209,7 @@
         <w:rPr>
           <w:rFonts w:ascii="Source Sans Pro" w:hAnsi="Source Sans Pro"/>
         </w:rPr>
-        <w:t xml:space="preserve">With 2 oz copper weight, minimum track width is 0.16 mm, according to JLCPCB capabilities. -&gt; Differential route width </w:t>
-      </w:r>
-      <w:proofErr w:type="gramStart"/>
-      <w:r>
-        <w:rPr>
-          <w:rFonts w:ascii="Source Sans Pro" w:hAnsi="Source Sans Pro"/>
-        </w:rPr>
-        <w:t>are</w:t>
-      </w:r>
-      <w:proofErr w:type="gramEnd"/>
-      <w:r>
-        <w:rPr>
-          <w:rFonts w:ascii="Source Sans Pro" w:hAnsi="Source Sans Pro"/>
-        </w:rPr>
-        <w:t xml:space="preserve"> adjusted.</w:t>
+        <w:t>With 2 oz copper weight, minimum track width is 0.16 mm, according to JLCPCB capabilities. -&gt; Differential route width are adjusted.</w:t>
       </w:r>
     </w:p>
     <w:p>
@@ -3452,21 +3242,7 @@
         <w:rPr>
           <w:rFonts w:ascii="Source Sans Pro" w:hAnsi="Source Sans Pro"/>
         </w:rPr>
-        <w:t xml:space="preserve"> with more </w:t>
-      </w:r>
-      <w:proofErr w:type="gramStart"/>
-      <w:r>
-        <w:rPr>
-          <w:rFonts w:ascii="Source Sans Pro" w:hAnsi="Source Sans Pro"/>
-        </w:rPr>
-        <w:t>cross section</w:t>
-      </w:r>
-      <w:proofErr w:type="gramEnd"/>
-      <w:r>
-        <w:rPr>
-          <w:rFonts w:ascii="Source Sans Pro" w:hAnsi="Source Sans Pro"/>
-        </w:rPr>
-        <w:t xml:space="preserve"> area, better cooling, lower thermal resistance and better thermal performance</w:t>
+        <w:t xml:space="preserve"> with more cross section area, better cooling, lower thermal resistance and better thermal performance</w:t>
       </w:r>
     </w:p>
     <w:p>
@@ -3499,35 +3275,7 @@
         <w:rPr>
           <w:rFonts w:ascii="Source Sans Pro" w:hAnsi="Source Sans Pro"/>
         </w:rPr>
-        <w:t xml:space="preserve"> wider to 11mm. Channels are spread evenly for symmetry and maximum trace width is achieved to be around 12mm for each trace here. For worst case, Input current can be up to 75A. </w:t>
-      </w:r>
-      <w:proofErr w:type="gramStart"/>
-      <w:r>
-        <w:rPr>
-          <w:rFonts w:ascii="Source Sans Pro" w:hAnsi="Source Sans Pro"/>
-        </w:rPr>
-        <w:t>there</w:t>
-      </w:r>
-      <w:proofErr w:type="gramEnd"/>
-      <w:r>
-        <w:rPr>
-          <w:rFonts w:ascii="Source Sans Pro" w:hAnsi="Source Sans Pro"/>
-        </w:rPr>
-        <w:t xml:space="preserve"> are 4 layers stacked on top of each other, with each copper thickness being 2, this result in a thickness of 8 oz/ft^2 for each trace. This </w:t>
-      </w:r>
-      <w:proofErr w:type="gramStart"/>
-      <w:r>
-        <w:rPr>
-          <w:rFonts w:ascii="Source Sans Pro" w:hAnsi="Source Sans Pro"/>
-        </w:rPr>
-        <w:t>result</w:t>
-      </w:r>
-      <w:proofErr w:type="gramEnd"/>
-      <w:r>
-        <w:rPr>
-          <w:rFonts w:ascii="Source Sans Pro" w:hAnsi="Source Sans Pro"/>
-        </w:rPr>
-        <w:t xml:space="preserve"> in an expected temperature rise of 35 °C when 75A passes through, using IPC-2221 curve fitting</w:t>
+        <w:t xml:space="preserve"> wider to 11mm. Channels are spread evenly for symmetry and maximum trace width is achieved to be around 12mm for each trace here. For worst case, Input current can be up to 75A. there are 4 layers stacked on top of each other, with each copper thickness being 2, this result in a thickness of 8 oz/ft^2 for each trace. This result in an expected temperature rise of 35 °C when 75A passes through, using IPC-2221 curve fitting</w:t>
       </w:r>
     </w:p>
     <w:p>
@@ -3541,6 +3289,7 @@
       <w:r>
         <w:rPr>
           <w:rFonts w:ascii="Source Sans Pro" w:hAnsi="Source Sans Pro"/>
+          <w:noProof/>
         </w:rPr>
         <w:lastRenderedPageBreak/>
         <w:drawing>
@@ -3588,6 +3337,296 @@
           <w:rFonts w:ascii="Source Sans Pro" w:hAnsi="Source Sans Pro"/>
         </w:rPr>
       </w:pPr>
+    </w:p>
+    <w:p>
+      <w:pPr>
+        <w:ind w:left="360"/>
+        <w:jc w:val="both"/>
+        <w:rPr>
+          <w:rFonts w:ascii="Source Sans Pro" w:hAnsi="Source Sans Pro"/>
+        </w:rPr>
+      </w:pPr>
+      <w:r>
+        <w:rPr>
+          <w:rFonts w:ascii="Source Sans Pro" w:hAnsi="Source Sans Pro"/>
+        </w:rPr>
+        <w:t xml:space="preserve">First inspections on the </w:t>
+      </w:r>
+      <w:proofErr w:type="spellStart"/>
+      <w:r>
+        <w:rPr>
+          <w:rFonts w:ascii="Source Sans Pro" w:hAnsi="Source Sans Pro"/>
+        </w:rPr>
+        <w:t>pcbs</w:t>
+      </w:r>
+      <w:proofErr w:type="spellEnd"/>
+      <w:r>
+        <w:rPr>
+          <w:rFonts w:ascii="Source Sans Pro" w:hAnsi="Source Sans Pro"/>
+        </w:rPr>
+        <w:t>:</w:t>
+      </w:r>
+    </w:p>
+    <w:p>
+      <w:pPr>
+        <w:ind w:left="360"/>
+        <w:jc w:val="both"/>
+        <w:rPr>
+          <w:rFonts w:ascii="Source Sans Pro" w:hAnsi="Source Sans Pro"/>
+        </w:rPr>
+      </w:pPr>
+      <w:proofErr w:type="spellStart"/>
+      <w:r>
+        <w:rPr>
+          <w:rFonts w:ascii="Source Sans Pro" w:hAnsi="Source Sans Pro"/>
+        </w:rPr>
+        <w:t>Vref</w:t>
+      </w:r>
+      <w:proofErr w:type="spellEnd"/>
+      <w:r>
+        <w:rPr>
+          <w:rFonts w:ascii="Source Sans Pro" w:hAnsi="Source Sans Pro"/>
+        </w:rPr>
+        <w:t xml:space="preserve"> -&gt; 2.50 V</w:t>
+      </w:r>
+    </w:p>
+    <w:p>
+      <w:pPr>
+        <w:ind w:left="360"/>
+        <w:jc w:val="both"/>
+        <w:rPr>
+          <w:rFonts w:ascii="Source Sans Pro" w:hAnsi="Source Sans Pro"/>
+        </w:rPr>
+      </w:pPr>
+      <w:r>
+        <w:rPr>
+          <w:rFonts w:ascii="Source Sans Pro" w:hAnsi="Source Sans Pro"/>
+        </w:rPr>
+        <w:t xml:space="preserve">VCC+ -&gt; 5.46 V (instead of 5.2 V) </w:t>
+      </w:r>
+    </w:p>
+    <w:p>
+      <w:pPr>
+        <w:pStyle w:val="ListParagraph"/>
+        <w:numPr>
+          <w:ilvl w:val="0"/>
+          <w:numId w:val="7"/>
+        </w:numPr>
+        <w:jc w:val="both"/>
+        <w:rPr>
+          <w:rFonts w:ascii="Source Sans Pro" w:hAnsi="Source Sans Pro"/>
+        </w:rPr>
+      </w:pPr>
+      <w:r>
+        <w:rPr>
+          <w:rFonts w:ascii="Source Sans Pro" w:hAnsi="Source Sans Pro"/>
+        </w:rPr>
+        <w:t>That’s higher than allowable supply voltage range for the current sensors, which is 5.25V</w:t>
+      </w:r>
+    </w:p>
+    <w:p>
+      <w:pPr>
+        <w:ind w:firstLine="720"/>
+        <w:jc w:val="both"/>
+        <w:rPr>
+          <w:rFonts w:ascii="Source Sans Pro" w:hAnsi="Source Sans Pro"/>
+        </w:rPr>
+      </w:pPr>
+      <w:r>
+        <w:rPr>
+          <w:rFonts w:ascii="Source Sans Pro" w:hAnsi="Source Sans Pro"/>
+        </w:rPr>
+        <w:t xml:space="preserve">Reason: </w:t>
+      </w:r>
+      <w:r>
+        <w:rPr>
+          <w:rFonts w:ascii="Source Sans Pro" w:hAnsi="Source Sans Pro"/>
+        </w:rPr>
+        <w:t>With VCC+ being 5.2 V and V_FB = 1.187 V a</w:t>
+      </w:r>
+      <w:r>
+        <w:rPr>
+          <w:rFonts w:ascii="Source Sans Pro" w:hAnsi="Source Sans Pro"/>
+        </w:rPr>
+        <w:t>ccording to the datasheet, 9.1.1, R21/R24 should be 3.3</w:t>
+      </w:r>
+      <w:r>
+        <w:rPr>
+          <w:rFonts w:ascii="Source Sans Pro" w:hAnsi="Source Sans Pro"/>
+        </w:rPr>
+        <w:t xml:space="preserve">88. </w:t>
+      </w:r>
+    </w:p>
+    <w:p>
+      <w:pPr>
+        <w:ind w:firstLine="720"/>
+        <w:jc w:val="both"/>
+        <w:rPr>
+          <w:rFonts w:ascii="Source Sans Pro" w:hAnsi="Source Sans Pro"/>
+        </w:rPr>
+      </w:pPr>
+    </w:p>
+    <w:p>
+      <w:pPr>
+        <w:ind w:firstLine="720"/>
+        <w:jc w:val="both"/>
+        <w:rPr>
+          <w:rFonts w:ascii="Source Sans Pro" w:hAnsi="Source Sans Pro"/>
+        </w:rPr>
+      </w:pPr>
+      <w:r>
+        <w:rPr>
+          <w:rFonts w:ascii="Source Sans Pro" w:hAnsi="Source Sans Pro"/>
+        </w:rPr>
+        <w:drawing>
+          <wp:anchor distT="0" distB="0" distL="114300" distR="114300" simplePos="0" relativeHeight="251658240" behindDoc="1" locked="0" layoutInCell="1" allowOverlap="1" wp14:anchorId="6C54D63E" wp14:editId="78C90704">
+            <wp:simplePos x="0" y="0"/>
+            <wp:positionH relativeFrom="margin">
+              <wp:align>right</wp:align>
+            </wp:positionH>
+            <wp:positionV relativeFrom="paragraph">
+              <wp:posOffset>125095</wp:posOffset>
+            </wp:positionV>
+            <wp:extent cx="1882775" cy="562610"/>
+            <wp:effectExtent l="0" t="0" r="3175" b="8890"/>
+            <wp:wrapTight wrapText="bothSides">
+              <wp:wrapPolygon edited="0">
+                <wp:start x="0" y="0"/>
+                <wp:lineTo x="0" y="21210"/>
+                <wp:lineTo x="21418" y="21210"/>
+                <wp:lineTo x="21418" y="0"/>
+                <wp:lineTo x="0" y="0"/>
+              </wp:wrapPolygon>
+            </wp:wrapTight>
+            <wp:docPr id="929591958" name="Picture 1"/>
+            <wp:cNvGraphicFramePr>
+              <a:graphicFrameLocks xmlns:a="http://schemas.openxmlformats.org/drawingml/2006/main" noChangeAspect="1"/>
+            </wp:cNvGraphicFramePr>
+            <a:graphic xmlns:a="http://schemas.openxmlformats.org/drawingml/2006/main">
+              <a:graphicData uri="http://schemas.openxmlformats.org/drawingml/2006/picture">
+                <pic:pic xmlns:pic="http://schemas.openxmlformats.org/drawingml/2006/picture">
+                  <pic:nvPicPr>
+                    <pic:cNvPr id="929591958" name=""/>
+                    <pic:cNvPicPr/>
+                  </pic:nvPicPr>
+                  <pic:blipFill>
+                    <a:blip r:embed="rId10">
+                      <a:extLst>
+                        <a:ext uri="{28A0092B-C50C-407E-A947-70E740481C1C}">
+                          <a14:useLocalDpi xmlns:a14="http://schemas.microsoft.com/office/drawing/2010/main" val="0"/>
+                        </a:ext>
+                      </a:extLst>
+                    </a:blip>
+                    <a:stretch>
+                      <a:fillRect/>
+                    </a:stretch>
+                  </pic:blipFill>
+                  <pic:spPr>
+                    <a:xfrm>
+                      <a:off x="0" y="0"/>
+                      <a:ext cx="1882775" cy="562610"/>
+                    </a:xfrm>
+                    <a:prstGeom prst="rect">
+                      <a:avLst/>
+                    </a:prstGeom>
+                  </pic:spPr>
+                </pic:pic>
+              </a:graphicData>
+            </a:graphic>
+          </wp:anchor>
+        </w:drawing>
+      </w:r>
+      <w:r>
+        <w:rPr>
+          <w:rFonts w:ascii="Source Sans Pro" w:hAnsi="Source Sans Pro"/>
+          <w:noProof/>
+        </w:rPr>
+        <w:drawing>
+          <wp:inline distT="0" distB="0" distL="0" distR="0" wp14:anchorId="0EBDB7DC" wp14:editId="2DDC39BE">
+            <wp:extent cx="3094225" cy="820350"/>
+            <wp:effectExtent l="0" t="0" r="0" b="0"/>
+            <wp:docPr id="2020204575" name="Picture 1" descr="A screenshot of a computer error&#10;&#10;AI-generated content may be incorrect."/>
+            <wp:cNvGraphicFramePr>
+              <a:graphicFrameLocks xmlns:a="http://schemas.openxmlformats.org/drawingml/2006/main" noChangeAspect="1"/>
+            </wp:cNvGraphicFramePr>
+            <a:graphic xmlns:a="http://schemas.openxmlformats.org/drawingml/2006/main">
+              <a:graphicData uri="http://schemas.openxmlformats.org/drawingml/2006/picture">
+                <pic:pic xmlns:pic="http://schemas.openxmlformats.org/drawingml/2006/picture">
+                  <pic:nvPicPr>
+                    <pic:cNvPr id="2020204575" name="Picture 1" descr="A screenshot of a computer error&#10;&#10;AI-generated content may be incorrect."/>
+                    <pic:cNvPicPr/>
+                  </pic:nvPicPr>
+                  <pic:blipFill>
+                    <a:blip r:embed="rId11"/>
+                    <a:stretch>
+                      <a:fillRect/>
+                    </a:stretch>
+                  </pic:blipFill>
+                  <pic:spPr>
+                    <a:xfrm>
+                      <a:off x="0" y="0"/>
+                      <a:ext cx="3139458" cy="832342"/>
+                    </a:xfrm>
+                    <a:prstGeom prst="rect">
+                      <a:avLst/>
+                    </a:prstGeom>
+                  </pic:spPr>
+                </pic:pic>
+              </a:graphicData>
+            </a:graphic>
+          </wp:inline>
+        </w:drawing>
+      </w:r>
+    </w:p>
+    <w:p>
+      <w:pPr>
+        <w:ind w:firstLine="720"/>
+        <w:jc w:val="both"/>
+        <w:rPr>
+          <w:rFonts w:ascii="Source Sans Pro" w:hAnsi="Source Sans Pro"/>
+        </w:rPr>
+      </w:pPr>
+      <w:r>
+        <w:rPr>
+          <w:rFonts w:ascii="Source Sans Pro" w:hAnsi="Source Sans Pro"/>
+          <w:noProof/>
+        </w:rPr>
+        <w:drawing>
+          <wp:inline distT="0" distB="0" distL="0" distR="0" wp14:anchorId="15C662F6" wp14:editId="596B147A">
+            <wp:extent cx="3743075" cy="1688655"/>
+            <wp:effectExtent l="0" t="0" r="0" b="6985"/>
+            <wp:docPr id="109983400" name="Picture 1" descr="A diagram of a circuit&#10;&#10;AI-generated content may be incorrect."/>
+            <wp:cNvGraphicFramePr>
+              <a:graphicFrameLocks xmlns:a="http://schemas.openxmlformats.org/drawingml/2006/main" noChangeAspect="1"/>
+            </wp:cNvGraphicFramePr>
+            <a:graphic xmlns:a="http://schemas.openxmlformats.org/drawingml/2006/main">
+              <a:graphicData uri="http://schemas.openxmlformats.org/drawingml/2006/picture">
+                <pic:pic xmlns:pic="http://schemas.openxmlformats.org/drawingml/2006/picture">
+                  <pic:nvPicPr>
+                    <pic:cNvPr id="109983400" name="Picture 1" descr="A diagram of a circuit&#10;&#10;AI-generated content may be incorrect."/>
+                    <pic:cNvPicPr/>
+                  </pic:nvPicPr>
+                  <pic:blipFill>
+                    <a:blip r:embed="rId12"/>
+                    <a:stretch>
+                      <a:fillRect/>
+                    </a:stretch>
+                  </pic:blipFill>
+                  <pic:spPr>
+                    <a:xfrm>
+                      <a:off x="0" y="0"/>
+                      <a:ext cx="3751510" cy="1692460"/>
+                    </a:xfrm>
+                    <a:prstGeom prst="rect">
+                      <a:avLst/>
+                    </a:prstGeom>
+                  </pic:spPr>
+                </pic:pic>
+              </a:graphicData>
+            </a:graphic>
+          </wp:inline>
+        </w:drawing>
+      </w:r>
     </w:p>
     <w:sectPr>
       <w:pgSz w:w="11906" w:h="16838" w:code="9"/>

</xml_diff>

<commit_message>
added mode measurements for the newpcb for different sensors
</commit_message>
<xml_diff>
--- a/Measurements/Lab equipments.docx
+++ b/Measurements/Lab equipments.docx
@@ -202,7 +202,21 @@
         <w:rPr>
           <w:rFonts w:ascii="Source Sans Pro" w:hAnsi="Source Sans Pro"/>
         </w:rPr>
-        <w:t xml:space="preserve"> voltages on the PCB by hand ( yellow points)</w:t>
+        <w:t xml:space="preserve"> voltages on the PCB by hand </w:t>
+      </w:r>
+      <w:proofErr w:type="gramStart"/>
+      <w:r>
+        <w:rPr>
+          <w:rFonts w:ascii="Source Sans Pro" w:hAnsi="Source Sans Pro"/>
+        </w:rPr>
+        <w:t>( yellow</w:t>
+      </w:r>
+      <w:proofErr w:type="gramEnd"/>
+      <w:r>
+        <w:rPr>
+          <w:rFonts w:ascii="Source Sans Pro" w:hAnsi="Source Sans Pro"/>
+        </w:rPr>
+        <w:t xml:space="preserve"> points)</w:t>
       </w:r>
     </w:p>
     <w:p>
@@ -296,7 +310,16 @@
           <w:b/>
           <w:bCs/>
         </w:rPr>
-        <w:t>Spitzenberger APS 1000 – CC mode</w:t>
+        <w:t xml:space="preserve">Spitzenberger APS 1000 – CC </w:t>
+      </w:r>
+      <w:proofErr w:type="gramStart"/>
+      <w:r>
+        <w:rPr>
+          <w:rFonts w:ascii="Source Sans Pro" w:hAnsi="Source Sans Pro"/>
+          <w:b/>
+          <w:bCs/>
+        </w:rPr>
+        <w:t>mode</w:t>
       </w:r>
       <w:r>
         <w:rPr>
@@ -308,7 +331,14 @@
         <w:rPr>
           <w:rFonts w:ascii="Source Sans Pro" w:hAnsi="Source Sans Pro"/>
         </w:rPr>
-        <w:t>: to a</w:t>
+        <w:t>:</w:t>
+      </w:r>
+      <w:proofErr w:type="gramEnd"/>
+      <w:r>
+        <w:rPr>
+          <w:rFonts w:ascii="Source Sans Pro" w:hAnsi="Source Sans Pro"/>
+        </w:rPr>
+        <w:t xml:space="preserve"> to a</w:t>
       </w:r>
       <w:r>
         <w:rPr>
@@ -332,7 +362,21 @@
         <w:rPr>
           <w:rFonts w:ascii="Source Sans Pro" w:hAnsi="Source Sans Pro"/>
         </w:rPr>
-        <w:t>. Therefore we achieve AC ripple current with varying frequencies and amplitudes in addition to DC current.</w:t>
+        <w:t xml:space="preserve">. </w:t>
+      </w:r>
+      <w:proofErr w:type="gramStart"/>
+      <w:r>
+        <w:rPr>
+          <w:rFonts w:ascii="Source Sans Pro" w:hAnsi="Source Sans Pro"/>
+        </w:rPr>
+        <w:t>Therefore</w:t>
+      </w:r>
+      <w:proofErr w:type="gramEnd"/>
+      <w:r>
+        <w:rPr>
+          <w:rFonts w:ascii="Source Sans Pro" w:hAnsi="Source Sans Pro"/>
+        </w:rPr>
+        <w:t xml:space="preserve"> we achieve AC ripple current with varying frequencies and amplitudes in addition to DC current.</w:t>
       </w:r>
     </w:p>
     <w:p>
@@ -352,13 +396,43 @@
           <w:b/>
           <w:bCs/>
         </w:rPr>
-        <w:t>Wideband Injection Transformer B-WIT 100</w:t>
-      </w:r>
-      <w:r>
-        <w:rPr>
-          <w:rFonts w:ascii="Source Sans Pro" w:hAnsi="Source Sans Pro"/>
-        </w:rPr>
-        <w:t xml:space="preserve"> : injects differential-mode noise to test the diff. </w:t>
+        <w:t xml:space="preserve">Wideband Injection Transformer B-WIT </w:t>
+      </w:r>
+      <w:proofErr w:type="gramStart"/>
+      <w:r>
+        <w:rPr>
+          <w:rFonts w:ascii="Source Sans Pro" w:hAnsi="Source Sans Pro"/>
+          <w:b/>
+          <w:bCs/>
+        </w:rPr>
+        <w:t>100</w:t>
+      </w:r>
+      <w:r>
+        <w:rPr>
+          <w:rFonts w:ascii="Source Sans Pro" w:hAnsi="Source Sans Pro"/>
+        </w:rPr>
+        <w:t xml:space="preserve"> :</w:t>
+      </w:r>
+      <w:proofErr w:type="gramEnd"/>
+      <w:r>
+        <w:rPr>
+          <w:rFonts w:ascii="Source Sans Pro" w:hAnsi="Source Sans Pro"/>
+        </w:rPr>
+        <w:t xml:space="preserve"> injects differential-mode noise to test the </w:t>
+      </w:r>
+      <w:proofErr w:type="gramStart"/>
+      <w:r>
+        <w:rPr>
+          <w:rFonts w:ascii="Source Sans Pro" w:hAnsi="Source Sans Pro"/>
+        </w:rPr>
+        <w:t>diff</w:t>
+      </w:r>
+      <w:proofErr w:type="gramEnd"/>
+      <w:r>
+        <w:rPr>
+          <w:rFonts w:ascii="Source Sans Pro" w:hAnsi="Source Sans Pro"/>
+        </w:rPr>
+        <w:t xml:space="preserve">. </w:t>
       </w:r>
       <w:proofErr w:type="spellStart"/>
       <w:r>
@@ -787,7 +861,21 @@
         <w:rPr>
           <w:rFonts w:ascii="Source Sans Pro" w:hAnsi="Source Sans Pro"/>
         </w:rPr>
-        <w:t xml:space="preserve">Vector Network Analyzer – Bode 100 : </w:t>
+        <w:t xml:space="preserve">Vector Network Analyzer – Bode </w:t>
+      </w:r>
+      <w:proofErr w:type="gramStart"/>
+      <w:r>
+        <w:rPr>
+          <w:rFonts w:ascii="Source Sans Pro" w:hAnsi="Source Sans Pro"/>
+        </w:rPr>
+        <w:t>100 :</w:t>
+      </w:r>
+      <w:proofErr w:type="gramEnd"/>
+      <w:r>
+        <w:rPr>
+          <w:rFonts w:ascii="Source Sans Pro" w:hAnsi="Source Sans Pro"/>
+        </w:rPr>
+        <w:t xml:space="preserve"> </w:t>
       </w:r>
       <w:r>
         <w:rPr>
@@ -1001,7 +1089,21 @@
         <w:rPr>
           <w:rFonts w:ascii="Source Sans Pro" w:hAnsi="Source Sans Pro"/>
         </w:rPr>
-        <w:t xml:space="preserve">Tektronix TBS 2000 Digital Oscilloscope : </w:t>
+        <w:t xml:space="preserve">Tektronix TBS 2000 Digital </w:t>
+      </w:r>
+      <w:proofErr w:type="gramStart"/>
+      <w:r>
+        <w:rPr>
+          <w:rFonts w:ascii="Source Sans Pro" w:hAnsi="Source Sans Pro"/>
+        </w:rPr>
+        <w:t>Oscilloscope :</w:t>
+      </w:r>
+      <w:proofErr w:type="gramEnd"/>
+      <w:r>
+        <w:rPr>
+          <w:rFonts w:ascii="Source Sans Pro" w:hAnsi="Source Sans Pro"/>
+        </w:rPr>
+        <w:t xml:space="preserve"> </w:t>
       </w:r>
     </w:p>
     <w:p>
@@ -1219,7 +1321,35 @@
         <w:rPr>
           <w:rFonts w:ascii="Source Sans Pro" w:hAnsi="Source Sans Pro"/>
         </w:rPr>
-        <w:t xml:space="preserve"> R2 and R5 resistors. Upon comparison, decided to remove them (replaced with 0 ohm resistors) . </w:t>
+        <w:t xml:space="preserve"> R2 and R5 resistors. Upon comparison, </w:t>
+      </w:r>
+      <w:proofErr w:type="gramStart"/>
+      <w:r>
+        <w:rPr>
+          <w:rFonts w:ascii="Source Sans Pro" w:hAnsi="Source Sans Pro"/>
+        </w:rPr>
+        <w:t>decided</w:t>
+      </w:r>
+      <w:proofErr w:type="gramEnd"/>
+      <w:r>
+        <w:rPr>
+          <w:rFonts w:ascii="Source Sans Pro" w:hAnsi="Source Sans Pro"/>
+        </w:rPr>
+        <w:t xml:space="preserve"> to remove them (replaced with 0 ohm resistors</w:t>
+      </w:r>
+      <w:proofErr w:type="gramStart"/>
+      <w:r>
+        <w:rPr>
+          <w:rFonts w:ascii="Source Sans Pro" w:hAnsi="Source Sans Pro"/>
+        </w:rPr>
+        <w:t>) .</w:t>
+      </w:r>
+      <w:proofErr w:type="gramEnd"/>
+      <w:r>
+        <w:rPr>
+          <w:rFonts w:ascii="Source Sans Pro" w:hAnsi="Source Sans Pro"/>
+        </w:rPr>
+        <w:t xml:space="preserve"> </w:t>
       </w:r>
       <w:r>
         <w:rPr>
@@ -1276,7 +1406,21 @@
         <w:rPr>
           <w:rFonts w:ascii="Source Sans Pro" w:hAnsi="Source Sans Pro"/>
         </w:rPr>
-        <w:t xml:space="preserve">- voltage rails to be -0.2V (LMM05) and +5.2V using switched regulator and a LDO </w:t>
+        <w:t xml:space="preserve">- voltage rails to be -0.2V (LMM05) and +5.2V using switched regulator and </w:t>
+      </w:r>
+      <w:proofErr w:type="gramStart"/>
+      <w:r>
+        <w:rPr>
+          <w:rFonts w:ascii="Source Sans Pro" w:hAnsi="Source Sans Pro"/>
+        </w:rPr>
+        <w:t>a</w:t>
+      </w:r>
+      <w:proofErr w:type="gramEnd"/>
+      <w:r>
+        <w:rPr>
+          <w:rFonts w:ascii="Source Sans Pro" w:hAnsi="Source Sans Pro"/>
+        </w:rPr>
+        <w:t xml:space="preserve"> LDO </w:t>
       </w:r>
     </w:p>
     <w:p>
@@ -1624,13 +1768,33 @@
         </w:numPr>
         <w:rPr>
           <w:rFonts w:ascii="Source Sans Pro" w:hAnsi="Source Sans Pro"/>
-        </w:rPr>
-      </w:pPr>
-      <w:r>
-        <w:rPr>
-          <w:rFonts w:ascii="Source Sans Pro" w:hAnsi="Source Sans Pro"/>
-        </w:rPr>
-        <w:t>X:1 Ratio: Bode 100 scales the input voltage by a factor of X, used with probes that attenuate the signal by a factor of X</w:t>
+          <w:b/>
+          <w:bCs/>
+        </w:rPr>
+      </w:pPr>
+      <w:r>
+        <w:rPr>
+          <w:rFonts w:ascii="Source Sans Pro" w:hAnsi="Source Sans Pro"/>
+          <w:b/>
+          <w:bCs/>
+        </w:rPr>
+        <w:t>X:1 Ratio: Bode 100 scales the input voltage by a factor of X</w:t>
+      </w:r>
+      <w:r>
+        <w:rPr>
+          <w:rFonts w:ascii="Source Sans Pro" w:hAnsi="Source Sans Pro"/>
+          <w:b/>
+          <w:bCs/>
+        </w:rPr>
+        <w:t>. U</w:t>
+      </w:r>
+      <w:r>
+        <w:rPr>
+          <w:rFonts w:ascii="Source Sans Pro" w:hAnsi="Source Sans Pro"/>
+          <w:b/>
+          <w:bCs/>
+        </w:rPr>
+        <w:t>se with probes that attenuate the signal by a factor of X</w:t>
       </w:r>
     </w:p>
     <w:p>
@@ -1698,7 +1862,14 @@
         <w:rPr>
           <w:rFonts w:ascii="Source Sans Pro" w:hAnsi="Source Sans Pro"/>
         </w:rPr>
-        <w:t xml:space="preserve"> CP1003B Current Probe (Set to 5A Mode): </w:t>
+        <w:t xml:space="preserve"> CP1003B Current Probe (Set to 5A Mode</w:t>
+      </w:r>
+      <w:proofErr w:type="gramStart"/>
+      <w:r>
+        <w:rPr>
+          <w:rFonts w:ascii="Source Sans Pro" w:hAnsi="Source Sans Pro"/>
+        </w:rPr>
+        <w:t xml:space="preserve">): </w:t>
       </w:r>
       <w:r>
         <w:rPr>
@@ -1706,6 +1877,7 @@
         </w:rPr>
         <w:t>‐</w:t>
       </w:r>
+      <w:proofErr w:type="gramEnd"/>
       <w:r>
         <w:rPr>
           <w:rFonts w:ascii="Source Sans Pro" w:hAnsi="Source Sans Pro"/>
@@ -1956,7 +2128,14 @@
         <w:rPr>
           <w:rFonts w:ascii="Source Sans Pro" w:hAnsi="Source Sans Pro"/>
         </w:rPr>
-        <w:t xml:space="preserve">1. Current Measurement with CH1: </w:t>
+        <w:t xml:space="preserve">1. Current Measurement with </w:t>
+      </w:r>
+      <w:proofErr w:type="gramStart"/>
+      <w:r>
+        <w:rPr>
+          <w:rFonts w:ascii="Source Sans Pro" w:hAnsi="Source Sans Pro"/>
+        </w:rPr>
+        <w:t xml:space="preserve">CH1: </w:t>
       </w:r>
       <w:r>
         <w:rPr>
@@ -1964,6 +2143,7 @@
         </w:rPr>
         <w:t>‐</w:t>
       </w:r>
+      <w:proofErr w:type="gramEnd"/>
       <w:r>
         <w:rPr>
           <w:rFonts w:ascii="Source Sans Pro" w:hAnsi="Source Sans Pro"/>
@@ -1994,11 +2174,19 @@
         </w:rPr>
         <w:t xml:space="preserve"> Since the current probe outputs 1V for every 1A, a 1:1 ratio is appropriate. </w:t>
       </w:r>
-      <w:r>
-        <w:rPr>
-          <w:rFonts w:ascii="Source Sans Pro" w:hAnsi="Source Sans Pro"/>
-        </w:rPr>
-        <w:t xml:space="preserve">So </w:t>
+      <w:proofErr w:type="gramStart"/>
+      <w:r>
+        <w:rPr>
+          <w:rFonts w:ascii="Source Sans Pro" w:hAnsi="Source Sans Pro"/>
+        </w:rPr>
+        <w:t>So</w:t>
+      </w:r>
+      <w:proofErr w:type="gramEnd"/>
+      <w:r>
+        <w:rPr>
+          <w:rFonts w:ascii="Source Sans Pro" w:hAnsi="Source Sans Pro"/>
+        </w:rPr>
+        <w:t xml:space="preserve"> </w:t>
       </w:r>
       <w:r>
         <w:rPr>
@@ -2017,7 +2205,14 @@
         <w:rPr>
           <w:rFonts w:ascii="Source Sans Pro" w:hAnsi="Source Sans Pro"/>
         </w:rPr>
-        <w:t xml:space="preserve">2. Voltage Measurement with CH2: </w:t>
+        <w:t xml:space="preserve">2. Voltage Measurement with </w:t>
+      </w:r>
+      <w:proofErr w:type="gramStart"/>
+      <w:r>
+        <w:rPr>
+          <w:rFonts w:ascii="Source Sans Pro" w:hAnsi="Source Sans Pro"/>
+        </w:rPr>
+        <w:t xml:space="preserve">CH2: </w:t>
       </w:r>
       <w:r>
         <w:rPr>
@@ -2025,6 +2220,7 @@
         </w:rPr>
         <w:t>‐</w:t>
       </w:r>
+      <w:proofErr w:type="gramEnd"/>
       <w:r>
         <w:rPr>
           <w:rFonts w:ascii="Source Sans Pro" w:hAnsi="Source Sans Pro"/>
@@ -2234,6 +2430,145 @@
           <w:rFonts w:ascii="Source Sans Pro" w:hAnsi="Source Sans Pro"/>
         </w:rPr>
       </w:pPr>
+      <w:r>
+        <w:rPr>
+          <w:rFonts w:ascii="Source Sans Pro" w:hAnsi="Source Sans Pro"/>
+          <w:noProof/>
+        </w:rPr>
+        <mc:AlternateContent>
+          <mc:Choice Requires="wpg">
+            <w:drawing>
+              <wp:anchor distT="0" distB="0" distL="114300" distR="114300" simplePos="0" relativeHeight="251661312" behindDoc="0" locked="0" layoutInCell="1" allowOverlap="1" wp14:anchorId="168369E4" wp14:editId="0E99E98D">
+                <wp:simplePos x="0" y="0"/>
+                <wp:positionH relativeFrom="column">
+                  <wp:posOffset>99391</wp:posOffset>
+                </wp:positionH>
+                <wp:positionV relativeFrom="paragraph">
+                  <wp:posOffset>186690</wp:posOffset>
+                </wp:positionV>
+                <wp:extent cx="5743437" cy="538508"/>
+                <wp:effectExtent l="0" t="0" r="0" b="0"/>
+                <wp:wrapTight wrapText="bothSides">
+                  <wp:wrapPolygon edited="0">
+                    <wp:start x="0" y="0"/>
+                    <wp:lineTo x="0" y="20632"/>
+                    <wp:lineTo x="21495" y="20632"/>
+                    <wp:lineTo x="21495" y="0"/>
+                    <wp:lineTo x="0" y="0"/>
+                  </wp:wrapPolygon>
+                </wp:wrapTight>
+                <wp:docPr id="1034902351" name="Group 1"/>
+                <wp:cNvGraphicFramePr/>
+                <a:graphic xmlns:a="http://schemas.openxmlformats.org/drawingml/2006/main">
+                  <a:graphicData uri="http://schemas.microsoft.com/office/word/2010/wordprocessingGroup">
+                    <wpg:wgp>
+                      <wpg:cNvGrpSpPr/>
+                      <wpg:grpSpPr>
+                        <a:xfrm>
+                          <a:off x="0" y="0"/>
+                          <a:ext cx="5743437" cy="538508"/>
+                          <a:chOff x="0" y="0"/>
+                          <a:chExt cx="5743437" cy="538508"/>
+                        </a:xfrm>
+                      </wpg:grpSpPr>
+                      <pic:pic xmlns:pic="http://schemas.openxmlformats.org/drawingml/2006/picture">
+                        <pic:nvPicPr>
+                          <pic:cNvPr id="522436293" name="Picture 1"/>
+                          <pic:cNvPicPr>
+                            <a:picLocks noChangeAspect="1"/>
+                          </pic:cNvPicPr>
+                        </pic:nvPicPr>
+                        <pic:blipFill>
+                          <a:blip r:embed="rId7">
+                            <a:extLst>
+                              <a:ext uri="{28A0092B-C50C-407E-A947-70E740481C1C}">
+                                <a14:useLocalDpi xmlns:a14="http://schemas.microsoft.com/office/drawing/2010/main" val="0"/>
+                              </a:ext>
+                            </a:extLst>
+                          </a:blip>
+                          <a:stretch>
+                            <a:fillRect/>
+                          </a:stretch>
+                        </pic:blipFill>
+                        <pic:spPr>
+                          <a:xfrm>
+                            <a:off x="0" y="0"/>
+                            <a:ext cx="5731510" cy="284480"/>
+                          </a:xfrm>
+                          <a:prstGeom prst="rect">
+                            <a:avLst/>
+                          </a:prstGeom>
+                        </pic:spPr>
+                      </pic:pic>
+                      <pic:pic xmlns:pic="http://schemas.openxmlformats.org/drawingml/2006/picture">
+                        <pic:nvPicPr>
+                          <pic:cNvPr id="1373376462" name="Picture 1"/>
+                          <pic:cNvPicPr>
+                            <a:picLocks noChangeAspect="1"/>
+                          </pic:cNvPicPr>
+                        </pic:nvPicPr>
+                        <pic:blipFill>
+                          <a:blip r:embed="rId8">
+                            <a:extLst>
+                              <a:ext uri="{28A0092B-C50C-407E-A947-70E740481C1C}">
+                                <a14:useLocalDpi xmlns:a14="http://schemas.microsoft.com/office/drawing/2010/main" val="0"/>
+                              </a:ext>
+                            </a:extLst>
+                          </a:blip>
+                          <a:stretch>
+                            <a:fillRect/>
+                          </a:stretch>
+                        </pic:blipFill>
+                        <pic:spPr>
+                          <a:xfrm>
+                            <a:off x="11927" y="290223"/>
+                            <a:ext cx="5731510" cy="248285"/>
+                          </a:xfrm>
+                          <a:prstGeom prst="rect">
+                            <a:avLst/>
+                          </a:prstGeom>
+                        </pic:spPr>
+                      </pic:pic>
+                    </wpg:wgp>
+                  </a:graphicData>
+                </a:graphic>
+              </wp:anchor>
+            </w:drawing>
+          </mc:Choice>
+          <mc:Fallback>
+            <w:pict>
+              <v:group w14:anchorId="26558042" id="Group 1" o:spid="_x0000_s1026" style="position:absolute;margin-left:7.85pt;margin-top:14.7pt;width:452.25pt;height:42.4pt;z-index:251661312" coordsize="57434,5385" o:gfxdata="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">
+                <v:shapetype id="_x0000_t75" coordsize="21600,21600" o:spt="75" o:preferrelative="t" path="m@4@5l@4@11@9@11@9@5xe" filled="f" stroked="f">
+                  <v:stroke joinstyle="miter"/>
+                  <v:formulas>
+                    <v:f eqn="if lineDrawn pixelLineWidth 0"/>
+                    <v:f eqn="sum @0 1 0"/>
+                    <v:f eqn="sum 0 0 @1"/>
+                    <v:f eqn="prod @2 1 2"/>
+                    <v:f eqn="prod @3 21600 pixelWidth"/>
+                    <v:f eqn="prod @3 21600 pixelHeight"/>
+                    <v:f eqn="sum @0 0 1"/>
+                    <v:f eqn="prod @6 1 2"/>
+                    <v:f eqn="prod @7 21600 pixelWidth"/>
+                    <v:f eqn="sum @8 21600 0"/>
+                    <v:f eqn="prod @7 21600 pixelHeight"/>
+                    <v:f eqn="sum @10 21600 0"/>
+                  </v:formulas>
+                  <v:path o:extrusionok="f" gradientshapeok="t" o:connecttype="rect"/>
+                  <o:lock v:ext="edit" aspectratio="t"/>
+                </v:shapetype>
+                <v:shape id="Picture 1" o:spid="_x0000_s1027" type="#_x0000_t75" style="position:absolute;width:57315;height:2844;visibility:visible;mso-wrap-style:square" o:gfxdata="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">
+                  <v:imagedata r:id="rId9" o:title=""/>
+                </v:shape>
+                <v:shape id="Picture 1" o:spid="_x0000_s1028" type="#_x0000_t75" style="position:absolute;left:119;top:2902;width:57315;height:2483;visibility:visible;mso-wrap-style:square" o:gfxdata="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">
+                  <v:imagedata r:id="rId10" o:title=""/>
+                </v:shape>
+                <w10:wrap type="tight"/>
+              </v:group>
+            </w:pict>
+          </mc:Fallback>
+        </mc:AlternateContent>
+      </w:r>
     </w:p>
     <w:p>
       <w:pPr>
@@ -2249,47 +2584,6 @@
           <w:rFonts w:ascii="Source Sans Pro" w:hAnsi="Source Sans Pro"/>
         </w:rPr>
       </w:pPr>
-      <w:r>
-        <w:rPr>
-          <w:rFonts w:ascii="Source Sans Pro" w:hAnsi="Source Sans Pro"/>
-          <w:noProof/>
-        </w:rPr>
-        <w:drawing>
-          <wp:inline distT="0" distB="0" distL="0" distR="0" wp14:anchorId="24409B51" wp14:editId="7A3D8DA1">
-            <wp:extent cx="5731510" cy="284480"/>
-            <wp:effectExtent l="0" t="0" r="2540" b="1270"/>
-            <wp:docPr id="1868478295" name="Picture 1"/>
-            <wp:cNvGraphicFramePr>
-              <a:graphicFrameLocks xmlns:a="http://schemas.openxmlformats.org/drawingml/2006/main" noChangeAspect="1"/>
-            </wp:cNvGraphicFramePr>
-            <a:graphic xmlns:a="http://schemas.openxmlformats.org/drawingml/2006/main">
-              <a:graphicData uri="http://schemas.openxmlformats.org/drawingml/2006/picture">
-                <pic:pic xmlns:pic="http://schemas.openxmlformats.org/drawingml/2006/picture">
-                  <pic:nvPicPr>
-                    <pic:cNvPr id="1868478295" name=""/>
-                    <pic:cNvPicPr/>
-                  </pic:nvPicPr>
-                  <pic:blipFill>
-                    <a:blip r:embed="rId7"/>
-                    <a:stretch>
-                      <a:fillRect/>
-                    </a:stretch>
-                  </pic:blipFill>
-                  <pic:spPr>
-                    <a:xfrm>
-                      <a:off x="0" y="0"/>
-                      <a:ext cx="5731510" cy="284480"/>
-                    </a:xfrm>
-                    <a:prstGeom prst="rect">
-                      <a:avLst/>
-                    </a:prstGeom>
-                  </pic:spPr>
-                </pic:pic>
-              </a:graphicData>
-            </a:graphic>
-          </wp:inline>
-        </w:drawing>
-      </w:r>
     </w:p>
     <w:p>
       <w:pPr>
@@ -2298,47 +2592,6 @@
           <w:rFonts w:ascii="Source Sans Pro" w:hAnsi="Source Sans Pro"/>
         </w:rPr>
       </w:pPr>
-      <w:r>
-        <w:rPr>
-          <w:rFonts w:ascii="Source Sans Pro" w:hAnsi="Source Sans Pro"/>
-          <w:noProof/>
-        </w:rPr>
-        <w:drawing>
-          <wp:inline distT="0" distB="0" distL="0" distR="0" wp14:anchorId="4B508815" wp14:editId="3D654CA2">
-            <wp:extent cx="5731510" cy="248285"/>
-            <wp:effectExtent l="0" t="0" r="2540" b="0"/>
-            <wp:docPr id="779991313" name="Picture 1"/>
-            <wp:cNvGraphicFramePr>
-              <a:graphicFrameLocks xmlns:a="http://schemas.openxmlformats.org/drawingml/2006/main" noChangeAspect="1"/>
-            </wp:cNvGraphicFramePr>
-            <a:graphic xmlns:a="http://schemas.openxmlformats.org/drawingml/2006/main">
-              <a:graphicData uri="http://schemas.openxmlformats.org/drawingml/2006/picture">
-                <pic:pic xmlns:pic="http://schemas.openxmlformats.org/drawingml/2006/picture">
-                  <pic:nvPicPr>
-                    <pic:cNvPr id="779991313" name=""/>
-                    <pic:cNvPicPr/>
-                  </pic:nvPicPr>
-                  <pic:blipFill>
-                    <a:blip r:embed="rId8"/>
-                    <a:stretch>
-                      <a:fillRect/>
-                    </a:stretch>
-                  </pic:blipFill>
-                  <pic:spPr>
-                    <a:xfrm>
-                      <a:off x="0" y="0"/>
-                      <a:ext cx="5731510" cy="248285"/>
-                    </a:xfrm>
-                    <a:prstGeom prst="rect">
-                      <a:avLst/>
-                    </a:prstGeom>
-                  </pic:spPr>
-                </pic:pic>
-              </a:graphicData>
-            </a:graphic>
-          </wp:inline>
-        </w:drawing>
-      </w:r>
     </w:p>
     <w:p>
       <w:pPr>
@@ -2358,7 +2611,6 @@
         <w:rPr>
           <w:rFonts w:ascii="Source Sans Pro" w:hAnsi="Source Sans Pro"/>
         </w:rPr>
-        <w:lastRenderedPageBreak/>
         <w:t>Manual AC measurements:</w:t>
       </w:r>
     </w:p>
@@ -2943,11 +3195,19 @@
           <w:rFonts w:ascii="Source Sans Pro" w:hAnsi="Source Sans Pro"/>
         </w:rPr>
       </w:pPr>
-      <w:r>
-        <w:rPr>
-          <w:rFonts w:ascii="Source Sans Pro" w:hAnsi="Source Sans Pro"/>
-        </w:rPr>
-        <w:t>Therefore we can obtain the impedance of the current sensor alone</w:t>
+      <w:proofErr w:type="gramStart"/>
+      <w:r>
+        <w:rPr>
+          <w:rFonts w:ascii="Source Sans Pro" w:hAnsi="Source Sans Pro"/>
+        </w:rPr>
+        <w:t>Therefore</w:t>
+      </w:r>
+      <w:proofErr w:type="gramEnd"/>
+      <w:r>
+        <w:rPr>
+          <w:rFonts w:ascii="Source Sans Pro" w:hAnsi="Source Sans Pro"/>
+        </w:rPr>
+        <w:t xml:space="preserve"> we can obtain the impedance of the current sensor alone</w:t>
       </w:r>
     </w:p>
     <w:p>
@@ -3083,7 +3343,21 @@
         <w:rPr>
           <w:rFonts w:ascii="Source Sans Pro" w:hAnsi="Source Sans Pro"/>
         </w:rPr>
-        <w:t>) is contacted. Since maximum of 30 Amperes is targeted, we might go with lower rated current sensor, LEM.</w:t>
+        <w:t xml:space="preserve">) is contacted. Since maximum of 30 Amperes is targeted, we might go with </w:t>
+      </w:r>
+      <w:proofErr w:type="gramStart"/>
+      <w:r>
+        <w:rPr>
+          <w:rFonts w:ascii="Source Sans Pro" w:hAnsi="Source Sans Pro"/>
+        </w:rPr>
+        <w:t>lower</w:t>
+      </w:r>
+      <w:proofErr w:type="gramEnd"/>
+      <w:r>
+        <w:rPr>
+          <w:rFonts w:ascii="Source Sans Pro" w:hAnsi="Source Sans Pro"/>
+        </w:rPr>
+        <w:t xml:space="preserve"> rated current sensor, LEM.</w:t>
       </w:r>
     </w:p>
     <w:p>
@@ -3130,7 +3404,21 @@
         <w:rPr>
           <w:rFonts w:ascii="Source Sans Pro" w:hAnsi="Source Sans Pro"/>
         </w:rPr>
-        <w:t xml:space="preserve">LDO 24V-&gt;5V is removed. The voltage is step down from 24V to 6.5V, then to 5.2V. As a result, VCC of 5.2V is used for current sensor and diff. </w:t>
+        <w:t xml:space="preserve">LDO 24V-&gt;5V is removed. The voltage is step down from 24V to 6.5V, then to 5.2V. As a result, VCC of 5.2V is used for current </w:t>
+      </w:r>
+      <w:proofErr w:type="gramStart"/>
+      <w:r>
+        <w:rPr>
+          <w:rFonts w:ascii="Source Sans Pro" w:hAnsi="Source Sans Pro"/>
+        </w:rPr>
+        <w:t>sensor</w:t>
+      </w:r>
+      <w:proofErr w:type="gramEnd"/>
+      <w:r>
+        <w:rPr>
+          <w:rFonts w:ascii="Source Sans Pro" w:hAnsi="Source Sans Pro"/>
+        </w:rPr>
+        <w:t xml:space="preserve"> and diff. </w:t>
       </w:r>
       <w:proofErr w:type="spellStart"/>
       <w:r>
@@ -3146,11 +3434,19 @@
         </w:rPr>
         <w:t xml:space="preserve"> supply voltage. </w:t>
       </w:r>
-      <w:r>
-        <w:rPr>
-          <w:rFonts w:ascii="Source Sans Pro" w:hAnsi="Source Sans Pro"/>
-        </w:rPr>
-        <w:t>Reason is that we have fully rail-to-rail signal</w:t>
+      <w:proofErr w:type="gramStart"/>
+      <w:r>
+        <w:rPr>
+          <w:rFonts w:ascii="Source Sans Pro" w:hAnsi="Source Sans Pro"/>
+        </w:rPr>
+        <w:t>Reason</w:t>
+      </w:r>
+      <w:proofErr w:type="gramEnd"/>
+      <w:r>
+        <w:rPr>
+          <w:rFonts w:ascii="Source Sans Pro" w:hAnsi="Source Sans Pro"/>
+        </w:rPr>
+        <w:t xml:space="preserve"> is that we have fully rail-to-rail signal</w:t>
       </w:r>
       <w:r>
         <w:rPr>
@@ -3209,7 +3505,21 @@
         <w:rPr>
           <w:rFonts w:ascii="Source Sans Pro" w:hAnsi="Source Sans Pro"/>
         </w:rPr>
-        <w:t>With 2 oz copper weight, minimum track width is 0.16 mm, according to JLCPCB capabilities. -&gt; Differential route width are adjusted.</w:t>
+        <w:t xml:space="preserve">With 2 oz copper weight, minimum track width is 0.16 mm, according to JLCPCB capabilities. -&gt; Differential route width </w:t>
+      </w:r>
+      <w:proofErr w:type="gramStart"/>
+      <w:r>
+        <w:rPr>
+          <w:rFonts w:ascii="Source Sans Pro" w:hAnsi="Source Sans Pro"/>
+        </w:rPr>
+        <w:t>are</w:t>
+      </w:r>
+      <w:proofErr w:type="gramEnd"/>
+      <w:r>
+        <w:rPr>
+          <w:rFonts w:ascii="Source Sans Pro" w:hAnsi="Source Sans Pro"/>
+        </w:rPr>
+        <w:t xml:space="preserve"> adjusted.</w:t>
       </w:r>
     </w:p>
     <w:p>
@@ -3242,7 +3552,21 @@
         <w:rPr>
           <w:rFonts w:ascii="Source Sans Pro" w:hAnsi="Source Sans Pro"/>
         </w:rPr>
-        <w:t xml:space="preserve"> with more cross section area, better cooling, lower thermal resistance and better thermal performance</w:t>
+        <w:t xml:space="preserve"> with more </w:t>
+      </w:r>
+      <w:proofErr w:type="gramStart"/>
+      <w:r>
+        <w:rPr>
+          <w:rFonts w:ascii="Source Sans Pro" w:hAnsi="Source Sans Pro"/>
+        </w:rPr>
+        <w:t>cross section</w:t>
+      </w:r>
+      <w:proofErr w:type="gramEnd"/>
+      <w:r>
+        <w:rPr>
+          <w:rFonts w:ascii="Source Sans Pro" w:hAnsi="Source Sans Pro"/>
+        </w:rPr>
+        <w:t xml:space="preserve"> area, better cooling, lower thermal resistance and better thermal performance</w:t>
       </w:r>
     </w:p>
     <w:p>
@@ -3275,7 +3599,35 @@
         <w:rPr>
           <w:rFonts w:ascii="Source Sans Pro" w:hAnsi="Source Sans Pro"/>
         </w:rPr>
-        <w:t xml:space="preserve"> wider to 11mm. Channels are spread evenly for symmetry and maximum trace width is achieved to be around 12mm for each trace here. For worst case, Input current can be up to 75A. there are 4 layers stacked on top of each other, with each copper thickness being 2, this result in a thickness of 8 oz/ft^2 for each trace. This result in an expected temperature rise of 35 °C when 75A passes through, using IPC-2221 curve fitting</w:t>
+        <w:t xml:space="preserve"> wider to 11mm. Channels are spread evenly for symmetry and maximum trace width is achieved to be around 12mm for each trace here. For worst case, Input current can be up to 75A. </w:t>
+      </w:r>
+      <w:proofErr w:type="gramStart"/>
+      <w:r>
+        <w:rPr>
+          <w:rFonts w:ascii="Source Sans Pro" w:hAnsi="Source Sans Pro"/>
+        </w:rPr>
+        <w:t>there</w:t>
+      </w:r>
+      <w:proofErr w:type="gramEnd"/>
+      <w:r>
+        <w:rPr>
+          <w:rFonts w:ascii="Source Sans Pro" w:hAnsi="Source Sans Pro"/>
+        </w:rPr>
+        <w:t xml:space="preserve"> are 4 layers stacked on top of each other, with each copper thickness being 2, this result in a thickness of 8 oz/ft^2 for each trace. This </w:t>
+      </w:r>
+      <w:proofErr w:type="gramStart"/>
+      <w:r>
+        <w:rPr>
+          <w:rFonts w:ascii="Source Sans Pro" w:hAnsi="Source Sans Pro"/>
+        </w:rPr>
+        <w:t>result</w:t>
+      </w:r>
+      <w:proofErr w:type="gramEnd"/>
+      <w:r>
+        <w:rPr>
+          <w:rFonts w:ascii="Source Sans Pro" w:hAnsi="Source Sans Pro"/>
+        </w:rPr>
+        <w:t xml:space="preserve"> in an expected temperature rise of 35 °C when 75A passes through, using IPC-2221 curve fitting</w:t>
       </w:r>
     </w:p>
     <w:p>
@@ -3308,7 +3660,7 @@
                     <pic:cNvPicPr/>
                   </pic:nvPicPr>
                   <pic:blipFill>
-                    <a:blip r:embed="rId9"/>
+                    <a:blip r:embed="rId11"/>
                     <a:stretch>
                       <a:fillRect/>
                     </a:stretch>
@@ -3387,7 +3739,19 @@
         <w:rPr>
           <w:rFonts w:ascii="Source Sans Pro" w:hAnsi="Source Sans Pro"/>
         </w:rPr>
-        <w:t xml:space="preserve"> -&gt; 2.50 V</w:t>
+        <w:t xml:space="preserve"> -&gt; 2.50</w:t>
+      </w:r>
+      <w:r>
+        <w:rPr>
+          <w:rFonts w:ascii="Source Sans Pro" w:hAnsi="Source Sans Pro"/>
+        </w:rPr>
+        <w:t>1</w:t>
+      </w:r>
+      <w:r>
+        <w:rPr>
+          <w:rFonts w:ascii="Source Sans Pro" w:hAnsi="Source Sans Pro"/>
+        </w:rPr>
+        <w:t xml:space="preserve"> V</w:t>
       </w:r>
     </w:p>
     <w:p>
@@ -3421,7 +3785,19 @@
         <w:rPr>
           <w:rFonts w:ascii="Source Sans Pro" w:hAnsi="Source Sans Pro"/>
         </w:rPr>
-        <w:t>That’s higher than allowable supply voltage range for the current sensors, which is 5.25V</w:t>
+        <w:t xml:space="preserve">That’s higher </w:t>
+      </w:r>
+      <w:r>
+        <w:rPr>
+          <w:rFonts w:ascii="Source Sans Pro" w:hAnsi="Source Sans Pro"/>
+        </w:rPr>
+        <w:t>according to specifications supply range of the current sensor</w:t>
+      </w:r>
+      <w:r>
+        <w:rPr>
+          <w:rFonts w:ascii="Source Sans Pro" w:hAnsi="Source Sans Pro"/>
+        </w:rPr>
+        <w:t>, which is 5.25V</w:t>
       </w:r>
     </w:p>
     <w:p>
@@ -3479,7 +3855,70 @@
           <w:rFonts w:ascii="Source Sans Pro" w:hAnsi="Source Sans Pro"/>
         </w:rPr>
         <w:drawing>
-          <wp:anchor distT="0" distB="0" distL="114300" distR="114300" simplePos="0" relativeHeight="251658240" behindDoc="1" locked="0" layoutInCell="1" allowOverlap="1" wp14:anchorId="6C54D63E" wp14:editId="78C90704">
+          <wp:anchor distT="0" distB="0" distL="114300" distR="114300" simplePos="0" relativeHeight="251658240" behindDoc="1" locked="0" layoutInCell="1" allowOverlap="1" wp14:anchorId="47F7B7D6" wp14:editId="38E2FA30">
+            <wp:simplePos x="0" y="0"/>
+            <wp:positionH relativeFrom="column">
+              <wp:posOffset>3401653</wp:posOffset>
+            </wp:positionH>
+            <wp:positionV relativeFrom="paragraph">
+              <wp:posOffset>1023559</wp:posOffset>
+            </wp:positionV>
+            <wp:extent cx="2312261" cy="1011390"/>
+            <wp:effectExtent l="0" t="0" r="0" b="0"/>
+            <wp:wrapTight wrapText="bothSides">
+              <wp:wrapPolygon edited="0">
+                <wp:start x="0" y="0"/>
+                <wp:lineTo x="0" y="21166"/>
+                <wp:lineTo x="21357" y="21166"/>
+                <wp:lineTo x="21357" y="0"/>
+                <wp:lineTo x="0" y="0"/>
+              </wp:wrapPolygon>
+            </wp:wrapTight>
+            <wp:docPr id="2105032129" name="Picture 1" descr="A math equations and symbols&#10;&#10;AI-generated content may be incorrect."/>
+            <wp:cNvGraphicFramePr>
+              <a:graphicFrameLocks xmlns:a="http://schemas.openxmlformats.org/drawingml/2006/main" noChangeAspect="1"/>
+            </wp:cNvGraphicFramePr>
+            <a:graphic xmlns:a="http://schemas.openxmlformats.org/drawingml/2006/main">
+              <a:graphicData uri="http://schemas.openxmlformats.org/drawingml/2006/picture">
+                <pic:pic xmlns:pic="http://schemas.openxmlformats.org/drawingml/2006/picture">
+                  <pic:nvPicPr>
+                    <pic:cNvPr id="2105032129" name="Picture 1" descr="A math equations and symbols&#10;&#10;AI-generated content may be incorrect."/>
+                    <pic:cNvPicPr/>
+                  </pic:nvPicPr>
+                  <pic:blipFill>
+                    <a:blip r:embed="rId12" cstate="print">
+                      <a:extLst>
+                        <a:ext uri="{28A0092B-C50C-407E-A947-70E740481C1C}">
+                          <a14:useLocalDpi xmlns:a14="http://schemas.microsoft.com/office/drawing/2010/main" val="0"/>
+                        </a:ext>
+                      </a:extLst>
+                    </a:blip>
+                    <a:stretch>
+                      <a:fillRect/>
+                    </a:stretch>
+                  </pic:blipFill>
+                  <pic:spPr>
+                    <a:xfrm>
+                      <a:off x="0" y="0"/>
+                      <a:ext cx="2312261" cy="1011390"/>
+                    </a:xfrm>
+                    <a:prstGeom prst="rect">
+                      <a:avLst/>
+                    </a:prstGeom>
+                  </pic:spPr>
+                </pic:pic>
+              </a:graphicData>
+            </a:graphic>
+          </wp:anchor>
+        </w:drawing>
+      </w:r>
+      <w:r>
+        <w:rPr>
+          <w:rFonts w:ascii="Source Sans Pro" w:hAnsi="Source Sans Pro"/>
+          <w:noProof/>
+        </w:rPr>
+        <w:drawing>
+          <wp:anchor distT="0" distB="0" distL="114300" distR="114300" simplePos="0" relativeHeight="251657216" behindDoc="1" locked="0" layoutInCell="1" allowOverlap="1" wp14:anchorId="6C54D63E" wp14:editId="03DFB9AE">
             <wp:simplePos x="0" y="0"/>
             <wp:positionH relativeFrom="margin">
               <wp:align>right</wp:align>
@@ -3510,7 +3949,7 @@
                     <pic:cNvPicPr/>
                   </pic:nvPicPr>
                   <pic:blipFill>
-                    <a:blip r:embed="rId10">
+                    <a:blip r:embed="rId13">
                       <a:extLst>
                         <a:ext uri="{28A0092B-C50C-407E-A947-70E740481C1C}">
                           <a14:useLocalDpi xmlns:a14="http://schemas.microsoft.com/office/drawing/2010/main" val="0"/>
@@ -3557,7 +3996,7 @@
                     <pic:cNvPicPr/>
                   </pic:nvPicPr>
                   <pic:blipFill>
-                    <a:blip r:embed="rId11"/>
+                    <a:blip r:embed="rId14"/>
                     <a:stretch>
                       <a:fillRect/>
                     </a:stretch>
@@ -3592,9 +4031,9 @@
           <w:noProof/>
         </w:rPr>
         <w:drawing>
-          <wp:inline distT="0" distB="0" distL="0" distR="0" wp14:anchorId="15C662F6" wp14:editId="596B147A">
-            <wp:extent cx="3743075" cy="1688655"/>
-            <wp:effectExtent l="0" t="0" r="0" b="6985"/>
+          <wp:inline distT="0" distB="0" distL="0" distR="0" wp14:anchorId="15C662F6" wp14:editId="3EDA6E34">
+            <wp:extent cx="2530851" cy="1141771"/>
+            <wp:effectExtent l="0" t="0" r="3175" b="1270"/>
             <wp:docPr id="109983400" name="Picture 1" descr="A diagram of a circuit&#10;&#10;AI-generated content may be incorrect."/>
             <wp:cNvGraphicFramePr>
               <a:graphicFrameLocks xmlns:a="http://schemas.openxmlformats.org/drawingml/2006/main" noChangeAspect="1"/>
@@ -3607,7 +4046,7 @@
                     <pic:cNvPicPr/>
                   </pic:nvPicPr>
                   <pic:blipFill>
-                    <a:blip r:embed="rId12"/>
+                    <a:blip r:embed="rId15"/>
                     <a:stretch>
                       <a:fillRect/>
                     </a:stretch>
@@ -3615,7 +4054,7 @@
                   <pic:spPr>
                     <a:xfrm>
                       <a:off x="0" y="0"/>
-                      <a:ext cx="3751510" cy="1692460"/>
+                      <a:ext cx="2569640" cy="1159270"/>
                     </a:xfrm>
                     <a:prstGeom prst="rect">
                       <a:avLst/>
@@ -3627,6 +4066,1226 @@
           </wp:inline>
         </w:drawing>
       </w:r>
+    </w:p>
+    <w:p>
+      <w:pPr>
+        <w:ind w:firstLine="720"/>
+        <w:jc w:val="both"/>
+        <w:rPr>
+          <w:rFonts w:ascii="Source Sans Pro" w:hAnsi="Source Sans Pro"/>
+        </w:rPr>
+      </w:pPr>
+    </w:p>
+    <w:p>
+      <w:pPr>
+        <w:ind w:firstLine="720"/>
+        <w:jc w:val="both"/>
+        <w:rPr>
+          <w:rFonts w:ascii="Source Sans Pro" w:hAnsi="Source Sans Pro"/>
+        </w:rPr>
+      </w:pPr>
+      <w:r>
+        <w:rPr>
+          <w:rFonts w:ascii="Source Sans Pro" w:hAnsi="Source Sans Pro"/>
+        </w:rPr>
+        <w:t>Measured VCC+ = 5.</w:t>
+      </w:r>
+      <w:r>
+        <w:rPr>
+          <w:rFonts w:ascii="Source Sans Pro" w:hAnsi="Source Sans Pro"/>
+        </w:rPr>
+        <w:t>1 V</w:t>
+      </w:r>
+    </w:p>
+    <w:p>
+      <w:pPr>
+        <w:ind w:firstLine="720"/>
+        <w:jc w:val="both"/>
+        <w:rPr>
+          <w:rFonts w:ascii="Source Sans Pro" w:hAnsi="Source Sans Pro"/>
+        </w:rPr>
+      </w:pPr>
+    </w:p>
+    <w:p>
+      <w:pPr>
+        <w:ind w:firstLine="720"/>
+        <w:jc w:val="both"/>
+        <w:rPr>
+          <w:rFonts w:ascii="Source Sans Pro" w:hAnsi="Source Sans Pro"/>
+        </w:rPr>
+      </w:pPr>
+      <w:r>
+        <w:rPr>
+          <w:rFonts w:ascii="Source Sans Pro" w:hAnsi="Source Sans Pro"/>
+          <w:noProof/>
+        </w:rPr>
+        <mc:AlternateContent>
+          <mc:Choice Requires="wps">
+            <w:drawing>
+              <wp:anchor distT="0" distB="0" distL="114300" distR="114300" simplePos="0" relativeHeight="251663360" behindDoc="0" locked="0" layoutInCell="1" allowOverlap="1" wp14:anchorId="0B2760E1" wp14:editId="79435616">
+                <wp:simplePos x="0" y="0"/>
+                <wp:positionH relativeFrom="column">
+                  <wp:posOffset>561974</wp:posOffset>
+                </wp:positionH>
+                <wp:positionV relativeFrom="paragraph">
+                  <wp:posOffset>1311910</wp:posOffset>
+                </wp:positionV>
+                <wp:extent cx="237808" cy="3014663"/>
+                <wp:effectExtent l="95250" t="19050" r="29210" b="52705"/>
+                <wp:wrapNone/>
+                <wp:docPr id="1190909065" name="Straight Arrow Connector 3"/>
+                <wp:cNvGraphicFramePr/>
+                <a:graphic xmlns:a="http://schemas.openxmlformats.org/drawingml/2006/main">
+                  <a:graphicData uri="http://schemas.microsoft.com/office/word/2010/wordprocessingShape">
+                    <wps:wsp>
+                      <wps:cNvCnPr/>
+                      <wps:spPr>
+                        <a:xfrm flipH="1">
+                          <a:off x="0" y="0"/>
+                          <a:ext cx="237808" cy="3014663"/>
+                        </a:xfrm>
+                        <a:prstGeom prst="straightConnector1">
+                          <a:avLst/>
+                        </a:prstGeom>
+                        <a:ln w="38100">
+                          <a:solidFill>
+                            <a:srgbClr val="FF0000"/>
+                          </a:solidFill>
+                          <a:tailEnd type="triangle"/>
+                        </a:ln>
+                      </wps:spPr>
+                      <wps:style>
+                        <a:lnRef idx="1">
+                          <a:schemeClr val="accent1"/>
+                        </a:lnRef>
+                        <a:fillRef idx="0">
+                          <a:schemeClr val="accent1"/>
+                        </a:fillRef>
+                        <a:effectRef idx="0">
+                          <a:schemeClr val="accent1"/>
+                        </a:effectRef>
+                        <a:fontRef idx="minor">
+                          <a:schemeClr val="tx1"/>
+                        </a:fontRef>
+                      </wps:style>
+                      <wps:bodyPr/>
+                    </wps:wsp>
+                  </a:graphicData>
+                </a:graphic>
+                <wp14:sizeRelH relativeFrom="margin">
+                  <wp14:pctWidth>0</wp14:pctWidth>
+                </wp14:sizeRelH>
+                <wp14:sizeRelV relativeFrom="margin">
+                  <wp14:pctHeight>0</wp14:pctHeight>
+                </wp14:sizeRelV>
+              </wp:anchor>
+            </w:drawing>
+          </mc:Choice>
+          <mc:Fallback>
+            <w:pict>
+              <v:shapetype w14:anchorId="6E77BF43" id="_x0000_t32" coordsize="21600,21600" o:spt="32" o:oned="t" path="m,l21600,21600e" filled="f">
+                <v:path arrowok="t" fillok="f" o:connecttype="none"/>
+                <o:lock v:ext="edit" shapetype="t"/>
+              </v:shapetype>
+              <v:shape id="Straight Arrow Connector 3" o:spid="_x0000_s1026" type="#_x0000_t32" style="position:absolute;margin-left:44.25pt;margin-top:103.3pt;width:18.75pt;height:237.4pt;flip:x;z-index:251663360;visibility:visible;mso-wrap-style:square;mso-width-percent:0;mso-height-percent:0;mso-wrap-distance-left:9pt;mso-wrap-distance-top:0;mso-wrap-distance-right:9pt;mso-wrap-distance-bottom:0;mso-position-horizontal:absolute;mso-position-horizontal-relative:text;mso-position-vertical:absolute;mso-position-vertical-relative:text;mso-width-percent:0;mso-height-percent:0;mso-width-relative:margin;mso-height-relative:margin" o:gfxdata="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" strokecolor="red" strokeweight="3pt">
+                <v:stroke endarrow="block" joinstyle="miter"/>
+              </v:shape>
+            </w:pict>
+          </mc:Fallback>
+        </mc:AlternateContent>
+      </w:r>
+      <w:r>
+        <w:rPr>
+          <w:rFonts w:ascii="Source Sans Pro" w:hAnsi="Source Sans Pro"/>
+          <w:noProof/>
+        </w:rPr>
+        <mc:AlternateContent>
+          <mc:Choice Requires="wps">
+            <w:drawing>
+              <wp:anchor distT="0" distB="0" distL="114300" distR="114300" simplePos="0" relativeHeight="251662336" behindDoc="0" locked="0" layoutInCell="1" allowOverlap="1" wp14:anchorId="78F22094" wp14:editId="3CC59BCD">
+                <wp:simplePos x="0" y="0"/>
+                <wp:positionH relativeFrom="column">
+                  <wp:posOffset>665797</wp:posOffset>
+                </wp:positionH>
+                <wp:positionV relativeFrom="paragraph">
+                  <wp:posOffset>859155</wp:posOffset>
+                </wp:positionV>
+                <wp:extent cx="285750" cy="352425"/>
+                <wp:effectExtent l="19050" t="19050" r="19050" b="28575"/>
+                <wp:wrapNone/>
+                <wp:docPr id="1043115128" name="Rectangle 2"/>
+                <wp:cNvGraphicFramePr/>
+                <a:graphic xmlns:a="http://schemas.openxmlformats.org/drawingml/2006/main">
+                  <a:graphicData uri="http://schemas.microsoft.com/office/word/2010/wordprocessingShape">
+                    <wps:wsp>
+                      <wps:cNvSpPr/>
+                      <wps:spPr>
+                        <a:xfrm>
+                          <a:off x="0" y="0"/>
+                          <a:ext cx="285750" cy="352425"/>
+                        </a:xfrm>
+                        <a:prstGeom prst="rect">
+                          <a:avLst/>
+                        </a:prstGeom>
+                        <a:noFill/>
+                        <a:ln w="38100">
+                          <a:solidFill>
+                            <a:srgbClr val="FF0000"/>
+                          </a:solidFill>
+                        </a:ln>
+                      </wps:spPr>
+                      <wps:style>
+                        <a:lnRef idx="2">
+                          <a:schemeClr val="accent1">
+                            <a:shade val="15000"/>
+                          </a:schemeClr>
+                        </a:lnRef>
+                        <a:fillRef idx="1">
+                          <a:schemeClr val="accent1"/>
+                        </a:fillRef>
+                        <a:effectRef idx="0">
+                          <a:schemeClr val="accent1"/>
+                        </a:effectRef>
+                        <a:fontRef idx="minor">
+                          <a:schemeClr val="lt1"/>
+                        </a:fontRef>
+                      </wps:style>
+                      <wps:bodyPr rot="0" spcFirstLastPara="0" vertOverflow="overflow" horzOverflow="overflow" vert="horz" wrap="square" lIns="91440" tIns="45720" rIns="91440" bIns="45720" numCol="1" spcCol="0" rtlCol="0" fromWordArt="0" anchor="ctr" anchorCtr="0" forceAA="0" compatLnSpc="1">
+                        <a:prstTxWarp prst="textNoShape">
+                          <a:avLst/>
+                        </a:prstTxWarp>
+                        <a:noAutofit/>
+                      </wps:bodyPr>
+                    </wps:wsp>
+                  </a:graphicData>
+                </a:graphic>
+              </wp:anchor>
+            </w:drawing>
+          </mc:Choice>
+          <mc:Fallback>
+            <w:pict>
+              <v:rect w14:anchorId="371456F5" id="Rectangle 2" o:spid="_x0000_s1026" style="position:absolute;margin-left:52.4pt;margin-top:67.65pt;width:22.5pt;height:27.75pt;z-index:251662336;visibility:visible;mso-wrap-style:square;mso-wrap-distance-left:9pt;mso-wrap-distance-top:0;mso-wrap-distance-right:9pt;mso-wrap-distance-bottom:0;mso-position-horizontal:absolute;mso-position-horizontal-relative:text;mso-position-vertical:absolute;mso-position-vertical-relative:text;v-text-anchor:middle" o:gfxdata="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" filled="f" strokecolor="red" strokeweight="3pt"/>
+            </w:pict>
+          </mc:Fallback>
+        </mc:AlternateContent>
+      </w:r>
+      <w:r>
+        <w:rPr>
+          <w:rFonts w:ascii="Source Sans Pro" w:hAnsi="Source Sans Pro"/>
+        </w:rPr>
+        <w:drawing>
+          <wp:inline distT="0" distB="0" distL="0" distR="0" wp14:anchorId="14732555" wp14:editId="2499982A">
+            <wp:extent cx="3344937" cy="2843530"/>
+            <wp:effectExtent l="0" t="0" r="8255" b="0"/>
+            <wp:docPr id="1206836676" name="Picture 1" descr="A screenshot of a computer program&#10;&#10;AI-generated content may be incorrect."/>
+            <wp:cNvGraphicFramePr>
+              <a:graphicFrameLocks xmlns:a="http://schemas.openxmlformats.org/drawingml/2006/main" noChangeAspect="1"/>
+            </wp:cNvGraphicFramePr>
+            <a:graphic xmlns:a="http://schemas.openxmlformats.org/drawingml/2006/main">
+              <a:graphicData uri="http://schemas.openxmlformats.org/drawingml/2006/picture">
+                <pic:pic xmlns:pic="http://schemas.openxmlformats.org/drawingml/2006/picture">
+                  <pic:nvPicPr>
+                    <pic:cNvPr id="1206836676" name="Picture 1" descr="A screenshot of a computer program&#10;&#10;AI-generated content may be incorrect."/>
+                    <pic:cNvPicPr/>
+                  </pic:nvPicPr>
+                  <pic:blipFill>
+                    <a:blip r:embed="rId16"/>
+                    <a:stretch>
+                      <a:fillRect/>
+                    </a:stretch>
+                  </pic:blipFill>
+                  <pic:spPr>
+                    <a:xfrm>
+                      <a:off x="0" y="0"/>
+                      <a:ext cx="3349102" cy="2847071"/>
+                    </a:xfrm>
+                    <a:prstGeom prst="rect">
+                      <a:avLst/>
+                    </a:prstGeom>
+                  </pic:spPr>
+                </pic:pic>
+              </a:graphicData>
+            </a:graphic>
+          </wp:inline>
+        </w:drawing>
+      </w:r>
+    </w:p>
+    <w:p>
+      <w:pPr>
+        <w:ind w:firstLine="720"/>
+        <w:jc w:val="both"/>
+        <w:rPr>
+          <w:rFonts w:ascii="Source Sans Pro" w:hAnsi="Source Sans Pro"/>
+        </w:rPr>
+      </w:pPr>
+    </w:p>
+    <w:p>
+      <w:pPr>
+        <w:jc w:val="both"/>
+        <w:rPr>
+          <w:rFonts w:ascii="Source Sans Pro" w:hAnsi="Source Sans Pro"/>
+          <w:lang w:val="en-DE"/>
+        </w:rPr>
+      </w:pPr>
+      <w:r>
+        <w:rPr>
+          <w:rFonts w:ascii="Source Sans Pro" w:hAnsi="Source Sans Pro"/>
+          <w:lang w:val="en-DE"/>
+        </w:rPr>
+        <w:t>dBm (decibels relative to 1mW) is a power unit, and it can be converted to voltage using the formula:</w:t>
+      </w:r>
+    </w:p>
+    <w:p>
+      <w:pPr>
+        <w:ind w:firstLine="720"/>
+        <w:jc w:val="both"/>
+        <w:rPr>
+          <w:rFonts w:ascii="Source Sans Pro" w:hAnsi="Source Sans Pro"/>
+          <w:lang w:val="en-DE"/>
+        </w:rPr>
+      </w:pPr>
+      <m:oMathPara>
+        <m:oMath>
+          <m:sSub>
+            <m:sSubPr>
+              <m:ctrlPr>
+                <w:rPr>
+                  <w:rFonts w:ascii="Cambria Math" w:hAnsi="Cambria Math"/>
+                  <w:i/>
+                  <w:sz w:val="28"/>
+                  <w:szCs w:val="28"/>
+                  <w:lang w:val="en-DE"/>
+                </w:rPr>
+              </m:ctrlPr>
+            </m:sSubPr>
+            <m:e>
+              <m:r>
+                <w:rPr>
+                  <w:rFonts w:ascii="Cambria Math" w:hAnsi="Cambria Math"/>
+                  <w:sz w:val="28"/>
+                  <w:szCs w:val="28"/>
+                  <w:lang w:val="en-DE"/>
+                </w:rPr>
+                <m:t>V</m:t>
+              </m:r>
+            </m:e>
+            <m:sub>
+              <m:r>
+                <w:rPr>
+                  <w:rFonts w:ascii="Cambria Math" w:hAnsi="Cambria Math"/>
+                  <w:sz w:val="28"/>
+                  <w:szCs w:val="28"/>
+                  <w:lang w:val="en-DE"/>
+                </w:rPr>
+                <m:t>rms</m:t>
+              </m:r>
+            </m:sub>
+          </m:sSub>
+          <m:r>
+            <w:rPr>
+              <w:rFonts w:ascii="Cambria Math" w:hAnsi="Cambria Math"/>
+              <w:sz w:val="28"/>
+              <w:szCs w:val="28"/>
+              <w:lang w:val="en-DE"/>
+            </w:rPr>
+            <m:t>=</m:t>
+          </m:r>
+          <m:rad>
+            <m:radPr>
+              <m:degHide m:val="1"/>
+              <m:ctrlPr>
+                <w:rPr>
+                  <w:rFonts w:ascii="Cambria Math" w:hAnsi="Cambria Math"/>
+                  <w:i/>
+                  <w:sz w:val="28"/>
+                  <w:szCs w:val="28"/>
+                  <w:lang w:val="en-DE"/>
+                </w:rPr>
+              </m:ctrlPr>
+            </m:radPr>
+            <m:deg/>
+            <m:e>
+              <m:f>
+                <m:fPr>
+                  <m:ctrlPr>
+                    <w:rPr>
+                      <w:rFonts w:ascii="Cambria Math" w:hAnsi="Cambria Math"/>
+                      <w:i/>
+                      <w:sz w:val="28"/>
+                      <w:szCs w:val="28"/>
+                      <w:lang w:val="en-DE"/>
+                    </w:rPr>
+                  </m:ctrlPr>
+                </m:fPr>
+                <m:num>
+                  <m:sSup>
+                    <m:sSupPr>
+                      <m:ctrlPr>
+                        <w:rPr>
+                          <w:rFonts w:ascii="Cambria Math" w:hAnsi="Cambria Math"/>
+                          <w:i/>
+                          <w:sz w:val="28"/>
+                          <w:szCs w:val="28"/>
+                          <w:lang w:val="en-DE"/>
+                        </w:rPr>
+                      </m:ctrlPr>
+                    </m:sSupPr>
+                    <m:e>
+                      <m:r>
+                        <w:rPr>
+                          <w:rFonts w:ascii="Cambria Math" w:hAnsi="Cambria Math"/>
+                          <w:sz w:val="28"/>
+                          <w:szCs w:val="28"/>
+                          <w:lang w:val="en-DE"/>
+                        </w:rPr>
+                        <m:t>10</m:t>
+                      </m:r>
+                    </m:e>
+                    <m:sup>
+                      <m:r>
+                        <w:rPr>
+                          <w:rFonts w:ascii="Cambria Math" w:hAnsi="Cambria Math"/>
+                          <w:sz w:val="28"/>
+                          <w:szCs w:val="28"/>
+                          <w:lang w:val="en-DE"/>
+                        </w:rPr>
+                        <m:t>(dBm/10)</m:t>
+                      </m:r>
+                    </m:sup>
+                  </m:sSup>
+                  <m:r>
+                    <w:rPr>
+                      <w:rFonts w:ascii="Cambria Math" w:hAnsi="Cambria Math"/>
+                      <w:sz w:val="28"/>
+                      <w:szCs w:val="28"/>
+                      <w:lang w:val="en-DE"/>
+                    </w:rPr>
+                    <m:t>×R</m:t>
+                  </m:r>
+                </m:num>
+                <m:den>
+                  <m:r>
+                    <w:rPr>
+                      <w:rFonts w:ascii="Cambria Math" w:hAnsi="Cambria Math"/>
+                      <w:sz w:val="28"/>
+                      <w:szCs w:val="28"/>
+                      <w:lang w:val="en-DE"/>
+                    </w:rPr>
+                    <m:t>1000</m:t>
+                  </m:r>
+                </m:den>
+              </m:f>
+            </m:e>
+          </m:rad>
+          <m:r>
+            <w:rPr>
+              <w:rFonts w:ascii="Cambria Math" w:hAnsi="Cambria Math"/>
+              <w:lang w:val="en-DE"/>
+            </w:rPr>
+            <m:t xml:space="preserve"> </m:t>
+          </m:r>
+          <m:r>
+            <w:rPr>
+              <w:rFonts w:ascii="Source Sans Pro" w:eastAsiaTheme="minorEastAsia" w:hAnsi="Source Sans Pro"/>
+              <w:lang w:val="en-DE"/>
+            </w:rPr>
+            <w:br/>
+          </m:r>
+        </m:oMath>
+      </m:oMathPara>
+      <w:r>
+        <w:rPr>
+          <w:rFonts w:ascii="Source Sans Pro" w:eastAsiaTheme="minorEastAsia" w:hAnsi="Source Sans Pro"/>
+          <w:lang w:val="en-DE"/>
+        </w:rPr>
+        <w:t xml:space="preserve">Where: </w:t>
+      </w:r>
+    </w:p>
+    <w:p>
+      <w:pPr>
+        <w:numPr>
+          <w:ilvl w:val="0"/>
+          <w:numId w:val="9"/>
+        </w:numPr>
+        <w:jc w:val="both"/>
+        <w:rPr>
+          <w:rFonts w:ascii="Source Sans Pro" w:hAnsi="Source Sans Pro"/>
+          <w:lang w:val="en-DE"/>
+        </w:rPr>
+      </w:pPr>
+      <w:r>
+        <w:rPr>
+          <w:rFonts w:ascii="Source Sans Pro" w:hAnsi="Source Sans Pro"/>
+          <w:lang w:val="en-DE"/>
+        </w:rPr>
+        <w:t>R</w:t>
+      </w:r>
+      <w:r>
+        <w:rPr>
+          <w:rFonts w:ascii="Source Sans Pro" w:hAnsi="Source Sans Pro"/>
+          <w:lang w:val="en-DE"/>
+        </w:rPr>
+        <w:t xml:space="preserve"> is the load impedance</w:t>
+      </w:r>
+      <w:r>
+        <w:rPr>
+          <w:rFonts w:ascii="Source Sans Pro" w:hAnsi="Source Sans Pro"/>
+          <w:lang w:val="en-DE"/>
+        </w:rPr>
+        <w:t xml:space="preserve">, </w:t>
+      </w:r>
+      <w:r>
+        <w:rPr>
+          <w:rFonts w:ascii="Source Sans Pro" w:hAnsi="Source Sans Pro"/>
+          <w:lang w:val="en-DE"/>
+        </w:rPr>
+        <w:t>50Ω</w:t>
+      </w:r>
+      <w:r>
+        <w:rPr>
+          <w:rFonts w:ascii="Source Sans Pro" w:hAnsi="Source Sans Pro"/>
+          <w:lang w:val="en-DE"/>
+        </w:rPr>
+        <w:t xml:space="preserve"> for </w:t>
+      </w:r>
+      <w:r>
+        <w:rPr>
+          <w:rFonts w:ascii="Source Sans Pro" w:hAnsi="Source Sans Pro"/>
+          <w:lang w:val="en-DE"/>
+        </w:rPr>
+        <w:t>Bode 500</w:t>
+      </w:r>
+    </w:p>
+    <w:p>
+      <w:pPr>
+        <w:ind w:firstLine="720"/>
+        <w:jc w:val="both"/>
+        <w:rPr>
+          <w:rFonts w:ascii="Source Sans Pro" w:hAnsi="Source Sans Pro"/>
+          <w:lang w:val="en-DE"/>
+        </w:rPr>
+      </w:pPr>
+      <w:r>
+        <w:rPr>
+          <w:rFonts w:ascii="Source Sans Pro" w:hAnsi="Source Sans Pro"/>
+          <w:lang w:val="en-DE"/>
+        </w:rPr>
+        <w:t>For a 50Ω impedance</w:t>
+      </w:r>
+      <w:r>
+        <w:rPr>
+          <w:rFonts w:ascii="Source Sans Pro" w:hAnsi="Source Sans Pro"/>
+          <w:lang w:val="en-DE"/>
+        </w:rPr>
+        <w:t xml:space="preserve">, </w:t>
+      </w:r>
+      <m:oMath>
+        <m:sSub>
+          <m:sSubPr>
+            <m:ctrlPr>
+              <w:rPr>
+                <w:rFonts w:ascii="Cambria Math" w:hAnsi="Cambria Math"/>
+                <w:i/>
+                <w:lang w:val="en-DE"/>
+              </w:rPr>
+            </m:ctrlPr>
+          </m:sSubPr>
+          <m:e>
+            <m:r>
+              <w:rPr>
+                <w:rFonts w:ascii="Cambria Math" w:hAnsi="Cambria Math"/>
+                <w:lang w:val="en-DE"/>
+              </w:rPr>
+              <m:t>V</m:t>
+            </m:r>
+          </m:e>
+          <m:sub>
+            <m:r>
+              <w:rPr>
+                <w:rFonts w:ascii="Cambria Math" w:hAnsi="Cambria Math"/>
+                <w:lang w:val="en-DE"/>
+              </w:rPr>
+              <m:t>rms</m:t>
+            </m:r>
+          </m:sub>
+        </m:sSub>
+        <m:r>
+          <w:rPr>
+            <w:rFonts w:ascii="Cambria Math" w:hAnsi="Cambria Math"/>
+            <w:lang w:val="en-DE"/>
+          </w:rPr>
+          <m:t xml:space="preserve"> </m:t>
+        </m:r>
+      </m:oMath>
+      <w:r>
+        <w:rPr>
+          <w:rFonts w:ascii="Source Sans Pro" w:hAnsi="Source Sans Pro"/>
+          <w:lang w:val="en-DE"/>
+        </w:rPr>
+        <w:t>is simplified to:</w:t>
+      </w:r>
+    </w:p>
+    <w:p>
+      <w:pPr>
+        <w:ind w:firstLine="720"/>
+        <w:jc w:val="both"/>
+        <w:rPr>
+          <w:rFonts w:ascii="Source Sans Pro" w:eastAsiaTheme="minorEastAsia" w:hAnsi="Source Sans Pro"/>
+          <w:sz w:val="28"/>
+          <w:szCs w:val="28"/>
+          <w:lang w:val="en-DE"/>
+        </w:rPr>
+      </w:pPr>
+      <m:oMathPara>
+        <m:oMath>
+          <m:sSub>
+            <m:sSubPr>
+              <m:ctrlPr>
+                <w:rPr>
+                  <w:rFonts w:ascii="Cambria Math" w:hAnsi="Cambria Math"/>
+                  <w:i/>
+                  <w:sz w:val="28"/>
+                  <w:szCs w:val="28"/>
+                  <w:lang w:val="en-DE"/>
+                </w:rPr>
+              </m:ctrlPr>
+            </m:sSubPr>
+            <m:e>
+              <m:r>
+                <w:rPr>
+                  <w:rFonts w:ascii="Cambria Math" w:hAnsi="Cambria Math"/>
+                  <w:sz w:val="28"/>
+                  <w:szCs w:val="28"/>
+                  <w:lang w:val="en-DE"/>
+                </w:rPr>
+                <m:t>V</m:t>
+              </m:r>
+            </m:e>
+            <m:sub>
+              <m:r>
+                <w:rPr>
+                  <w:rFonts w:ascii="Cambria Math" w:hAnsi="Cambria Math"/>
+                  <w:sz w:val="28"/>
+                  <w:szCs w:val="28"/>
+                  <w:lang w:val="en-DE"/>
+                </w:rPr>
+                <m:t>rms</m:t>
+              </m:r>
+            </m:sub>
+          </m:sSub>
+          <m:r>
+            <w:rPr>
+              <w:rFonts w:ascii="Cambria Math" w:hAnsi="Cambria Math"/>
+              <w:sz w:val="28"/>
+              <w:szCs w:val="28"/>
+              <w:lang w:val="en-DE"/>
+            </w:rPr>
+            <m:t xml:space="preserve">=0.2236* </m:t>
+          </m:r>
+          <m:sSup>
+            <m:sSupPr>
+              <m:ctrlPr>
+                <w:rPr>
+                  <w:rFonts w:ascii="Cambria Math" w:hAnsi="Cambria Math"/>
+                  <w:i/>
+                  <w:sz w:val="28"/>
+                  <w:szCs w:val="28"/>
+                  <w:lang w:val="en-DE"/>
+                </w:rPr>
+              </m:ctrlPr>
+            </m:sSupPr>
+            <m:e>
+              <m:r>
+                <w:rPr>
+                  <w:rFonts w:ascii="Cambria Math" w:hAnsi="Cambria Math"/>
+                  <w:sz w:val="28"/>
+                  <w:szCs w:val="28"/>
+                  <w:lang w:val="en-DE"/>
+                </w:rPr>
+                <m:t>10</m:t>
+              </m:r>
+            </m:e>
+            <m:sup>
+              <m:r>
+                <w:rPr>
+                  <w:rFonts w:ascii="Cambria Math" w:hAnsi="Cambria Math"/>
+                  <w:sz w:val="28"/>
+                  <w:szCs w:val="28"/>
+                  <w:lang w:val="en-DE"/>
+                </w:rPr>
+                <m:t>(dBm/</m:t>
+              </m:r>
+              <m:r>
+                <w:rPr>
+                  <w:rFonts w:ascii="Cambria Math" w:hAnsi="Cambria Math"/>
+                  <w:sz w:val="28"/>
+                  <w:szCs w:val="28"/>
+                  <w:lang w:val="en-DE"/>
+                </w:rPr>
+                <m:t>2</m:t>
+              </m:r>
+              <m:r>
+                <w:rPr>
+                  <w:rFonts w:ascii="Cambria Math" w:hAnsi="Cambria Math"/>
+                  <w:sz w:val="28"/>
+                  <w:szCs w:val="28"/>
+                  <w:lang w:val="en-DE"/>
+                </w:rPr>
+                <m:t>0)</m:t>
+              </m:r>
+            </m:sup>
+          </m:sSup>
+        </m:oMath>
+      </m:oMathPara>
+    </w:p>
+    <w:p>
+      <w:pPr>
+        <w:ind w:firstLine="720"/>
+        <w:jc w:val="both"/>
+        <w:rPr>
+          <w:rFonts w:ascii="Source Sans Pro" w:eastAsiaTheme="minorEastAsia" w:hAnsi="Source Sans Pro"/>
+          <w:sz w:val="28"/>
+          <w:szCs w:val="28"/>
+          <w:lang w:val="en-DE"/>
+        </w:rPr>
+      </w:pPr>
+      <w:r>
+        <w:rPr>
+          <w:rFonts w:ascii="Source Sans Pro" w:eastAsiaTheme="minorEastAsia" w:hAnsi="Source Sans Pro"/>
+          <w:sz w:val="28"/>
+          <w:szCs w:val="28"/>
+          <w:lang w:val="en-DE"/>
+        </w:rPr>
+        <w:t>Therefore:</w:t>
+      </w:r>
+      <w:r>
+        <w:rPr>
+          <w:rFonts w:ascii="Source Sans Pro" w:eastAsiaTheme="minorEastAsia" w:hAnsi="Source Sans Pro"/>
+          <w:sz w:val="28"/>
+          <w:szCs w:val="28"/>
+          <w:lang w:val="en-DE"/>
+        </w:rPr>
+        <w:br/>
+      </w:r>
+      <w:r>
+        <w:rPr>
+          <w:rFonts w:ascii="Source Sans Pro" w:eastAsiaTheme="minorEastAsia" w:hAnsi="Source Sans Pro"/>
+          <w:sz w:val="28"/>
+          <w:szCs w:val="28"/>
+          <w:lang w:val="en-DE"/>
+        </w:rPr>
+        <w:tab/>
+        <w:t>0 dBm = 0.2236 V</w:t>
+      </w:r>
+    </w:p>
+    <w:p>
+      <w:pPr>
+        <w:ind w:firstLine="720"/>
+        <w:jc w:val="both"/>
+        <w:rPr>
+          <w:rFonts w:ascii="Source Sans Pro" w:eastAsiaTheme="minorEastAsia" w:hAnsi="Source Sans Pro"/>
+          <w:sz w:val="28"/>
+          <w:szCs w:val="28"/>
+          <w:lang w:val="en-DE"/>
+        </w:rPr>
+      </w:pPr>
+      <w:r>
+        <w:rPr>
+          <w:rFonts w:ascii="Source Sans Pro" w:eastAsiaTheme="minorEastAsia" w:hAnsi="Source Sans Pro"/>
+          <w:sz w:val="28"/>
+          <w:szCs w:val="28"/>
+          <w:lang w:val="en-DE"/>
+        </w:rPr>
+        <w:t>13</w:t>
+      </w:r>
+      <w:r>
+        <w:rPr>
+          <w:rFonts w:ascii="Source Sans Pro" w:eastAsiaTheme="minorEastAsia" w:hAnsi="Source Sans Pro"/>
+          <w:sz w:val="28"/>
+          <w:szCs w:val="28"/>
+          <w:lang w:val="en-DE"/>
+        </w:rPr>
+        <w:t xml:space="preserve"> dBm = </w:t>
+      </w:r>
+      <w:r>
+        <w:rPr>
+          <w:rFonts w:ascii="Source Sans Pro" w:eastAsiaTheme="minorEastAsia" w:hAnsi="Source Sans Pro"/>
+          <w:sz w:val="28"/>
+          <w:szCs w:val="28"/>
+          <w:lang w:val="en-DE"/>
+        </w:rPr>
+        <w:t xml:space="preserve">1 </w:t>
+      </w:r>
+      <w:r>
+        <w:rPr>
+          <w:rFonts w:ascii="Source Sans Pro" w:eastAsiaTheme="minorEastAsia" w:hAnsi="Source Sans Pro"/>
+          <w:sz w:val="28"/>
+          <w:szCs w:val="28"/>
+          <w:lang w:val="en-DE"/>
+        </w:rPr>
+        <w:t>V</w:t>
+      </w:r>
+    </w:p>
+    <w:p>
+      <w:pPr>
+        <w:ind w:firstLine="720"/>
+        <w:jc w:val="both"/>
+        <w:rPr>
+          <w:rFonts w:ascii="Source Sans Pro" w:eastAsiaTheme="minorEastAsia" w:hAnsi="Source Sans Pro"/>
+          <w:sz w:val="28"/>
+          <w:szCs w:val="28"/>
+          <w:lang w:val="en-DE"/>
+        </w:rPr>
+      </w:pPr>
+      <w:r>
+        <w:rPr>
+          <w:rFonts w:ascii="Source Sans Pro" w:eastAsiaTheme="minorEastAsia" w:hAnsi="Source Sans Pro"/>
+          <w:sz w:val="28"/>
+          <w:szCs w:val="28"/>
+          <w:lang w:val="en-DE"/>
+        </w:rPr>
+        <w:t>15</w:t>
+      </w:r>
+      <w:r>
+        <w:rPr>
+          <w:rFonts w:ascii="Source Sans Pro" w:eastAsiaTheme="minorEastAsia" w:hAnsi="Source Sans Pro"/>
+          <w:sz w:val="28"/>
+          <w:szCs w:val="28"/>
+          <w:lang w:val="en-DE"/>
+        </w:rPr>
+        <w:t xml:space="preserve"> dBm = </w:t>
+      </w:r>
+      <w:r>
+        <w:rPr>
+          <w:rFonts w:ascii="Source Sans Pro" w:eastAsiaTheme="minorEastAsia" w:hAnsi="Source Sans Pro"/>
+          <w:sz w:val="28"/>
+          <w:szCs w:val="28"/>
+          <w:lang w:val="en-DE"/>
+        </w:rPr>
+        <w:t>1.26</w:t>
+      </w:r>
+      <w:r>
+        <w:rPr>
+          <w:rFonts w:ascii="Source Sans Pro" w:eastAsiaTheme="minorEastAsia" w:hAnsi="Source Sans Pro"/>
+          <w:sz w:val="28"/>
+          <w:szCs w:val="28"/>
+          <w:lang w:val="en-DE"/>
+        </w:rPr>
+        <w:t xml:space="preserve"> V</w:t>
+      </w:r>
+    </w:p>
+    <w:p>
+      <w:pPr>
+        <w:jc w:val="both"/>
+        <w:rPr>
+          <w:rFonts w:ascii="Source Sans Pro" w:eastAsiaTheme="minorEastAsia" w:hAnsi="Source Sans Pro"/>
+          <w:b/>
+          <w:bCs/>
+          <w:sz w:val="28"/>
+          <w:szCs w:val="28"/>
+          <w:lang w:val="en-DE"/>
+        </w:rPr>
+      </w:pPr>
+      <w:r>
+        <w:rPr>
+          <w:rFonts w:ascii="Source Sans Pro" w:eastAsiaTheme="minorEastAsia" w:hAnsi="Source Sans Pro"/>
+          <w:b/>
+          <w:bCs/>
+          <w:sz w:val="28"/>
+          <w:szCs w:val="28"/>
+          <w:lang w:val="en-DE"/>
+        </w:rPr>
+        <w:t>Spitzenberger APS 1000 Voltage to Current Conversion:</w:t>
+      </w:r>
+    </w:p>
+    <w:p>
+      <w:pPr>
+        <w:jc w:val="both"/>
+        <w:rPr>
+          <w:rFonts w:ascii="Source Sans Pro" w:eastAsiaTheme="minorEastAsia" w:hAnsi="Source Sans Pro"/>
+          <w:b/>
+          <w:bCs/>
+          <w:sz w:val="28"/>
+          <w:szCs w:val="28"/>
+          <w:lang w:val="en-DE"/>
+        </w:rPr>
+      </w:pPr>
+      <w:r>
+        <w:rPr>
+          <w:rFonts w:ascii="Source Sans Pro" w:eastAsiaTheme="minorEastAsia" w:hAnsi="Source Sans Pro"/>
+          <w:b/>
+          <w:bCs/>
+          <w:sz w:val="28"/>
+          <w:szCs w:val="28"/>
+          <w:lang w:val="en-DE"/>
+        </w:rPr>
+        <w:t xml:space="preserve">Observed </w:t>
+      </w:r>
+      <w:r>
+        <w:rPr>
+          <w:rFonts w:ascii="Source Sans Pro" w:eastAsiaTheme="minorEastAsia" w:hAnsi="Source Sans Pro"/>
+          <w:b/>
+          <w:bCs/>
+          <w:sz w:val="28"/>
+          <w:szCs w:val="28"/>
+          <w:lang w:val="en-DE"/>
+        </w:rPr>
+        <w:t>Spitzenberger Output Current</w:t>
+      </w:r>
+      <w:r>
+        <w:rPr>
+          <w:rFonts w:ascii="Source Sans Pro" w:eastAsiaTheme="minorEastAsia" w:hAnsi="Source Sans Pro"/>
+          <w:b/>
+          <w:bCs/>
+          <w:sz w:val="28"/>
+          <w:szCs w:val="28"/>
+          <w:lang w:val="en-DE"/>
+        </w:rPr>
+        <w:t>:</w:t>
+      </w:r>
+    </w:p>
+    <w:p>
+      <w:pPr>
+        <w:ind w:firstLine="720"/>
+        <w:jc w:val="both"/>
+        <w:rPr>
+          <w:rFonts w:ascii="Source Sans Pro" w:hAnsi="Source Sans Pro"/>
+        </w:rPr>
+      </w:pPr>
+      <w:r>
+        <w:rPr>
+          <w:rFonts w:ascii="Source Sans Pro" w:eastAsiaTheme="minorEastAsia" w:hAnsi="Source Sans Pro"/>
+          <w:b/>
+          <w:bCs/>
+          <w:sz w:val="28"/>
+          <w:szCs w:val="28"/>
+          <w:lang w:val="en-DE"/>
+        </w:rPr>
+        <w:t xml:space="preserve"> </w:t>
+      </w:r>
+      <w:r>
+        <w:rPr>
+          <w:rFonts w:ascii="Source Sans Pro" w:hAnsi="Source Sans Pro"/>
+        </w:rPr>
+        <w:t xml:space="preserve">0 </w:t>
+      </w:r>
+      <w:proofErr w:type="spellStart"/>
+      <w:r>
+        <w:rPr>
+          <w:rFonts w:ascii="Source Sans Pro" w:hAnsi="Source Sans Pro"/>
+        </w:rPr>
+        <w:t>dbm</w:t>
+      </w:r>
+      <w:proofErr w:type="spellEnd"/>
+      <w:r>
+        <w:rPr>
+          <w:rFonts w:ascii="Source Sans Pro" w:hAnsi="Source Sans Pro"/>
+        </w:rPr>
+        <w:t xml:space="preserve"> -&gt; 1.178A</w:t>
+      </w:r>
+    </w:p>
+    <w:p>
+      <w:pPr>
+        <w:ind w:firstLine="720"/>
+        <w:jc w:val="both"/>
+        <w:rPr>
+          <w:rFonts w:ascii="Source Sans Pro" w:hAnsi="Source Sans Pro"/>
+        </w:rPr>
+      </w:pPr>
+      <w:r>
+        <w:rPr>
+          <w:rFonts w:ascii="Source Sans Pro" w:hAnsi="Source Sans Pro"/>
+        </w:rPr>
+        <w:t xml:space="preserve">13 </w:t>
+      </w:r>
+      <w:proofErr w:type="spellStart"/>
+      <w:r>
+        <w:rPr>
+          <w:rFonts w:ascii="Source Sans Pro" w:hAnsi="Source Sans Pro"/>
+        </w:rPr>
+        <w:t>dbm</w:t>
+      </w:r>
+      <w:proofErr w:type="spellEnd"/>
+      <w:r>
+        <w:rPr>
+          <w:rFonts w:ascii="Source Sans Pro" w:hAnsi="Source Sans Pro"/>
+        </w:rPr>
+        <w:t xml:space="preserve"> -&gt; 5.278 A</w:t>
+      </w:r>
+    </w:p>
+    <w:p>
+      <w:pPr>
+        <w:ind w:firstLine="720"/>
+        <w:jc w:val="both"/>
+        <w:rPr>
+          <w:rFonts w:ascii="Source Sans Pro" w:hAnsi="Source Sans Pro"/>
+        </w:rPr>
+      </w:pPr>
+      <w:r>
+        <w:rPr>
+          <w:rFonts w:ascii="Source Sans Pro" w:hAnsi="Source Sans Pro"/>
+        </w:rPr>
+        <w:t xml:space="preserve">15 </w:t>
+      </w:r>
+      <w:proofErr w:type="spellStart"/>
+      <w:r>
+        <w:rPr>
+          <w:rFonts w:ascii="Source Sans Pro" w:hAnsi="Source Sans Pro"/>
+        </w:rPr>
+        <w:t>dbm</w:t>
+      </w:r>
+      <w:proofErr w:type="spellEnd"/>
+      <w:r>
+        <w:rPr>
+          <w:rFonts w:ascii="Source Sans Pro" w:hAnsi="Source Sans Pro"/>
+        </w:rPr>
+        <w:t xml:space="preserve"> -&gt; 6.65 A</w:t>
+      </w:r>
+    </w:p>
+    <w:p>
+      <w:pPr>
+        <w:jc w:val="both"/>
+        <w:rPr>
+          <w:rFonts w:ascii="Source Sans Pro" w:eastAsiaTheme="minorEastAsia" w:hAnsi="Source Sans Pro"/>
+          <w:b/>
+          <w:bCs/>
+          <w:sz w:val="28"/>
+          <w:szCs w:val="28"/>
+        </w:rPr>
+      </w:pPr>
+      <m:oMathPara>
+        <m:oMath>
+          <m:r>
+            <m:rPr>
+              <m:sty m:val="bi"/>
+            </m:rPr>
+            <w:rPr>
+              <w:rFonts w:ascii="Cambria Math" w:eastAsiaTheme="minorEastAsia" w:hAnsi="Cambria Math"/>
+              <w:sz w:val="28"/>
+              <w:szCs w:val="28"/>
+            </w:rPr>
+            <w:lastRenderedPageBreak/>
+            <m:t>Gain=</m:t>
+          </m:r>
+          <m:f>
+            <m:fPr>
+              <m:ctrlPr>
+                <w:rPr>
+                  <w:rFonts w:ascii="Cambria Math" w:eastAsiaTheme="minorEastAsia" w:hAnsi="Cambria Math"/>
+                  <w:b/>
+                  <w:bCs/>
+                  <w:i/>
+                  <w:sz w:val="28"/>
+                  <w:szCs w:val="28"/>
+                </w:rPr>
+              </m:ctrlPr>
+            </m:fPr>
+            <m:num>
+              <m:sSub>
+                <m:sSubPr>
+                  <m:ctrlPr>
+                    <w:rPr>
+                      <w:rFonts w:ascii="Cambria Math" w:eastAsiaTheme="minorEastAsia" w:hAnsi="Cambria Math"/>
+                      <w:b/>
+                      <w:bCs/>
+                      <w:i/>
+                      <w:sz w:val="28"/>
+                      <w:szCs w:val="28"/>
+                    </w:rPr>
+                  </m:ctrlPr>
+                </m:sSubPr>
+                <m:e>
+                  <m:r>
+                    <m:rPr>
+                      <m:sty m:val="bi"/>
+                    </m:rPr>
+                    <w:rPr>
+                      <w:rFonts w:ascii="Cambria Math" w:eastAsiaTheme="minorEastAsia" w:hAnsi="Cambria Math"/>
+                      <w:sz w:val="28"/>
+                      <w:szCs w:val="28"/>
+                    </w:rPr>
+                    <m:t>I</m:t>
+                  </m:r>
+                </m:e>
+                <m:sub>
+                  <m:r>
+                    <m:rPr>
+                      <m:sty m:val="bi"/>
+                    </m:rPr>
+                    <w:rPr>
+                      <w:rFonts w:ascii="Cambria Math" w:eastAsiaTheme="minorEastAsia" w:hAnsi="Cambria Math"/>
+                      <w:sz w:val="28"/>
+                      <w:szCs w:val="28"/>
+                    </w:rPr>
+                    <m:t>out</m:t>
+                  </m:r>
+                </m:sub>
+              </m:sSub>
+            </m:num>
+            <m:den>
+              <m:sSub>
+                <m:sSubPr>
+                  <m:ctrlPr>
+                    <w:rPr>
+                      <w:rFonts w:ascii="Cambria Math" w:eastAsiaTheme="minorEastAsia" w:hAnsi="Cambria Math"/>
+                      <w:b/>
+                      <w:bCs/>
+                      <w:i/>
+                      <w:sz w:val="28"/>
+                      <w:szCs w:val="28"/>
+                    </w:rPr>
+                  </m:ctrlPr>
+                </m:sSubPr>
+                <m:e>
+                  <m:r>
+                    <m:rPr>
+                      <m:sty m:val="bi"/>
+                    </m:rPr>
+                    <w:rPr>
+                      <w:rFonts w:ascii="Cambria Math" w:eastAsiaTheme="minorEastAsia" w:hAnsi="Cambria Math"/>
+                      <w:sz w:val="28"/>
+                      <w:szCs w:val="28"/>
+                    </w:rPr>
+                    <m:t>V</m:t>
+                  </m:r>
+                </m:e>
+                <m:sub>
+                  <m:r>
+                    <m:rPr>
+                      <m:sty m:val="bi"/>
+                    </m:rPr>
+                    <w:rPr>
+                      <w:rFonts w:ascii="Cambria Math" w:eastAsiaTheme="minorEastAsia" w:hAnsi="Cambria Math"/>
+                      <w:sz w:val="28"/>
+                      <w:szCs w:val="28"/>
+                    </w:rPr>
+                    <m:t>in</m:t>
+                  </m:r>
+                </m:sub>
+              </m:sSub>
+            </m:den>
+          </m:f>
+        </m:oMath>
+      </m:oMathPara>
+    </w:p>
+    <w:p>
+      <w:pPr>
+        <w:pStyle w:val="ListParagraph"/>
+        <w:numPr>
+          <w:ilvl w:val="0"/>
+          <w:numId w:val="7"/>
+        </w:numPr>
+        <w:jc w:val="both"/>
+        <w:rPr>
+          <w:rFonts w:ascii="Source Sans Pro" w:hAnsi="Source Sans Pro"/>
+          <w:sz w:val="28"/>
+          <w:szCs w:val="28"/>
+          <w:lang w:val="en-DE"/>
+        </w:rPr>
+      </w:pPr>
+      <w:r>
+        <w:rPr>
+          <w:rFonts w:ascii="Source Sans Pro" w:hAnsi="Source Sans Pro"/>
+          <w:sz w:val="28"/>
+          <w:szCs w:val="28"/>
+          <w:lang w:val="en-DE"/>
+        </w:rPr>
+        <w:t xml:space="preserve">Spitzenberger has amplification of 5.28 A/V </w:t>
+      </w:r>
+    </w:p>
+    <w:p>
+      <w:pPr>
+        <w:jc w:val="both"/>
+        <w:rPr>
+          <w:rFonts w:ascii="Source Sans Pro" w:hAnsi="Source Sans Pro"/>
+          <w:sz w:val="28"/>
+          <w:szCs w:val="28"/>
+          <w:lang w:val="en-DE"/>
+        </w:rPr>
+      </w:pPr>
+      <m:oMathPara>
+        <m:oMath>
+          <m:sSub>
+            <m:sSubPr>
+              <m:ctrlPr>
+                <w:rPr>
+                  <w:rFonts w:ascii="Cambria Math" w:hAnsi="Cambria Math"/>
+                  <w:i/>
+                  <w:sz w:val="28"/>
+                  <w:szCs w:val="28"/>
+                  <w:lang w:val="en-DE"/>
+                </w:rPr>
+              </m:ctrlPr>
+            </m:sSubPr>
+            <m:e>
+              <m:r>
+                <w:rPr>
+                  <w:rFonts w:ascii="Cambria Math" w:hAnsi="Cambria Math"/>
+                  <w:sz w:val="28"/>
+                  <w:szCs w:val="28"/>
+                  <w:lang w:val="en-DE"/>
+                </w:rPr>
+                <m:t>I</m:t>
+              </m:r>
+            </m:e>
+            <m:sub>
+              <m:r>
+                <w:rPr>
+                  <w:rFonts w:ascii="Cambria Math" w:hAnsi="Cambria Math"/>
+                  <w:sz w:val="28"/>
+                  <w:szCs w:val="28"/>
+                  <w:lang w:val="en-DE"/>
+                </w:rPr>
+                <m:t>rms</m:t>
+              </m:r>
+            </m:sub>
+          </m:sSub>
+          <m:r>
+            <w:rPr>
+              <w:rFonts w:ascii="Cambria Math" w:hAnsi="Cambria Math"/>
+              <w:sz w:val="28"/>
+              <w:szCs w:val="28"/>
+              <w:lang w:val="en-DE"/>
+            </w:rPr>
+            <m:t>=5.28*</m:t>
+          </m:r>
+          <m:sSub>
+            <m:sSubPr>
+              <m:ctrlPr>
+                <w:rPr>
+                  <w:rFonts w:ascii="Cambria Math" w:hAnsi="Cambria Math"/>
+                  <w:i/>
+                  <w:sz w:val="28"/>
+                  <w:szCs w:val="28"/>
+                  <w:lang w:val="en-DE"/>
+                </w:rPr>
+              </m:ctrlPr>
+            </m:sSubPr>
+            <m:e>
+              <m:r>
+                <w:rPr>
+                  <w:rFonts w:ascii="Cambria Math" w:hAnsi="Cambria Math"/>
+                  <w:sz w:val="28"/>
+                  <w:szCs w:val="28"/>
+                  <w:lang w:val="en-DE"/>
+                </w:rPr>
+                <m:t>V</m:t>
+              </m:r>
+            </m:e>
+            <m:sub>
+              <m:r>
+                <w:rPr>
+                  <w:rFonts w:ascii="Cambria Math" w:hAnsi="Cambria Math"/>
+                  <w:sz w:val="28"/>
+                  <w:szCs w:val="28"/>
+                  <w:lang w:val="en-DE"/>
+                </w:rPr>
+                <m:t>rms</m:t>
+              </m:r>
+            </m:sub>
+          </m:sSub>
+        </m:oMath>
+      </m:oMathPara>
     </w:p>
     <w:sectPr>
       <w:pgSz w:w="11906" w:h="16838" w:code="9"/>
@@ -4084,6 +5743,155 @@
     </w:lvl>
   </w:abstractNum>
   <w:abstractNum w:abstractNumId="4" w15:restartNumberingAfterBreak="0">
+    <w:nsid w:val="272034BB"/>
+    <w:multiLevelType w:val="multilevel"/>
+    <w:tmpl w:val="2B408B96"/>
+    <w:lvl w:ilvl="0">
+      <w:start w:val="1"/>
+      <w:numFmt w:val="bullet"/>
+      <w:lvlText w:val=""/>
+      <w:lvlJc w:val="left"/>
+      <w:pPr>
+        <w:tabs>
+          <w:tab w:val="num" w:pos="720"/>
+        </w:tabs>
+        <w:ind w:left="720" w:hanging="360"/>
+      </w:pPr>
+      <w:rPr>
+        <w:rFonts w:ascii="Symbol" w:hAnsi="Symbol" w:hint="default"/>
+        <w:sz w:val="20"/>
+      </w:rPr>
+    </w:lvl>
+    <w:lvl w:ilvl="1" w:tentative="1">
+      <w:start w:val="1"/>
+      <w:numFmt w:val="bullet"/>
+      <w:lvlText w:val="o"/>
+      <w:lvlJc w:val="left"/>
+      <w:pPr>
+        <w:tabs>
+          <w:tab w:val="num" w:pos="1440"/>
+        </w:tabs>
+        <w:ind w:left="1440" w:hanging="360"/>
+      </w:pPr>
+      <w:rPr>
+        <w:rFonts w:ascii="Courier New" w:hAnsi="Courier New" w:hint="default"/>
+        <w:sz w:val="20"/>
+      </w:rPr>
+    </w:lvl>
+    <w:lvl w:ilvl="2" w:tentative="1">
+      <w:start w:val="1"/>
+      <w:numFmt w:val="bullet"/>
+      <w:lvlText w:val=""/>
+      <w:lvlJc w:val="left"/>
+      <w:pPr>
+        <w:tabs>
+          <w:tab w:val="num" w:pos="2160"/>
+        </w:tabs>
+        <w:ind w:left="2160" w:hanging="360"/>
+      </w:pPr>
+      <w:rPr>
+        <w:rFonts w:ascii="Wingdings" w:hAnsi="Wingdings" w:hint="default"/>
+        <w:sz w:val="20"/>
+      </w:rPr>
+    </w:lvl>
+    <w:lvl w:ilvl="3" w:tentative="1">
+      <w:start w:val="1"/>
+      <w:numFmt w:val="bullet"/>
+      <w:lvlText w:val=""/>
+      <w:lvlJc w:val="left"/>
+      <w:pPr>
+        <w:tabs>
+          <w:tab w:val="num" w:pos="2880"/>
+        </w:tabs>
+        <w:ind w:left="2880" w:hanging="360"/>
+      </w:pPr>
+      <w:rPr>
+        <w:rFonts w:ascii="Wingdings" w:hAnsi="Wingdings" w:hint="default"/>
+        <w:sz w:val="20"/>
+      </w:rPr>
+    </w:lvl>
+    <w:lvl w:ilvl="4" w:tentative="1">
+      <w:start w:val="1"/>
+      <w:numFmt w:val="bullet"/>
+      <w:lvlText w:val=""/>
+      <w:lvlJc w:val="left"/>
+      <w:pPr>
+        <w:tabs>
+          <w:tab w:val="num" w:pos="3600"/>
+        </w:tabs>
+        <w:ind w:left="3600" w:hanging="360"/>
+      </w:pPr>
+      <w:rPr>
+        <w:rFonts w:ascii="Wingdings" w:hAnsi="Wingdings" w:hint="default"/>
+        <w:sz w:val="20"/>
+      </w:rPr>
+    </w:lvl>
+    <w:lvl w:ilvl="5" w:tentative="1">
+      <w:start w:val="1"/>
+      <w:numFmt w:val="bullet"/>
+      <w:lvlText w:val=""/>
+      <w:lvlJc w:val="left"/>
+      <w:pPr>
+        <w:tabs>
+          <w:tab w:val="num" w:pos="4320"/>
+        </w:tabs>
+        <w:ind w:left="4320" w:hanging="360"/>
+      </w:pPr>
+      <w:rPr>
+        <w:rFonts w:ascii="Wingdings" w:hAnsi="Wingdings" w:hint="default"/>
+        <w:sz w:val="20"/>
+      </w:rPr>
+    </w:lvl>
+    <w:lvl w:ilvl="6" w:tentative="1">
+      <w:start w:val="1"/>
+      <w:numFmt w:val="bullet"/>
+      <w:lvlText w:val=""/>
+      <w:lvlJc w:val="left"/>
+      <w:pPr>
+        <w:tabs>
+          <w:tab w:val="num" w:pos="5040"/>
+        </w:tabs>
+        <w:ind w:left="5040" w:hanging="360"/>
+      </w:pPr>
+      <w:rPr>
+        <w:rFonts w:ascii="Wingdings" w:hAnsi="Wingdings" w:hint="default"/>
+        <w:sz w:val="20"/>
+      </w:rPr>
+    </w:lvl>
+    <w:lvl w:ilvl="7" w:tentative="1">
+      <w:start w:val="1"/>
+      <w:numFmt w:val="bullet"/>
+      <w:lvlText w:val=""/>
+      <w:lvlJc w:val="left"/>
+      <w:pPr>
+        <w:tabs>
+          <w:tab w:val="num" w:pos="5760"/>
+        </w:tabs>
+        <w:ind w:left="5760" w:hanging="360"/>
+      </w:pPr>
+      <w:rPr>
+        <w:rFonts w:ascii="Wingdings" w:hAnsi="Wingdings" w:hint="default"/>
+        <w:sz w:val="20"/>
+      </w:rPr>
+    </w:lvl>
+    <w:lvl w:ilvl="8" w:tentative="1">
+      <w:start w:val="1"/>
+      <w:numFmt w:val="bullet"/>
+      <w:lvlText w:val=""/>
+      <w:lvlJc w:val="left"/>
+      <w:pPr>
+        <w:tabs>
+          <w:tab w:val="num" w:pos="6480"/>
+        </w:tabs>
+        <w:ind w:left="6480" w:hanging="360"/>
+      </w:pPr>
+      <w:rPr>
+        <w:rFonts w:ascii="Wingdings" w:hAnsi="Wingdings" w:hint="default"/>
+        <w:sz w:val="20"/>
+      </w:rPr>
+    </w:lvl>
+  </w:abstractNum>
+  <w:abstractNum w:abstractNumId="5" w15:restartNumberingAfterBreak="0">
     <w:nsid w:val="337D1338"/>
     <w:multiLevelType w:val="multilevel"/>
     <w:tmpl w:val="A99C528C"/>
@@ -4199,7 +6007,7 @@
       </w:pPr>
     </w:lvl>
   </w:abstractNum>
-  <w:abstractNum w:abstractNumId="5" w15:restartNumberingAfterBreak="0">
+  <w:abstractNum w:abstractNumId="6" w15:restartNumberingAfterBreak="0">
     <w:nsid w:val="3B0D12F0"/>
     <w:multiLevelType w:val="hybridMultilevel"/>
     <w:tmpl w:val="03E83238"/>
@@ -4288,7 +6096,7 @@
       </w:pPr>
     </w:lvl>
   </w:abstractNum>
-  <w:abstractNum w:abstractNumId="6" w15:restartNumberingAfterBreak="0">
+  <w:abstractNum w:abstractNumId="7" w15:restartNumberingAfterBreak="0">
     <w:nsid w:val="50191653"/>
     <w:multiLevelType w:val="hybridMultilevel"/>
     <w:tmpl w:val="99B0A558"/>
@@ -4383,7 +6191,7 @@
       </w:pPr>
     </w:lvl>
   </w:abstractNum>
-  <w:abstractNum w:abstractNumId="7" w15:restartNumberingAfterBreak="0">
+  <w:abstractNum w:abstractNumId="8" w15:restartNumberingAfterBreak="0">
     <w:nsid w:val="68A26582"/>
     <w:multiLevelType w:val="hybridMultilevel"/>
     <w:tmpl w:val="BBCAB19E"/>
@@ -4503,22 +6311,25 @@
     <w:abstractNumId w:val="2"/>
   </w:num>
   <w:num w:numId="3" w16cid:durableId="558785050">
-    <w:abstractNumId w:val="7"/>
+    <w:abstractNumId w:val="8"/>
   </w:num>
   <w:num w:numId="4" w16cid:durableId="1888836547">
-    <w:abstractNumId w:val="4"/>
+    <w:abstractNumId w:val="5"/>
   </w:num>
   <w:num w:numId="5" w16cid:durableId="1523133640">
     <w:abstractNumId w:val="0"/>
   </w:num>
   <w:num w:numId="6" w16cid:durableId="673150175">
-    <w:abstractNumId w:val="6"/>
+    <w:abstractNumId w:val="7"/>
   </w:num>
   <w:num w:numId="7" w16cid:durableId="395400798">
     <w:abstractNumId w:val="3"/>
   </w:num>
   <w:num w:numId="8" w16cid:durableId="2016761621">
-    <w:abstractNumId w:val="5"/>
+    <w:abstractNumId w:val="6"/>
+  </w:num>
+  <w:num w:numId="9" w16cid:durableId="991370702">
+    <w:abstractNumId w:val="4"/>
   </w:num>
 </w:numbering>
 </file>
@@ -5125,7 +6936,6 @@
   <w:style w:type="character" w:default="1" w:styleId="DefaultParagraphFont">
     <w:name w:val="Default Paragraph Font"/>
     <w:uiPriority w:val="1"/>
-    <w:semiHidden/>
     <w:unhideWhenUsed/>
   </w:style>
   <w:style w:type="table" w:default="1" w:styleId="TableNormal">

</xml_diff>

<commit_message>
added mode measurements for the newpcb for different sensors added some measurements as pdf edited lab equipments docs
</commit_message>
<xml_diff>
--- a/Measurements/Lab equipments.docx
+++ b/Measurements/Lab equipments.docx
@@ -202,21 +202,7 @@
         <w:rPr>
           <w:rFonts w:ascii="Source Sans Pro" w:hAnsi="Source Sans Pro"/>
         </w:rPr>
-        <w:t xml:space="preserve"> voltages on the PCB by hand </w:t>
-      </w:r>
-      <w:proofErr w:type="gramStart"/>
-      <w:r>
-        <w:rPr>
-          <w:rFonts w:ascii="Source Sans Pro" w:hAnsi="Source Sans Pro"/>
-        </w:rPr>
-        <w:t>( yellow</w:t>
-      </w:r>
-      <w:proofErr w:type="gramEnd"/>
-      <w:r>
-        <w:rPr>
-          <w:rFonts w:ascii="Source Sans Pro" w:hAnsi="Source Sans Pro"/>
-        </w:rPr>
-        <w:t xml:space="preserve"> points)</w:t>
+        <w:t xml:space="preserve"> voltages on the PCB by hand ( yellow points)</w:t>
       </w:r>
     </w:p>
     <w:p>
@@ -310,16 +296,7 @@
           <w:b/>
           <w:bCs/>
         </w:rPr>
-        <w:t xml:space="preserve">Spitzenberger APS 1000 – CC </w:t>
-      </w:r>
-      <w:proofErr w:type="gramStart"/>
-      <w:r>
-        <w:rPr>
-          <w:rFonts w:ascii="Source Sans Pro" w:hAnsi="Source Sans Pro"/>
-          <w:b/>
-          <w:bCs/>
-        </w:rPr>
-        <w:t>mode</w:t>
+        <w:t>Spitzenberger APS 1000 – CC mode</w:t>
       </w:r>
       <w:r>
         <w:rPr>
@@ -331,14 +308,7 @@
         <w:rPr>
           <w:rFonts w:ascii="Source Sans Pro" w:hAnsi="Source Sans Pro"/>
         </w:rPr>
-        <w:t>:</w:t>
-      </w:r>
-      <w:proofErr w:type="gramEnd"/>
-      <w:r>
-        <w:rPr>
-          <w:rFonts w:ascii="Source Sans Pro" w:hAnsi="Source Sans Pro"/>
-        </w:rPr>
-        <w:t xml:space="preserve"> to a</w:t>
+        <w:t>: to a</w:t>
       </w:r>
       <w:r>
         <w:rPr>
@@ -362,21 +332,7 @@
         <w:rPr>
           <w:rFonts w:ascii="Source Sans Pro" w:hAnsi="Source Sans Pro"/>
         </w:rPr>
-        <w:t xml:space="preserve">. </w:t>
-      </w:r>
-      <w:proofErr w:type="gramStart"/>
-      <w:r>
-        <w:rPr>
-          <w:rFonts w:ascii="Source Sans Pro" w:hAnsi="Source Sans Pro"/>
-        </w:rPr>
-        <w:t>Therefore</w:t>
-      </w:r>
-      <w:proofErr w:type="gramEnd"/>
-      <w:r>
-        <w:rPr>
-          <w:rFonts w:ascii="Source Sans Pro" w:hAnsi="Source Sans Pro"/>
-        </w:rPr>
-        <w:t xml:space="preserve"> we achieve AC ripple current with varying frequencies and amplitudes in addition to DC current.</w:t>
+        <w:t>. Therefore we achieve AC ripple current with varying frequencies and amplitudes in addition to DC current.</w:t>
       </w:r>
     </w:p>
     <w:p>
@@ -396,43 +352,13 @@
           <w:b/>
           <w:bCs/>
         </w:rPr>
-        <w:t xml:space="preserve">Wideband Injection Transformer B-WIT </w:t>
-      </w:r>
-      <w:proofErr w:type="gramStart"/>
-      <w:r>
-        <w:rPr>
-          <w:rFonts w:ascii="Source Sans Pro" w:hAnsi="Source Sans Pro"/>
-          <w:b/>
-          <w:bCs/>
-        </w:rPr>
-        <w:t>100</w:t>
-      </w:r>
-      <w:r>
-        <w:rPr>
-          <w:rFonts w:ascii="Source Sans Pro" w:hAnsi="Source Sans Pro"/>
-        </w:rPr>
-        <w:t xml:space="preserve"> :</w:t>
-      </w:r>
-      <w:proofErr w:type="gramEnd"/>
-      <w:r>
-        <w:rPr>
-          <w:rFonts w:ascii="Source Sans Pro" w:hAnsi="Source Sans Pro"/>
-        </w:rPr>
-        <w:t xml:space="preserve"> injects differential-mode noise to test the </w:t>
-      </w:r>
-      <w:proofErr w:type="gramStart"/>
-      <w:r>
-        <w:rPr>
-          <w:rFonts w:ascii="Source Sans Pro" w:hAnsi="Source Sans Pro"/>
-        </w:rPr>
-        <w:t>diff</w:t>
-      </w:r>
-      <w:proofErr w:type="gramEnd"/>
-      <w:r>
-        <w:rPr>
-          <w:rFonts w:ascii="Source Sans Pro" w:hAnsi="Source Sans Pro"/>
-        </w:rPr>
-        <w:t xml:space="preserve">. </w:t>
+        <w:t>Wideband Injection Transformer B-WIT 100</w:t>
+      </w:r>
+      <w:r>
+        <w:rPr>
+          <w:rFonts w:ascii="Source Sans Pro" w:hAnsi="Source Sans Pro"/>
+        </w:rPr>
+        <w:t xml:space="preserve"> : injects differential-mode noise to test the diff. </w:t>
       </w:r>
       <w:proofErr w:type="spellStart"/>
       <w:r>
@@ -861,21 +787,7 @@
         <w:rPr>
           <w:rFonts w:ascii="Source Sans Pro" w:hAnsi="Source Sans Pro"/>
         </w:rPr>
-        <w:t xml:space="preserve">Vector Network Analyzer – Bode </w:t>
-      </w:r>
-      <w:proofErr w:type="gramStart"/>
-      <w:r>
-        <w:rPr>
-          <w:rFonts w:ascii="Source Sans Pro" w:hAnsi="Source Sans Pro"/>
-        </w:rPr>
-        <w:t>100 :</w:t>
-      </w:r>
-      <w:proofErr w:type="gramEnd"/>
-      <w:r>
-        <w:rPr>
-          <w:rFonts w:ascii="Source Sans Pro" w:hAnsi="Source Sans Pro"/>
-        </w:rPr>
-        <w:t xml:space="preserve"> </w:t>
+        <w:t xml:space="preserve">Vector Network Analyzer – Bode 100 : </w:t>
       </w:r>
       <w:r>
         <w:rPr>
@@ -1089,21 +1001,7 @@
         <w:rPr>
           <w:rFonts w:ascii="Source Sans Pro" w:hAnsi="Source Sans Pro"/>
         </w:rPr>
-        <w:t xml:space="preserve">Tektronix TBS 2000 Digital </w:t>
-      </w:r>
-      <w:proofErr w:type="gramStart"/>
-      <w:r>
-        <w:rPr>
-          <w:rFonts w:ascii="Source Sans Pro" w:hAnsi="Source Sans Pro"/>
-        </w:rPr>
-        <w:t>Oscilloscope :</w:t>
-      </w:r>
-      <w:proofErr w:type="gramEnd"/>
-      <w:r>
-        <w:rPr>
-          <w:rFonts w:ascii="Source Sans Pro" w:hAnsi="Source Sans Pro"/>
-        </w:rPr>
-        <w:t xml:space="preserve"> </w:t>
+        <w:t xml:space="preserve">Tektronix TBS 2000 Digital Oscilloscope : </w:t>
       </w:r>
     </w:p>
     <w:p>
@@ -1321,35 +1219,7 @@
         <w:rPr>
           <w:rFonts w:ascii="Source Sans Pro" w:hAnsi="Source Sans Pro"/>
         </w:rPr>
-        <w:t xml:space="preserve"> R2 and R5 resistors. Upon comparison, </w:t>
-      </w:r>
-      <w:proofErr w:type="gramStart"/>
-      <w:r>
-        <w:rPr>
-          <w:rFonts w:ascii="Source Sans Pro" w:hAnsi="Source Sans Pro"/>
-        </w:rPr>
-        <w:t>decided</w:t>
-      </w:r>
-      <w:proofErr w:type="gramEnd"/>
-      <w:r>
-        <w:rPr>
-          <w:rFonts w:ascii="Source Sans Pro" w:hAnsi="Source Sans Pro"/>
-        </w:rPr>
-        <w:t xml:space="preserve"> to remove them (replaced with 0 ohm resistors</w:t>
-      </w:r>
-      <w:proofErr w:type="gramStart"/>
-      <w:r>
-        <w:rPr>
-          <w:rFonts w:ascii="Source Sans Pro" w:hAnsi="Source Sans Pro"/>
-        </w:rPr>
-        <w:t>) .</w:t>
-      </w:r>
-      <w:proofErr w:type="gramEnd"/>
-      <w:r>
-        <w:rPr>
-          <w:rFonts w:ascii="Source Sans Pro" w:hAnsi="Source Sans Pro"/>
-        </w:rPr>
-        <w:t xml:space="preserve"> </w:t>
+        <w:t xml:space="preserve"> R2 and R5 resistors. Upon comparison, decided to remove them (replaced with 0 ohm resistors) . </w:t>
       </w:r>
       <w:r>
         <w:rPr>
@@ -1406,21 +1276,7 @@
         <w:rPr>
           <w:rFonts w:ascii="Source Sans Pro" w:hAnsi="Source Sans Pro"/>
         </w:rPr>
-        <w:t xml:space="preserve">- voltage rails to be -0.2V (LMM05) and +5.2V using switched regulator and </w:t>
-      </w:r>
-      <w:proofErr w:type="gramStart"/>
-      <w:r>
-        <w:rPr>
-          <w:rFonts w:ascii="Source Sans Pro" w:hAnsi="Source Sans Pro"/>
-        </w:rPr>
-        <w:t>a</w:t>
-      </w:r>
-      <w:proofErr w:type="gramEnd"/>
-      <w:r>
-        <w:rPr>
-          <w:rFonts w:ascii="Source Sans Pro" w:hAnsi="Source Sans Pro"/>
-        </w:rPr>
-        <w:t xml:space="preserve"> LDO </w:t>
+        <w:t xml:space="preserve">- voltage rails to be -0.2V (LMM05) and +5.2V using switched regulator and a LDO </w:t>
       </w:r>
     </w:p>
     <w:p>
@@ -1862,14 +1718,7 @@
         <w:rPr>
           <w:rFonts w:ascii="Source Sans Pro" w:hAnsi="Source Sans Pro"/>
         </w:rPr>
-        <w:t xml:space="preserve"> CP1003B Current Probe (Set to 5A Mode</w:t>
-      </w:r>
-      <w:proofErr w:type="gramStart"/>
-      <w:r>
-        <w:rPr>
-          <w:rFonts w:ascii="Source Sans Pro" w:hAnsi="Source Sans Pro"/>
-        </w:rPr>
-        <w:t xml:space="preserve">): </w:t>
+        <w:t xml:space="preserve"> CP1003B Current Probe (Set to 5A Mode): </w:t>
       </w:r>
       <w:r>
         <w:rPr>
@@ -1877,7 +1726,6 @@
         </w:rPr>
         <w:t>‐</w:t>
       </w:r>
-      <w:proofErr w:type="gramEnd"/>
       <w:r>
         <w:rPr>
           <w:rFonts w:ascii="Source Sans Pro" w:hAnsi="Source Sans Pro"/>
@@ -2128,14 +1976,7 @@
         <w:rPr>
           <w:rFonts w:ascii="Source Sans Pro" w:hAnsi="Source Sans Pro"/>
         </w:rPr>
-        <w:t xml:space="preserve">1. Current Measurement with </w:t>
-      </w:r>
-      <w:proofErr w:type="gramStart"/>
-      <w:r>
-        <w:rPr>
-          <w:rFonts w:ascii="Source Sans Pro" w:hAnsi="Source Sans Pro"/>
-        </w:rPr>
-        <w:t xml:space="preserve">CH1: </w:t>
+        <w:t xml:space="preserve">1. Current Measurement with CH1: </w:t>
       </w:r>
       <w:r>
         <w:rPr>
@@ -2143,7 +1984,6 @@
         </w:rPr>
         <w:t>‐</w:t>
       </w:r>
-      <w:proofErr w:type="gramEnd"/>
       <w:r>
         <w:rPr>
           <w:rFonts w:ascii="Source Sans Pro" w:hAnsi="Source Sans Pro"/>
@@ -2174,19 +2014,11 @@
         </w:rPr>
         <w:t xml:space="preserve"> Since the current probe outputs 1V for every 1A, a 1:1 ratio is appropriate. </w:t>
       </w:r>
-      <w:proofErr w:type="gramStart"/>
-      <w:r>
-        <w:rPr>
-          <w:rFonts w:ascii="Source Sans Pro" w:hAnsi="Source Sans Pro"/>
-        </w:rPr>
-        <w:t>So</w:t>
-      </w:r>
-      <w:proofErr w:type="gramEnd"/>
-      <w:r>
-        <w:rPr>
-          <w:rFonts w:ascii="Source Sans Pro" w:hAnsi="Source Sans Pro"/>
-        </w:rPr>
-        <w:t xml:space="preserve"> </w:t>
+      <w:r>
+        <w:rPr>
+          <w:rFonts w:ascii="Source Sans Pro" w:hAnsi="Source Sans Pro"/>
+        </w:rPr>
+        <w:t xml:space="preserve">So </w:t>
       </w:r>
       <w:r>
         <w:rPr>
@@ -2205,14 +2037,7 @@
         <w:rPr>
           <w:rFonts w:ascii="Source Sans Pro" w:hAnsi="Source Sans Pro"/>
         </w:rPr>
-        <w:t xml:space="preserve">2. Voltage Measurement with </w:t>
-      </w:r>
-      <w:proofErr w:type="gramStart"/>
-      <w:r>
-        <w:rPr>
-          <w:rFonts w:ascii="Source Sans Pro" w:hAnsi="Source Sans Pro"/>
-        </w:rPr>
-        <w:t xml:space="preserve">CH2: </w:t>
+        <w:t xml:space="preserve">2. Voltage Measurement with CH2: </w:t>
       </w:r>
       <w:r>
         <w:rPr>
@@ -2220,7 +2045,6 @@
         </w:rPr>
         <w:t>‐</w:t>
       </w:r>
-      <w:proofErr w:type="gramEnd"/>
       <w:r>
         <w:rPr>
           <w:rFonts w:ascii="Source Sans Pro" w:hAnsi="Source Sans Pro"/>
@@ -3195,19 +3019,11 @@
           <w:rFonts w:ascii="Source Sans Pro" w:hAnsi="Source Sans Pro"/>
         </w:rPr>
       </w:pPr>
-      <w:proofErr w:type="gramStart"/>
-      <w:r>
-        <w:rPr>
-          <w:rFonts w:ascii="Source Sans Pro" w:hAnsi="Source Sans Pro"/>
-        </w:rPr>
-        <w:t>Therefore</w:t>
-      </w:r>
-      <w:proofErr w:type="gramEnd"/>
-      <w:r>
-        <w:rPr>
-          <w:rFonts w:ascii="Source Sans Pro" w:hAnsi="Source Sans Pro"/>
-        </w:rPr>
-        <w:t xml:space="preserve"> we can obtain the impedance of the current sensor alone</w:t>
+      <w:r>
+        <w:rPr>
+          <w:rFonts w:ascii="Source Sans Pro" w:hAnsi="Source Sans Pro"/>
+        </w:rPr>
+        <w:t>Therefore we can obtain the impedance of the current sensor alone</w:t>
       </w:r>
     </w:p>
     <w:p>
@@ -3343,21 +3159,7 @@
         <w:rPr>
           <w:rFonts w:ascii="Source Sans Pro" w:hAnsi="Source Sans Pro"/>
         </w:rPr>
-        <w:t xml:space="preserve">) is contacted. Since maximum of 30 Amperes is targeted, we might go with </w:t>
-      </w:r>
-      <w:proofErr w:type="gramStart"/>
-      <w:r>
-        <w:rPr>
-          <w:rFonts w:ascii="Source Sans Pro" w:hAnsi="Source Sans Pro"/>
-        </w:rPr>
-        <w:t>lower</w:t>
-      </w:r>
-      <w:proofErr w:type="gramEnd"/>
-      <w:r>
-        <w:rPr>
-          <w:rFonts w:ascii="Source Sans Pro" w:hAnsi="Source Sans Pro"/>
-        </w:rPr>
-        <w:t xml:space="preserve"> rated current sensor, LEM.</w:t>
+        <w:t>) is contacted. Since maximum of 30 Amperes is targeted, we might go with lower rated current sensor, LEM.</w:t>
       </w:r>
     </w:p>
     <w:p>
@@ -3404,21 +3206,7 @@
         <w:rPr>
           <w:rFonts w:ascii="Source Sans Pro" w:hAnsi="Source Sans Pro"/>
         </w:rPr>
-        <w:t xml:space="preserve">LDO 24V-&gt;5V is removed. The voltage is step down from 24V to 6.5V, then to 5.2V. As a result, VCC of 5.2V is used for current </w:t>
-      </w:r>
-      <w:proofErr w:type="gramStart"/>
-      <w:r>
-        <w:rPr>
-          <w:rFonts w:ascii="Source Sans Pro" w:hAnsi="Source Sans Pro"/>
-        </w:rPr>
-        <w:t>sensor</w:t>
-      </w:r>
-      <w:proofErr w:type="gramEnd"/>
-      <w:r>
-        <w:rPr>
-          <w:rFonts w:ascii="Source Sans Pro" w:hAnsi="Source Sans Pro"/>
-        </w:rPr>
-        <w:t xml:space="preserve"> and diff. </w:t>
+        <w:t xml:space="preserve">LDO 24V-&gt;5V is removed. The voltage is step down from 24V to 6.5V, then to 5.2V. As a result, VCC of 5.2V is used for current sensor and diff. </w:t>
       </w:r>
       <w:proofErr w:type="spellStart"/>
       <w:r>
@@ -3434,19 +3222,11 @@
         </w:rPr>
         <w:t xml:space="preserve"> supply voltage. </w:t>
       </w:r>
-      <w:proofErr w:type="gramStart"/>
-      <w:r>
-        <w:rPr>
-          <w:rFonts w:ascii="Source Sans Pro" w:hAnsi="Source Sans Pro"/>
-        </w:rPr>
-        <w:t>Reason</w:t>
-      </w:r>
-      <w:proofErr w:type="gramEnd"/>
-      <w:r>
-        <w:rPr>
-          <w:rFonts w:ascii="Source Sans Pro" w:hAnsi="Source Sans Pro"/>
-        </w:rPr>
-        <w:t xml:space="preserve"> is that we have fully rail-to-rail signal</w:t>
+      <w:r>
+        <w:rPr>
+          <w:rFonts w:ascii="Source Sans Pro" w:hAnsi="Source Sans Pro"/>
+        </w:rPr>
+        <w:t>Reason is that we have fully rail-to-rail signal</w:t>
       </w:r>
       <w:r>
         <w:rPr>
@@ -3505,21 +3285,7 @@
         <w:rPr>
           <w:rFonts w:ascii="Source Sans Pro" w:hAnsi="Source Sans Pro"/>
         </w:rPr>
-        <w:t xml:space="preserve">With 2 oz copper weight, minimum track width is 0.16 mm, according to JLCPCB capabilities. -&gt; Differential route width </w:t>
-      </w:r>
-      <w:proofErr w:type="gramStart"/>
-      <w:r>
-        <w:rPr>
-          <w:rFonts w:ascii="Source Sans Pro" w:hAnsi="Source Sans Pro"/>
-        </w:rPr>
-        <w:t>are</w:t>
-      </w:r>
-      <w:proofErr w:type="gramEnd"/>
-      <w:r>
-        <w:rPr>
-          <w:rFonts w:ascii="Source Sans Pro" w:hAnsi="Source Sans Pro"/>
-        </w:rPr>
-        <w:t xml:space="preserve"> adjusted.</w:t>
+        <w:t>With 2 oz copper weight, minimum track width is 0.16 mm, according to JLCPCB capabilities. -&gt; Differential route width are adjusted.</w:t>
       </w:r>
     </w:p>
     <w:p>
@@ -3552,21 +3318,7 @@
         <w:rPr>
           <w:rFonts w:ascii="Source Sans Pro" w:hAnsi="Source Sans Pro"/>
         </w:rPr>
-        <w:t xml:space="preserve"> with more </w:t>
-      </w:r>
-      <w:proofErr w:type="gramStart"/>
-      <w:r>
-        <w:rPr>
-          <w:rFonts w:ascii="Source Sans Pro" w:hAnsi="Source Sans Pro"/>
-        </w:rPr>
-        <w:t>cross section</w:t>
-      </w:r>
-      <w:proofErr w:type="gramEnd"/>
-      <w:r>
-        <w:rPr>
-          <w:rFonts w:ascii="Source Sans Pro" w:hAnsi="Source Sans Pro"/>
-        </w:rPr>
-        <w:t xml:space="preserve"> area, better cooling, lower thermal resistance and better thermal performance</w:t>
+        <w:t xml:space="preserve"> with more cross section area, better cooling, lower thermal resistance and better thermal performance</w:t>
       </w:r>
     </w:p>
     <w:p>
@@ -3599,35 +3351,7 @@
         <w:rPr>
           <w:rFonts w:ascii="Source Sans Pro" w:hAnsi="Source Sans Pro"/>
         </w:rPr>
-        <w:t xml:space="preserve"> wider to 11mm. Channels are spread evenly for symmetry and maximum trace width is achieved to be around 12mm for each trace here. For worst case, Input current can be up to 75A. </w:t>
-      </w:r>
-      <w:proofErr w:type="gramStart"/>
-      <w:r>
-        <w:rPr>
-          <w:rFonts w:ascii="Source Sans Pro" w:hAnsi="Source Sans Pro"/>
-        </w:rPr>
-        <w:t>there</w:t>
-      </w:r>
-      <w:proofErr w:type="gramEnd"/>
-      <w:r>
-        <w:rPr>
-          <w:rFonts w:ascii="Source Sans Pro" w:hAnsi="Source Sans Pro"/>
-        </w:rPr>
-        <w:t xml:space="preserve"> are 4 layers stacked on top of each other, with each copper thickness being 2, this result in a thickness of 8 oz/ft^2 for each trace. This </w:t>
-      </w:r>
-      <w:proofErr w:type="gramStart"/>
-      <w:r>
-        <w:rPr>
-          <w:rFonts w:ascii="Source Sans Pro" w:hAnsi="Source Sans Pro"/>
-        </w:rPr>
-        <w:t>result</w:t>
-      </w:r>
-      <w:proofErr w:type="gramEnd"/>
-      <w:r>
-        <w:rPr>
-          <w:rFonts w:ascii="Source Sans Pro" w:hAnsi="Source Sans Pro"/>
-        </w:rPr>
-        <w:t xml:space="preserve"> in an expected temperature rise of 35 °C when 75A passes through, using IPC-2221 curve fitting</w:t>
+        <w:t xml:space="preserve"> wider to 11mm. Channels are spread evenly for symmetry and maximum trace width is achieved to be around 12mm for each trace here. For worst case, Input current can be up to 75A. there are 4 layers stacked on top of each other, with each copper thickness being 2, this result in a thickness of 8 oz/ft^2 for each trace. This result in an expected temperature rise of 35 °C when 75A passes through, using IPC-2221 curve fitting</w:t>
       </w:r>
     </w:p>
     <w:p>
@@ -3853,6 +3577,7 @@
       <w:r>
         <w:rPr>
           <w:rFonts w:ascii="Source Sans Pro" w:hAnsi="Source Sans Pro"/>
+          <w:noProof/>
         </w:rPr>
         <w:drawing>
           <wp:anchor distT="0" distB="0" distL="114300" distR="114300" simplePos="0" relativeHeight="251658240" behindDoc="1" locked="0" layoutInCell="1" allowOverlap="1" wp14:anchorId="47F7B7D6" wp14:editId="38E2FA30">
@@ -4272,6 +3997,7 @@
       <w:r>
         <w:rPr>
           <w:rFonts w:ascii="Source Sans Pro" w:hAnsi="Source Sans Pro"/>
+          <w:noProof/>
         </w:rPr>
         <w:drawing>
           <wp:inline distT="0" distB="0" distL="0" distR="0" wp14:anchorId="14732555" wp14:editId="2499982A">
@@ -4485,6 +4211,9 @@
             <m:t xml:space="preserve"> </m:t>
           </m:r>
           <m:r>
+            <m:rPr>
+              <m:sty m:val="p"/>
+            </m:rPr>
             <w:rPr>
               <w:rFonts w:ascii="Source Sans Pro" w:eastAsiaTheme="minorEastAsia" w:hAnsi="Source Sans Pro"/>
               <w:lang w:val="en-DE"/>
@@ -4713,25 +4442,7 @@
                   <w:szCs w:val="28"/>
                   <w:lang w:val="en-DE"/>
                 </w:rPr>
-                <m:t>(dBm/</m:t>
-              </m:r>
-              <m:r>
-                <w:rPr>
-                  <w:rFonts w:ascii="Cambria Math" w:hAnsi="Cambria Math"/>
-                  <w:sz w:val="28"/>
-                  <w:szCs w:val="28"/>
-                  <w:lang w:val="en-DE"/>
-                </w:rPr>
-                <m:t>2</m:t>
-              </m:r>
-              <m:r>
-                <w:rPr>
-                  <w:rFonts w:ascii="Cambria Math" w:hAnsi="Cambria Math"/>
-                  <w:sz w:val="28"/>
-                  <w:szCs w:val="28"/>
-                  <w:lang w:val="en-DE"/>
-                </w:rPr>
-                <m:t>0)</m:t>
+                <m:t>(dBm/20)</m:t>
               </m:r>
             </m:sup>
           </m:sSup>
@@ -4796,17 +4507,20 @@
           <w:szCs w:val="28"/>
           <w:lang w:val="en-DE"/>
         </w:rPr>
-        <w:t>13</w:t>
-      </w:r>
-      <w:r>
+        <w:t>13 dBm = 1 V</w:t>
+      </w:r>
+    </w:p>
+    <w:p>
+      <w:pPr>
+        <w:ind w:firstLine="720"/>
+        <w:jc w:val="both"/>
         <w:rPr>
           <w:rFonts w:ascii="Source Sans Pro" w:eastAsiaTheme="minorEastAsia" w:hAnsi="Source Sans Pro"/>
           <w:sz w:val="28"/>
           <w:szCs w:val="28"/>
           <w:lang w:val="en-DE"/>
         </w:rPr>
-        <w:t xml:space="preserve"> dBm = </w:t>
-      </w:r>
+      </w:pPr>
       <w:r>
         <w:rPr>
           <w:rFonts w:ascii="Source Sans Pro" w:eastAsiaTheme="minorEastAsia" w:hAnsi="Source Sans Pro"/>
@@ -4814,64 +4528,7 @@
           <w:szCs w:val="28"/>
           <w:lang w:val="en-DE"/>
         </w:rPr>
-        <w:t xml:space="preserve">1 </w:t>
-      </w:r>
-      <w:r>
-        <w:rPr>
-          <w:rFonts w:ascii="Source Sans Pro" w:eastAsiaTheme="minorEastAsia" w:hAnsi="Source Sans Pro"/>
-          <w:sz w:val="28"/>
-          <w:szCs w:val="28"/>
-          <w:lang w:val="en-DE"/>
-        </w:rPr>
-        <w:t>V</w:t>
-      </w:r>
-    </w:p>
-    <w:p>
-      <w:pPr>
-        <w:ind w:firstLine="720"/>
-        <w:jc w:val="both"/>
-        <w:rPr>
-          <w:rFonts w:ascii="Source Sans Pro" w:eastAsiaTheme="minorEastAsia" w:hAnsi="Source Sans Pro"/>
-          <w:sz w:val="28"/>
-          <w:szCs w:val="28"/>
-          <w:lang w:val="en-DE"/>
-        </w:rPr>
-      </w:pPr>
-      <w:r>
-        <w:rPr>
-          <w:rFonts w:ascii="Source Sans Pro" w:eastAsiaTheme="minorEastAsia" w:hAnsi="Source Sans Pro"/>
-          <w:sz w:val="28"/>
-          <w:szCs w:val="28"/>
-          <w:lang w:val="en-DE"/>
-        </w:rPr>
-        <w:t>15</w:t>
-      </w:r>
-      <w:r>
-        <w:rPr>
-          <w:rFonts w:ascii="Source Sans Pro" w:eastAsiaTheme="minorEastAsia" w:hAnsi="Source Sans Pro"/>
-          <w:sz w:val="28"/>
-          <w:szCs w:val="28"/>
-          <w:lang w:val="en-DE"/>
-        </w:rPr>
-        <w:t xml:space="preserve"> dBm = </w:t>
-      </w:r>
-      <w:r>
-        <w:rPr>
-          <w:rFonts w:ascii="Source Sans Pro" w:eastAsiaTheme="minorEastAsia" w:hAnsi="Source Sans Pro"/>
-          <w:sz w:val="28"/>
-          <w:szCs w:val="28"/>
-          <w:lang w:val="en-DE"/>
-        </w:rPr>
-        <w:t>1.26</w:t>
-      </w:r>
-      <w:r>
-        <w:rPr>
-          <w:rFonts w:ascii="Source Sans Pro" w:eastAsiaTheme="minorEastAsia" w:hAnsi="Source Sans Pro"/>
-          <w:sz w:val="28"/>
-          <w:szCs w:val="28"/>
-          <w:lang w:val="en-DE"/>
-        </w:rPr>
-        <w:t xml:space="preserve"> V</w:t>
+        <w:t>15 dBm = 1.26 V</w:t>
       </w:r>
     </w:p>
     <w:p>
@@ -4919,29 +4576,7 @@
           <w:szCs w:val="28"/>
           <w:lang w:val="en-DE"/>
         </w:rPr>
-        <w:t xml:space="preserve">Observed </w:t>
-      </w:r>
-      <w:r>
-        <w:rPr>
-          <w:rFonts w:ascii="Source Sans Pro" w:eastAsiaTheme="minorEastAsia" w:hAnsi="Source Sans Pro"/>
-          <w:b/>
-          <w:bCs/>
-          <w:sz w:val="28"/>
-          <w:szCs w:val="28"/>
-          <w:lang w:val="en-DE"/>
-        </w:rPr>
-        <w:t>Spitzenberger Output Current</w:t>
-      </w:r>
-      <w:r>
-        <w:rPr>
-          <w:rFonts w:ascii="Source Sans Pro" w:eastAsiaTheme="minorEastAsia" w:hAnsi="Source Sans Pro"/>
-          <w:b/>
-          <w:bCs/>
-          <w:sz w:val="28"/>
-          <w:szCs w:val="28"/>
-          <w:lang w:val="en-DE"/>
-        </w:rPr>
-        <w:t>:</w:t>
+        <w:t>Observed Spitzenberger Output Current:</w:t>
       </w:r>
     </w:p>
     <w:p>
@@ -5197,7 +4832,7 @@
       <w:pPr>
         <w:jc w:val="both"/>
         <w:rPr>
-          <w:rFonts w:ascii="Source Sans Pro" w:hAnsi="Source Sans Pro"/>
+          <w:rFonts w:ascii="Source Sans Pro" w:eastAsiaTheme="minorEastAsia" w:hAnsi="Source Sans Pro"/>
           <w:sz w:val="28"/>
           <w:szCs w:val="28"/>
           <w:lang w:val="en-DE"/>
@@ -5286,6 +4921,218 @@
           </m:sSub>
         </m:oMath>
       </m:oMathPara>
+    </w:p>
+    <w:p>
+      <w:pPr>
+        <w:jc w:val="both"/>
+        <w:rPr>
+          <w:rFonts w:ascii="Source Sans Pro" w:eastAsiaTheme="minorEastAsia" w:hAnsi="Source Sans Pro"/>
+          <w:sz w:val="28"/>
+          <w:szCs w:val="28"/>
+          <w:lang w:val="en-DE"/>
+        </w:rPr>
+      </w:pPr>
+    </w:p>
+    <w:p>
+      <w:pPr>
+        <w:jc w:val="both"/>
+        <w:rPr>
+          <w:rFonts w:ascii="Source Sans Pro" w:eastAsiaTheme="minorEastAsia" w:hAnsi="Source Sans Pro"/>
+          <w:b/>
+          <w:bCs/>
+          <w:sz w:val="28"/>
+          <w:szCs w:val="28"/>
+          <w:lang w:val="en-DE"/>
+        </w:rPr>
+      </w:pPr>
+      <w:r>
+        <w:rPr>
+          <w:rFonts w:ascii="Source Sans Pro" w:eastAsiaTheme="minorEastAsia" w:hAnsi="Source Sans Pro"/>
+          <w:b/>
+          <w:bCs/>
+          <w:sz w:val="28"/>
+          <w:szCs w:val="28"/>
+        </w:rPr>
+        <w:t>I-limit function in the Spitzenberger APS 1000</w:t>
+      </w:r>
+    </w:p>
+    <w:p>
+      <w:pPr>
+        <w:jc w:val="both"/>
+        <w:rPr>
+          <w:rFonts w:ascii="Source Sans Pro" w:eastAsiaTheme="minorEastAsia" w:hAnsi="Source Sans Pro"/>
+          <w:sz w:val="28"/>
+          <w:szCs w:val="28"/>
+          <w:lang w:val="en-DE"/>
+        </w:rPr>
+      </w:pPr>
+      <w:r>
+        <w:rPr>
+          <w:rFonts w:ascii="Source Sans Pro" w:eastAsiaTheme="minorEastAsia" w:hAnsi="Source Sans Pro"/>
+          <w:sz w:val="28"/>
+          <w:szCs w:val="28"/>
+        </w:rPr>
+        <w:t>The I-limit function in the Spitzenberger APS 1000 acts as a scaling factor that directly impacts the gain of the system by adjusting the maximum allowable output current. When set to a higher range (</w:t>
+      </w:r>
+      <w:r>
+        <w:rPr>
+          <w:rFonts w:ascii="Source Sans Pro" w:eastAsiaTheme="minorEastAsia" w:hAnsi="Source Sans Pro"/>
+          <w:sz w:val="28"/>
+          <w:szCs w:val="28"/>
+        </w:rPr>
+        <w:t>for example</w:t>
+      </w:r>
+      <w:r>
+        <w:rPr>
+          <w:rFonts w:ascii="Source Sans Pro" w:eastAsiaTheme="minorEastAsia" w:hAnsi="Source Sans Pro"/>
+          <w:sz w:val="28"/>
+          <w:szCs w:val="28"/>
+        </w:rPr>
+        <w:t xml:space="preserve"> 26.4</w:t>
+      </w:r>
+      <w:r>
+        <w:rPr>
+          <w:rFonts w:ascii="Source Sans Pro" w:eastAsiaTheme="minorEastAsia" w:hAnsi="Source Sans Pro"/>
+          <w:sz w:val="28"/>
+          <w:szCs w:val="28"/>
+        </w:rPr>
+        <w:t xml:space="preserve"> </w:t>
+      </w:r>
+      <w:proofErr w:type="spellStart"/>
+      <w:r>
+        <w:rPr>
+          <w:rFonts w:ascii="Source Sans Pro" w:eastAsiaTheme="minorEastAsia" w:hAnsi="Source Sans Pro"/>
+          <w:sz w:val="28"/>
+          <w:szCs w:val="28"/>
+        </w:rPr>
+        <w:t>A</w:t>
+      </w:r>
+      <w:r>
+        <w:rPr>
+          <w:rFonts w:ascii="Source Sans Pro" w:eastAsiaTheme="minorEastAsia" w:hAnsi="Source Sans Pro"/>
+          <w:sz w:val="28"/>
+          <w:szCs w:val="28"/>
+        </w:rPr>
+        <w:t>_</w:t>
+      </w:r>
+      <w:r>
+        <w:rPr>
+          <w:rFonts w:ascii="Source Sans Pro" w:eastAsiaTheme="minorEastAsia" w:hAnsi="Source Sans Pro"/>
+          <w:sz w:val="28"/>
+          <w:szCs w:val="28"/>
+        </w:rPr>
+        <w:t>peak</w:t>
+      </w:r>
+      <w:proofErr w:type="spellEnd"/>
+      <w:r>
+        <w:rPr>
+          <w:rFonts w:ascii="Source Sans Pro" w:eastAsiaTheme="minorEastAsia" w:hAnsi="Source Sans Pro"/>
+          <w:sz w:val="28"/>
+          <w:szCs w:val="28"/>
+        </w:rPr>
+        <w:t xml:space="preserve">), the amplifier provides a higher gain (~5.3 A/V), meaning a small input voltage results in a larger output current. </w:t>
+      </w:r>
+      <w:r>
+        <w:rPr>
+          <w:rFonts w:ascii="Source Sans Pro" w:eastAsiaTheme="minorEastAsia" w:hAnsi="Source Sans Pro"/>
+          <w:sz w:val="28"/>
+          <w:szCs w:val="28"/>
+        </w:rPr>
+        <w:t>When</w:t>
+      </w:r>
+      <w:r>
+        <w:rPr>
+          <w:rFonts w:ascii="Source Sans Pro" w:eastAsiaTheme="minorEastAsia" w:hAnsi="Source Sans Pro"/>
+          <w:sz w:val="28"/>
+          <w:szCs w:val="28"/>
+        </w:rPr>
+        <w:t xml:space="preserve"> the I-limit is reduced (</w:t>
+      </w:r>
+      <w:r>
+        <w:rPr>
+          <w:rFonts w:ascii="Source Sans Pro" w:eastAsiaTheme="minorEastAsia" w:hAnsi="Source Sans Pro"/>
+          <w:sz w:val="28"/>
+          <w:szCs w:val="28"/>
+        </w:rPr>
+        <w:t>for example</w:t>
+      </w:r>
+      <w:r>
+        <w:rPr>
+          <w:rFonts w:ascii="Source Sans Pro" w:eastAsiaTheme="minorEastAsia" w:hAnsi="Source Sans Pro"/>
+          <w:sz w:val="28"/>
+          <w:szCs w:val="28"/>
+        </w:rPr>
+        <w:t xml:space="preserve"> 3</w:t>
+      </w:r>
+      <w:r>
+        <w:rPr>
+          <w:rFonts w:ascii="Source Sans Pro" w:eastAsiaTheme="minorEastAsia" w:hAnsi="Source Sans Pro"/>
+          <w:sz w:val="28"/>
+          <w:szCs w:val="28"/>
+        </w:rPr>
+        <w:t xml:space="preserve"> </w:t>
+      </w:r>
+      <w:proofErr w:type="spellStart"/>
+      <w:r>
+        <w:rPr>
+          <w:rFonts w:ascii="Source Sans Pro" w:eastAsiaTheme="minorEastAsia" w:hAnsi="Source Sans Pro"/>
+          <w:sz w:val="28"/>
+          <w:szCs w:val="28"/>
+        </w:rPr>
+        <w:t>A</w:t>
+      </w:r>
+      <w:r>
+        <w:rPr>
+          <w:rFonts w:ascii="Source Sans Pro" w:eastAsiaTheme="minorEastAsia" w:hAnsi="Source Sans Pro"/>
+          <w:sz w:val="28"/>
+          <w:szCs w:val="28"/>
+        </w:rPr>
+        <w:t>_</w:t>
+      </w:r>
+      <w:r>
+        <w:rPr>
+          <w:rFonts w:ascii="Source Sans Pro" w:eastAsiaTheme="minorEastAsia" w:hAnsi="Source Sans Pro"/>
+          <w:sz w:val="28"/>
+          <w:szCs w:val="28"/>
+        </w:rPr>
+        <w:t>peak</w:t>
+      </w:r>
+      <w:proofErr w:type="spellEnd"/>
+      <w:r>
+        <w:rPr>
+          <w:rFonts w:ascii="Source Sans Pro" w:eastAsiaTheme="minorEastAsia" w:hAnsi="Source Sans Pro"/>
+          <w:sz w:val="28"/>
+          <w:szCs w:val="28"/>
+        </w:rPr>
+        <w:t xml:space="preserve">), the system constrains the maximum current output, leading to a lower gain (~0.60 A/V). This setting </w:t>
+      </w:r>
+      <w:r>
+        <w:rPr>
+          <w:rFonts w:ascii="Source Sans Pro" w:eastAsiaTheme="minorEastAsia" w:hAnsi="Source Sans Pro"/>
+          <w:sz w:val="28"/>
+          <w:szCs w:val="28"/>
+        </w:rPr>
+        <w:t>leads to</w:t>
+      </w:r>
+      <w:r>
+        <w:rPr>
+          <w:rFonts w:ascii="Source Sans Pro" w:eastAsiaTheme="minorEastAsia" w:hAnsi="Source Sans Pro"/>
+          <w:sz w:val="28"/>
+          <w:szCs w:val="28"/>
+        </w:rPr>
+        <w:t xml:space="preserve"> better resolution and linearity for low-current measurements while preventing excessive output when lower currents are required.</w:t>
+      </w:r>
+    </w:p>
+    <w:p>
+      <w:pPr>
+        <w:jc w:val="both"/>
+        <w:rPr>
+          <w:rFonts w:ascii="Source Sans Pro" w:hAnsi="Source Sans Pro"/>
+          <w:sz w:val="28"/>
+          <w:szCs w:val="28"/>
+          <w:lang w:val="en-DE"/>
+        </w:rPr>
+      </w:pPr>
     </w:p>
     <w:sectPr>
       <w:pgSz w:w="11906" w:h="16838" w:code="9"/>

</xml_diff>